<commit_message>
Inclusão do método Clonar e elaboração do documento
</commit_message>
<xml_diff>
--- a/doc/technical_report_.docx
+++ b/doc/technical_report_.docx
@@ -1,6 +1,6 @@
 
 <file path=word/document.xml><?xml version="1.0" encoding="utf-8"?>
-<w:document xmlns:wpc="http://schemas.microsoft.com/office/word/2010/wordprocessingCanvas" xmlns:cx="http://schemas.microsoft.com/office/drawing/2014/chartex" xmlns:mc="http://schemas.openxmlformats.org/markup-compatibility/2006" xmlns:o="urn:schemas-microsoft-com:office:office" xmlns:r="http://schemas.openxmlformats.org/officeDocument/2006/relationships" xmlns:m="http://schemas.openxmlformats.org/officeDocument/2006/math" xmlns:v="urn:schemas-microsoft-com:vml" xmlns:wp14="http://schemas.microsoft.com/office/word/2010/wordprocessingDrawing" xmlns:wp="http://schemas.openxmlformats.org/drawingml/2006/wordprocessingDrawing" xmlns:w10="urn:schemas-microsoft-com:office:word" xmlns:w="http://schemas.openxmlformats.org/wordprocessingml/2006/main" xmlns:w14="http://schemas.microsoft.com/office/word/2010/wordml" xmlns:w15="http://schemas.microsoft.com/office/word/2012/wordml" xmlns:w16se="http://schemas.microsoft.com/office/word/2015/wordml/symex" xmlns:wpg="http://schemas.microsoft.com/office/word/2010/wordprocessingGroup" xmlns:wpi="http://schemas.microsoft.com/office/word/2010/wordprocessingInk" xmlns:wne="http://schemas.microsoft.com/office/word/2006/wordml" xmlns:wps="http://schemas.microsoft.com/office/word/2010/wordprocessingShape" mc:Ignorable="w14 w15 w16se wp14">
+<w:document xmlns:wpc="http://schemas.microsoft.com/office/word/2010/wordprocessingCanvas" xmlns:cx="http://schemas.microsoft.com/office/drawing/2014/chartex" xmlns:cx1="http://schemas.microsoft.com/office/drawing/2015/9/8/chartex" xmlns:cx2="http://schemas.microsoft.com/office/drawing/2015/10/21/chartex" xmlns:cx3="http://schemas.microsoft.com/office/drawing/2016/5/9/chartex" xmlns:cx4="http://schemas.microsoft.com/office/drawing/2016/5/10/chartex" xmlns:cx5="http://schemas.microsoft.com/office/drawing/2016/5/11/chartex" xmlns:cx6="http://schemas.microsoft.com/office/drawing/2016/5/12/chartex" xmlns:cx7="http://schemas.microsoft.com/office/drawing/2016/5/13/chartex" xmlns:cx8="http://schemas.microsoft.com/office/drawing/2016/5/14/chartex" xmlns:mc="http://schemas.openxmlformats.org/markup-compatibility/2006" xmlns:aink="http://schemas.microsoft.com/office/drawing/2016/ink" xmlns:am3d="http://schemas.microsoft.com/office/drawing/2017/model3d" xmlns:o="urn:schemas-microsoft-com:office:office" xmlns:r="http://schemas.openxmlformats.org/officeDocument/2006/relationships" xmlns:m="http://schemas.openxmlformats.org/officeDocument/2006/math" xmlns:v="urn:schemas-microsoft-com:vml" xmlns:wp14="http://schemas.microsoft.com/office/word/2010/wordprocessingDrawing" xmlns:wp="http://schemas.openxmlformats.org/drawingml/2006/wordprocessingDrawing" xmlns:w10="urn:schemas-microsoft-com:office:word" xmlns:w="http://schemas.openxmlformats.org/wordprocessingml/2006/main" xmlns:w14="http://schemas.microsoft.com/office/word/2010/wordml" xmlns:w15="http://schemas.microsoft.com/office/word/2012/wordml" xmlns:w16cex="http://schemas.microsoft.com/office/word/2018/wordml/cex" xmlns:w16cid="http://schemas.microsoft.com/office/word/2016/wordml/cid" xmlns:w16="http://schemas.microsoft.com/office/word/2018/wordml" xmlns:w16se="http://schemas.microsoft.com/office/word/2015/wordml/symex" xmlns:wpg="http://schemas.microsoft.com/office/word/2010/wordprocessingGroup" xmlns:wpi="http://schemas.microsoft.com/office/word/2010/wordprocessingInk" xmlns:wne="http://schemas.microsoft.com/office/word/2006/wordml" xmlns:wps="http://schemas.microsoft.com/office/word/2010/wordprocessingShape" mc:Ignorable="w14 w15 w16se w16cid w16 w16cex wp14">
   <w:body>
     <w:p>
       <w:pPr>
@@ -279,21 +279,7 @@
         <w:rPr>
           <w:szCs w:val="24"/>
         </w:rPr>
-        <w:t xml:space="preserve">Fabrício </w:t>
-      </w:r>
-      <w:proofErr w:type="spellStart"/>
-      <w:r>
-        <w:rPr>
-          <w:szCs w:val="24"/>
-        </w:rPr>
-        <w:t>Galende</w:t>
-      </w:r>
-      <w:proofErr w:type="spellEnd"/>
-      <w:r>
-        <w:rPr>
-          <w:szCs w:val="24"/>
-        </w:rPr>
-        <w:t xml:space="preserve"> Marques de Carvalho</w:t>
+        <w:t>Fabrício Galende Marques de Carvalho</w:t>
       </w:r>
     </w:p>
     <w:p>
@@ -1477,7 +1463,7 @@
             <w:noProof/>
             <w:webHidden/>
           </w:rPr>
-          <w:t>10</w:t>
+          <w:t>18</w:t>
         </w:r>
         <w:r>
           <w:rPr>
@@ -1654,15 +1640,7 @@
         <w:t xml:space="preserve">, é inquestionável. Portanto, </w:t>
       </w:r>
       <w:r>
-        <w:t>o desenvolvimento de soluções cujo intuito é testar e garantir a qualidade de tais sistemas é oportuno e altamente relevante. Apesar disso, testar sistemas web não é tarefa fácil e requer, frequentemente, a automação de tarefas executadas ora por usuários humanos (</w:t>
-      </w:r>
-      <w:proofErr w:type="spellStart"/>
-      <w:r>
-        <w:t>e.g</w:t>
-      </w:r>
-      <w:proofErr w:type="spellEnd"/>
-      <w:r>
-        <w:t>: interação com formulários e navegação entre páginas) e ora por outros sistemas computacionais (e.g.: testes de APIs de serviços web).</w:t>
+        <w:t>o desenvolvimento de soluções cujo intuito é testar e garantir a qualidade de tais sistemas é oportuno e altamente relevante. Apesar disso, testar sistemas web não é tarefa fácil e requer, frequentemente, a automação de tarefas executadas ora por usuários humanos (e.g: interação com formulários e navegação entre páginas) e ora por outros sistemas computacionais (e.g.: testes de APIs de serviços web).</w:t>
       </w:r>
     </w:p>
     <w:p>
@@ -1729,23 +1707,13 @@
         <w:t xml:space="preserve">O objetivo deste projeto </w:t>
       </w:r>
       <w:r>
-        <w:t xml:space="preserve">é desenvolver um sistema web que interaja com um conjunto de ferramentas de teste, tais como o </w:t>
-      </w:r>
-      <w:proofErr w:type="spellStart"/>
-      <w:r>
-        <w:t>Selenium</w:t>
-      </w:r>
-      <w:proofErr w:type="spellEnd"/>
-      <w:r>
-        <w:t xml:space="preserve"> Web Driver e o </w:t>
-      </w:r>
-      <w:proofErr w:type="spellStart"/>
-      <w:r>
-        <w:t>JUnit</w:t>
-      </w:r>
-      <w:proofErr w:type="spellEnd"/>
-      <w:r>
-        <w:t xml:space="preserve"> 5, de modo a automatizar a execução de testes em sistemas web, sejam esses sistemas compostos por APIs ou interfaces com o usuário tais como páginas contendo formulários. </w:t>
+        <w:t>é desenvolver um sistema web que interaja com um conjunto de ferramentas de teste, tais como o Selenium Web Driver e o JUnit 5, de modo a automatizar a execução de testes em sistemas web</w:t>
+      </w:r>
+      <w:r>
+        <w:t xml:space="preserve">, </w:t>
+      </w:r>
+      <w:r>
+        <w:t xml:space="preserve">sejam esses sistemas compostos por APIs ou interfaces com o usuário tais como páginas contendo formulários. </w:t>
       </w:r>
     </w:p>
     <w:p>
@@ -1881,15 +1849,7 @@
         </w:numPr>
       </w:pPr>
       <w:r>
-        <w:t xml:space="preserve">Gradle </w:t>
-      </w:r>
-      <w:proofErr w:type="spellStart"/>
-      <w:r>
-        <w:t>Version</w:t>
-      </w:r>
-      <w:proofErr w:type="spellEnd"/>
-      <w:r>
-        <w:t xml:space="preserve"> 6.6.1</w:t>
+        <w:t>Gradle Version 6.6.1</w:t>
       </w:r>
       <w:r>
         <w:t>;</w:t>
@@ -1903,19 +1863,9 @@
           <w:numId w:val="19"/>
         </w:numPr>
       </w:pPr>
-      <w:proofErr w:type="spellStart"/>
-      <w:r>
-        <w:t>Selenium</w:t>
-      </w:r>
-      <w:proofErr w:type="spellEnd"/>
-      <w:r>
-        <w:t xml:space="preserve"> </w:t>
-      </w:r>
-      <w:proofErr w:type="spellStart"/>
-      <w:r>
-        <w:t>Webdriver</w:t>
-      </w:r>
-      <w:proofErr w:type="spellEnd"/>
+      <w:r>
+        <w:t>Selenium Webdriver</w:t>
+      </w:r>
       <w:r>
         <w:t>;</w:t>
       </w:r>
@@ -1928,13 +1878,8 @@
           <w:numId w:val="19"/>
         </w:numPr>
       </w:pPr>
-      <w:proofErr w:type="spellStart"/>
-      <w:r>
-        <w:t>JUnit</w:t>
-      </w:r>
-      <w:proofErr w:type="spellEnd"/>
-      <w:r>
-        <w:t xml:space="preserve"> 5;</w:t>
+      <w:r>
+        <w:t>JUnit 5;</w:t>
       </w:r>
     </w:p>
     <w:p>
@@ -1969,21 +1914,8 @@
           <w:numId w:val="19"/>
         </w:numPr>
       </w:pPr>
-      <w:proofErr w:type="spellStart"/>
-      <w:r>
-        <w:t>JavaScript</w:t>
-      </w:r>
-      <w:proofErr w:type="spellEnd"/>
-      <w:r>
-        <w:t xml:space="preserve"> (</w:t>
-      </w:r>
-      <w:proofErr w:type="spellStart"/>
-      <w:r>
-        <w:t>ECMAScript</w:t>
-      </w:r>
-      <w:proofErr w:type="spellEnd"/>
-      <w:r>
-        <w:t xml:space="preserve"> 6)</w:t>
+      <w:r>
+        <w:t>JavaScript (ECMAScript 6)</w:t>
       </w:r>
     </w:p>
     <w:p>
@@ -2219,9 +2151,9 @@
           <w:noProof/>
         </w:rPr>
         <w:drawing>
-          <wp:inline distT="0" distB="0" distL="0" distR="0" wp14:anchorId="488A39AF" wp14:editId="47B66DEC">
-            <wp:extent cx="2066925" cy="4953000"/>
-            <wp:effectExtent l="0" t="0" r="9525" b="0"/>
+          <wp:inline distT="0" distB="0" distL="0" distR="0" wp14:anchorId="488A39AF" wp14:editId="42A69B1A">
+            <wp:extent cx="2011680" cy="4820616"/>
+            <wp:effectExtent l="0" t="0" r="7620" b="0"/>
             <wp:docPr id="3" name="Imagem 3"/>
             <wp:cNvGraphicFramePr>
               <a:graphicFrameLocks xmlns:a="http://schemas.openxmlformats.org/drawingml/2006/main" noChangeAspect="1"/>
@@ -2248,7 +2180,7 @@
                   <pic:spPr>
                     <a:xfrm>
                       <a:off x="0" y="0"/>
-                      <a:ext cx="2066925" cy="4953000"/>
+                      <a:ext cx="2017160" cy="4833749"/>
                     </a:xfrm>
                     <a:prstGeom prst="rect">
                       <a:avLst/>
@@ -2263,6 +2195,35 @@
     </w:p>
     <w:p>
       <w:pPr>
+        <w:pStyle w:val="Legenda"/>
+        <w:spacing w:before="0" w:after="0" w:line="240" w:lineRule="auto"/>
+        <w:rPr>
+          <w:b w:val="0"/>
+          <w:bCs w:val="0"/>
+          <w:sz w:val="24"/>
+          <w:szCs w:val="24"/>
+        </w:rPr>
+      </w:pPr>
+      <w:r>
+        <w:rPr>
+          <w:sz w:val="24"/>
+          <w:szCs w:val="24"/>
+        </w:rPr>
+        <w:t xml:space="preserve">Fonte: </w:t>
+      </w:r>
+      <w:r>
+        <w:rPr>
+          <w:b w:val="0"/>
+          <w:bCs w:val="0"/>
+          <w:sz w:val="24"/>
+          <w:szCs w:val="24"/>
+        </w:rPr>
+        <w:t>O autor</w:t>
+      </w:r>
+    </w:p>
+    <w:p/>
+    <w:p>
+      <w:pPr>
         <w:spacing w:line="240" w:lineRule="auto"/>
         <w:ind w:firstLine="0"/>
         <w:jc w:val="left"/>
@@ -2275,9 +2236,6 @@
           <w:szCs w:val="28"/>
         </w:rPr>
       </w:pPr>
-      <w:r>
-        <w:br w:type="page"/>
-      </w:r>
     </w:p>
     <w:p>
       <w:pPr>
@@ -2471,6 +2429,34 @@
     </w:p>
     <w:p>
       <w:pPr>
+        <w:pStyle w:val="Legenda"/>
+        <w:spacing w:before="0" w:after="0" w:line="240" w:lineRule="auto"/>
+        <w:rPr>
+          <w:b w:val="0"/>
+          <w:bCs w:val="0"/>
+          <w:sz w:val="24"/>
+          <w:szCs w:val="24"/>
+        </w:rPr>
+      </w:pPr>
+      <w:r>
+        <w:rPr>
+          <w:sz w:val="24"/>
+          <w:szCs w:val="24"/>
+        </w:rPr>
+        <w:t xml:space="preserve">Fonte: </w:t>
+      </w:r>
+      <w:r>
+        <w:rPr>
+          <w:b w:val="0"/>
+          <w:bCs w:val="0"/>
+          <w:sz w:val="24"/>
+          <w:szCs w:val="24"/>
+        </w:rPr>
+        <w:t>O autor</w:t>
+      </w:r>
+    </w:p>
+    <w:p>
+      <w:pPr>
         <w:jc w:val="center"/>
       </w:pPr>
     </w:p>
@@ -2492,15 +2478,7 @@
     </w:p>
     <w:p>
       <w:r>
-        <w:t xml:space="preserve">O sistema web, desenvolvido utilizando a IDE Eclipse e Visual Studio </w:t>
-      </w:r>
-      <w:proofErr w:type="spellStart"/>
-      <w:r>
-        <w:t>Code</w:t>
-      </w:r>
-      <w:proofErr w:type="spellEnd"/>
-      <w:r>
-        <w:t xml:space="preserve"> foi dividido em três partes, sendo elas o FrontEnd, BackEnd (API) e Banco de Dados. </w:t>
+        <w:t xml:space="preserve">O sistema web, desenvolvido utilizando a IDE Eclipse e Visual Studio Code foi dividido em três partes, sendo elas o FrontEnd, BackEnd (API) e Banco de Dados. </w:t>
       </w:r>
       <w:r>
         <w:t xml:space="preserve">Abaixo, segue uma breve explicação </w:t>
@@ -2693,7 +2671,24 @@
           <w:szCs w:val="24"/>
         </w:rPr>
       </w:pPr>
-    </w:p>
+      <w:r>
+        <w:rPr>
+          <w:sz w:val="24"/>
+          <w:szCs w:val="24"/>
+        </w:rPr>
+        <w:t xml:space="preserve">Fonte: </w:t>
+      </w:r>
+      <w:r>
+        <w:rPr>
+          <w:b w:val="0"/>
+          <w:bCs w:val="0"/>
+          <w:sz w:val="24"/>
+          <w:szCs w:val="24"/>
+        </w:rPr>
+        <w:t>O autor</w:t>
+      </w:r>
+    </w:p>
+    <w:p/>
     <w:p>
       <w:pPr>
         <w:pStyle w:val="Legenda"/>
@@ -2774,9 +2769,9 @@
           <w:noProof/>
         </w:rPr>
         <w:drawing>
-          <wp:inline distT="0" distB="0" distL="0" distR="0" wp14:anchorId="428864A1" wp14:editId="03E21C49">
-            <wp:extent cx="3877938" cy="3984804"/>
-            <wp:effectExtent l="0" t="0" r="8890" b="0"/>
+          <wp:inline distT="0" distB="0" distL="0" distR="0" wp14:anchorId="428864A1" wp14:editId="02A9D5B4">
+            <wp:extent cx="3749040" cy="3852354"/>
+            <wp:effectExtent l="0" t="0" r="3810" b="0"/>
             <wp:docPr id="7" name="Imagem 7"/>
             <wp:cNvGraphicFramePr>
               <a:graphicFrameLocks xmlns:a="http://schemas.openxmlformats.org/drawingml/2006/main" noChangeAspect="1"/>
@@ -2803,7 +2798,7 @@
                   <pic:spPr>
                     <a:xfrm>
                       <a:off x="0" y="0"/>
-                      <a:ext cx="3904382" cy="4011977"/>
+                      <a:ext cx="3777045" cy="3881130"/>
                     </a:xfrm>
                     <a:prstGeom prst="rect">
                       <a:avLst/>
@@ -2818,12 +2813,31 @@
     </w:p>
     <w:p>
       <w:pPr>
-        <w:tabs>
-          <w:tab w:val="left" w:pos="3544"/>
-        </w:tabs>
-        <w:ind w:firstLine="0"/>
-        <w:jc w:val="left"/>
-      </w:pPr>
+        <w:pStyle w:val="Legenda"/>
+        <w:spacing w:before="0" w:after="0" w:line="240" w:lineRule="auto"/>
+        <w:rPr>
+          <w:b w:val="0"/>
+          <w:bCs w:val="0"/>
+          <w:sz w:val="24"/>
+          <w:szCs w:val="24"/>
+        </w:rPr>
+      </w:pPr>
+      <w:r>
+        <w:rPr>
+          <w:sz w:val="24"/>
+          <w:szCs w:val="24"/>
+        </w:rPr>
+        <w:t xml:space="preserve">Fonte: </w:t>
+      </w:r>
+      <w:r>
+        <w:rPr>
+          <w:b w:val="0"/>
+          <w:bCs w:val="0"/>
+          <w:sz w:val="24"/>
+          <w:szCs w:val="24"/>
+        </w:rPr>
+        <w:t>O autor</w:t>
+      </w:r>
     </w:p>
     <w:p>
       <w:pPr>
@@ -3006,12 +3020,31 @@
     </w:p>
     <w:p>
       <w:pPr>
-        <w:tabs>
-          <w:tab w:val="left" w:pos="3544"/>
-        </w:tabs>
-        <w:ind w:firstLine="0"/>
-        <w:jc w:val="left"/>
-      </w:pPr>
+        <w:pStyle w:val="Legenda"/>
+        <w:spacing w:before="0" w:after="0" w:line="240" w:lineRule="auto"/>
+        <w:rPr>
+          <w:b w:val="0"/>
+          <w:bCs w:val="0"/>
+          <w:sz w:val="24"/>
+          <w:szCs w:val="24"/>
+        </w:rPr>
+      </w:pPr>
+      <w:r>
+        <w:rPr>
+          <w:sz w:val="24"/>
+          <w:szCs w:val="24"/>
+        </w:rPr>
+        <w:t xml:space="preserve">Fonte: </w:t>
+      </w:r>
+      <w:r>
+        <w:rPr>
+          <w:b w:val="0"/>
+          <w:bCs w:val="0"/>
+          <w:sz w:val="24"/>
+          <w:szCs w:val="24"/>
+        </w:rPr>
+        <w:t>O autor</w:t>
+      </w:r>
     </w:p>
     <w:p>
       <w:pPr>
@@ -3267,6 +3300,39 @@
     <w:p>
       <w:pPr>
         <w:pStyle w:val="Legenda"/>
+        <w:spacing w:before="0" w:after="0" w:line="240" w:lineRule="auto"/>
+        <w:rPr>
+          <w:b w:val="0"/>
+          <w:bCs w:val="0"/>
+          <w:sz w:val="24"/>
+          <w:szCs w:val="24"/>
+        </w:rPr>
+      </w:pPr>
+      <w:r>
+        <w:rPr>
+          <w:sz w:val="24"/>
+          <w:szCs w:val="24"/>
+        </w:rPr>
+        <w:t xml:space="preserve">Fonte: </w:t>
+      </w:r>
+      <w:r>
+        <w:rPr>
+          <w:b w:val="0"/>
+          <w:bCs w:val="0"/>
+          <w:sz w:val="24"/>
+          <w:szCs w:val="24"/>
+        </w:rPr>
+        <w:t>O autor</w:t>
+      </w:r>
+    </w:p>
+    <w:p>
+      <w:pPr>
+        <w:ind w:firstLine="0"/>
+      </w:pPr>
+    </w:p>
+    <w:p>
+      <w:pPr>
+        <w:pStyle w:val="Legenda"/>
         <w:rPr>
           <w:sz w:val="24"/>
           <w:szCs w:val="24"/>
@@ -3383,9 +3449,38 @@
         </w:drawing>
       </w:r>
     </w:p>
+    <w:p>
+      <w:pPr>
+        <w:pStyle w:val="Legenda"/>
+        <w:spacing w:before="0" w:after="0" w:line="240" w:lineRule="auto"/>
+        <w:rPr>
+          <w:b w:val="0"/>
+          <w:bCs w:val="0"/>
+          <w:sz w:val="24"/>
+          <w:szCs w:val="24"/>
+        </w:rPr>
+      </w:pPr>
+      <w:r>
+        <w:rPr>
+          <w:sz w:val="24"/>
+          <w:szCs w:val="24"/>
+        </w:rPr>
+        <w:t xml:space="preserve">Fonte: </w:t>
+      </w:r>
+      <w:r>
+        <w:rPr>
+          <w:b w:val="0"/>
+          <w:bCs w:val="0"/>
+          <w:sz w:val="24"/>
+          <w:szCs w:val="24"/>
+        </w:rPr>
+        <w:t>O autor</w:t>
+      </w:r>
+    </w:p>
     <w:p/>
     <w:p>
       <w:r>
+        <w:lastRenderedPageBreak/>
         <w:t xml:space="preserve">O </w:t>
       </w:r>
       <w:r>
@@ -3406,8 +3501,6 @@
       <w:r>
         <w:t xml:space="preserve"> responsável por trazer os casos de testes do banco</w:t>
       </w:r>
-      <w:bookmarkStart w:id="15" w:name="_GoBack"/>
-      <w:bookmarkEnd w:id="15"/>
       <w:r>
         <w:t xml:space="preserve">. </w:t>
       </w:r>
@@ -3425,7 +3518,6 @@
           <w:sz w:val="24"/>
           <w:szCs w:val="24"/>
         </w:rPr>
-        <w:lastRenderedPageBreak/>
         <w:t xml:space="preserve">Figura </w:t>
       </w:r>
       <w:r>
@@ -3483,6 +3575,7 @@
     <w:p>
       <w:pPr>
         <w:ind w:firstLine="0"/>
+        <w:jc w:val="center"/>
       </w:pPr>
       <w:r>
         <w:rPr>
@@ -3531,76 +3624,3136 @@
         </w:drawing>
       </w:r>
     </w:p>
+    <w:p>
+      <w:pPr>
+        <w:pStyle w:val="Legenda"/>
+        <w:spacing w:before="0" w:after="0" w:line="240" w:lineRule="auto"/>
+        <w:rPr>
+          <w:b w:val="0"/>
+          <w:bCs w:val="0"/>
+          <w:sz w:val="24"/>
+          <w:szCs w:val="24"/>
+        </w:rPr>
+      </w:pPr>
+      <w:r>
+        <w:rPr>
+          <w:sz w:val="24"/>
+          <w:szCs w:val="24"/>
+        </w:rPr>
+        <w:t xml:space="preserve">Fonte: </w:t>
+      </w:r>
+      <w:r>
+        <w:rPr>
+          <w:b w:val="0"/>
+          <w:bCs w:val="0"/>
+          <w:sz w:val="24"/>
+          <w:szCs w:val="24"/>
+        </w:rPr>
+        <w:t>O autor</w:t>
+      </w:r>
+    </w:p>
+    <w:p/>
+    <w:p>
+      <w:r>
+        <w:t>A Figura 9 apresenta o método utilizado para configurar o driver do Google Chrome. Os pontos numerados correspondem a:</w:t>
+      </w:r>
+    </w:p>
+    <w:p>
+      <w:pPr>
+        <w:pStyle w:val="PargrafodaLista"/>
+        <w:numPr>
+          <w:ilvl w:val="0"/>
+          <w:numId w:val="24"/>
+        </w:numPr>
+      </w:pPr>
+      <w:r>
+        <w:t>Indica o caminho onde encontra-se o chromedriver.exe;</w:t>
+      </w:r>
+    </w:p>
+    <w:p>
+      <w:pPr>
+        <w:pStyle w:val="PargrafodaLista"/>
+        <w:numPr>
+          <w:ilvl w:val="0"/>
+          <w:numId w:val="24"/>
+        </w:numPr>
+      </w:pPr>
+      <w:r>
+        <w:t>Inicializa o driver abrindo o navegador;</w:t>
+      </w:r>
+    </w:p>
+    <w:p>
+      <w:pPr>
+        <w:pStyle w:val="PargrafodaLista"/>
+        <w:numPr>
+          <w:ilvl w:val="0"/>
+          <w:numId w:val="24"/>
+        </w:numPr>
+      </w:pPr>
+      <w:r>
+        <w:t xml:space="preserve">Define o tamanho da janela do navegador, maximizando. </w:t>
+      </w:r>
+    </w:p>
+    <w:p>
+      <w:pPr>
+        <w:pStyle w:val="PargrafodaLista"/>
+        <w:numPr>
+          <w:ilvl w:val="0"/>
+          <w:numId w:val="24"/>
+        </w:numPr>
+        <w:rPr>
+          <w:i/>
+          <w:iCs/>
+        </w:rPr>
+      </w:pPr>
+      <w:r>
+        <w:t xml:space="preserve">Define o tempo para o </w:t>
+      </w:r>
+      <w:r>
+        <w:rPr>
+          <w:i/>
+          <w:iCs/>
+        </w:rPr>
+        <w:t>Timeout</w:t>
+      </w:r>
+      <w:r>
+        <w:rPr>
+          <w:i/>
+          <w:iCs/>
+        </w:rPr>
+        <w:t>.</w:t>
+      </w:r>
+    </w:p>
+    <w:p>
+      <w:pPr>
+        <w:pStyle w:val="PargrafodaLista"/>
+        <w:ind w:left="644" w:firstLine="0"/>
+        <w:rPr>
+          <w:i/>
+          <w:iCs/>
+        </w:rPr>
+      </w:pPr>
+    </w:p>
+    <w:p>
+      <w:pPr>
+        <w:pStyle w:val="Legenda"/>
+        <w:rPr>
+          <w:sz w:val="24"/>
+          <w:szCs w:val="24"/>
+        </w:rPr>
+      </w:pPr>
+      <w:r>
+        <w:rPr>
+          <w:sz w:val="24"/>
+          <w:szCs w:val="24"/>
+        </w:rPr>
+        <w:t xml:space="preserve">Figura </w:t>
+      </w:r>
+      <w:r>
+        <w:rPr>
+          <w:sz w:val="24"/>
+          <w:szCs w:val="24"/>
+        </w:rPr>
+        <w:fldChar w:fldCharType="begin"/>
+      </w:r>
+      <w:r>
+        <w:rPr>
+          <w:sz w:val="24"/>
+          <w:szCs w:val="24"/>
+        </w:rPr>
+        <w:instrText xml:space="preserve"> SEQ Figura \* ARABIC </w:instrText>
+      </w:r>
+      <w:r>
+        <w:rPr>
+          <w:sz w:val="24"/>
+          <w:szCs w:val="24"/>
+        </w:rPr>
+        <w:fldChar w:fldCharType="separate"/>
+      </w:r>
+      <w:r>
+        <w:rPr>
+          <w:noProof/>
+          <w:sz w:val="24"/>
+          <w:szCs w:val="24"/>
+        </w:rPr>
+        <w:t>9</w:t>
+      </w:r>
+      <w:r>
+        <w:rPr>
+          <w:sz w:val="24"/>
+          <w:szCs w:val="24"/>
+        </w:rPr>
+        <w:fldChar w:fldCharType="end"/>
+      </w:r>
+      <w:r>
+        <w:rPr>
+          <w:sz w:val="24"/>
+          <w:szCs w:val="24"/>
+        </w:rPr>
+        <w:t xml:space="preserve"> – </w:t>
+      </w:r>
+      <w:r>
+        <w:rPr>
+          <w:b w:val="0"/>
+          <w:bCs w:val="0"/>
+          <w:sz w:val="24"/>
+          <w:szCs w:val="24"/>
+        </w:rPr>
+        <w:t>setUpChromeDriver()</w:t>
+      </w:r>
+    </w:p>
+    <w:p>
+      <w:pPr>
+        <w:ind w:firstLine="0"/>
+        <w:jc w:val="center"/>
+      </w:pPr>
+      <w:r>
+        <w:rPr>
+          <w:noProof/>
+        </w:rPr>
+        <w:drawing>
+          <wp:inline distT="0" distB="0" distL="0" distR="0" wp14:anchorId="0D9F7465" wp14:editId="64DAAACF">
+            <wp:extent cx="5760720" cy="1849120"/>
+            <wp:effectExtent l="0" t="0" r="0" b="0"/>
+            <wp:docPr id="12" name="Imagem 12" descr="Texto&#10;&#10;Descrição gerada automaticamente"/>
+            <wp:cNvGraphicFramePr>
+              <a:graphicFrameLocks xmlns:a="http://schemas.openxmlformats.org/drawingml/2006/main" noChangeAspect="1"/>
+            </wp:cNvGraphicFramePr>
+            <a:graphic xmlns:a="http://schemas.openxmlformats.org/drawingml/2006/main">
+              <a:graphicData uri="http://schemas.openxmlformats.org/drawingml/2006/picture">
+                <pic:pic xmlns:pic="http://schemas.openxmlformats.org/drawingml/2006/picture">
+                  <pic:nvPicPr>
+                    <pic:cNvPr id="12" name="Imagem 12" descr="Texto&#10;&#10;Descrição gerada automaticamente"/>
+                    <pic:cNvPicPr/>
+                  </pic:nvPicPr>
+                  <pic:blipFill>
+                    <a:blip r:embed="rId17">
+                      <a:extLst>
+                        <a:ext uri="{28A0092B-C50C-407E-A947-70E740481C1C}">
+                          <a14:useLocalDpi xmlns:a14="http://schemas.microsoft.com/office/drawing/2010/main" val="0"/>
+                        </a:ext>
+                      </a:extLst>
+                    </a:blip>
+                    <a:stretch>
+                      <a:fillRect/>
+                    </a:stretch>
+                  </pic:blipFill>
+                  <pic:spPr>
+                    <a:xfrm>
+                      <a:off x="0" y="0"/>
+                      <a:ext cx="5760720" cy="1849120"/>
+                    </a:xfrm>
+                    <a:prstGeom prst="rect">
+                      <a:avLst/>
+                    </a:prstGeom>
+                  </pic:spPr>
+                </pic:pic>
+              </a:graphicData>
+            </a:graphic>
+          </wp:inline>
+        </w:drawing>
+      </w:r>
+    </w:p>
+    <w:p>
+      <w:pPr>
+        <w:pStyle w:val="Legenda"/>
+        <w:spacing w:before="0" w:after="0" w:line="240" w:lineRule="auto"/>
+        <w:rPr>
+          <w:b w:val="0"/>
+          <w:bCs w:val="0"/>
+          <w:sz w:val="24"/>
+          <w:szCs w:val="24"/>
+        </w:rPr>
+      </w:pPr>
+      <w:r>
+        <w:rPr>
+          <w:sz w:val="24"/>
+          <w:szCs w:val="24"/>
+        </w:rPr>
+        <w:t xml:space="preserve">Fonte: </w:t>
+      </w:r>
+      <w:r>
+        <w:rPr>
+          <w:b w:val="0"/>
+          <w:bCs w:val="0"/>
+          <w:sz w:val="24"/>
+          <w:szCs w:val="24"/>
+        </w:rPr>
+        <w:t>O autor</w:t>
+      </w:r>
+    </w:p>
+    <w:p/>
+    <w:p/>
+    <w:p>
+      <w:r>
+        <w:lastRenderedPageBreak/>
+        <w:t xml:space="preserve">A Figura </w:t>
+      </w:r>
+      <w:r>
+        <w:t>10</w:t>
+      </w:r>
+      <w:r>
+        <w:t xml:space="preserve"> apresenta </w:t>
+      </w:r>
+      <w:r>
+        <w:t xml:space="preserve">o método responsável por direcionar a execução do caso de teste. </w:t>
+      </w:r>
+      <w:r>
+        <w:t>Os pontos numerados correspondem a:</w:t>
+      </w:r>
+    </w:p>
+    <w:p>
+      <w:pPr>
+        <w:pStyle w:val="PargrafodaLista"/>
+        <w:numPr>
+          <w:ilvl w:val="0"/>
+          <w:numId w:val="25"/>
+        </w:numPr>
+      </w:pPr>
+      <w:r>
+        <w:t>P</w:t>
+      </w:r>
+      <w:r>
+        <w:t>assa por todos os testes do caso de teste recebido pela API</w:t>
+      </w:r>
+      <w:r>
+        <w:t xml:space="preserve"> e c</w:t>
+      </w:r>
+      <w:r>
+        <w:t>hama o método de execução de acordo com o tipo do teste</w:t>
+      </w:r>
+      <w:r>
+        <w:t>;</w:t>
+      </w:r>
+    </w:p>
+    <w:p>
+      <w:pPr>
+        <w:pStyle w:val="PargrafodaLista"/>
+        <w:numPr>
+          <w:ilvl w:val="0"/>
+          <w:numId w:val="25"/>
+        </w:numPr>
+      </w:pPr>
+      <w:r>
+        <w:t xml:space="preserve">Retorna a mensagem de sucesso. </w:t>
+      </w:r>
+    </w:p>
+    <w:p>
+      <w:pPr>
+        <w:pStyle w:val="PargrafodaLista"/>
+        <w:numPr>
+          <w:ilvl w:val="0"/>
+          <w:numId w:val="25"/>
+        </w:numPr>
+      </w:pPr>
+      <w:r>
+        <w:t xml:space="preserve">Retorna a mensagem de erro. </w:t>
+      </w:r>
+    </w:p>
+    <w:p>
+      <w:pPr>
+        <w:pStyle w:val="Legenda"/>
+        <w:rPr>
+          <w:sz w:val="24"/>
+          <w:szCs w:val="24"/>
+        </w:rPr>
+      </w:pPr>
+      <w:r>
+        <w:rPr>
+          <w:sz w:val="24"/>
+          <w:szCs w:val="24"/>
+        </w:rPr>
+        <w:t xml:space="preserve">Figura </w:t>
+      </w:r>
+      <w:r>
+        <w:rPr>
+          <w:sz w:val="24"/>
+          <w:szCs w:val="24"/>
+        </w:rPr>
+        <w:fldChar w:fldCharType="begin"/>
+      </w:r>
+      <w:r>
+        <w:rPr>
+          <w:sz w:val="24"/>
+          <w:szCs w:val="24"/>
+        </w:rPr>
+        <w:instrText xml:space="preserve"> SEQ Figura \* ARABIC </w:instrText>
+      </w:r>
+      <w:r>
+        <w:rPr>
+          <w:sz w:val="24"/>
+          <w:szCs w:val="24"/>
+        </w:rPr>
+        <w:fldChar w:fldCharType="separate"/>
+      </w:r>
+      <w:r>
+        <w:rPr>
+          <w:noProof/>
+          <w:sz w:val="24"/>
+          <w:szCs w:val="24"/>
+        </w:rPr>
+        <w:t>10</w:t>
+      </w:r>
+      <w:r>
+        <w:rPr>
+          <w:sz w:val="24"/>
+          <w:szCs w:val="24"/>
+        </w:rPr>
+        <w:fldChar w:fldCharType="end"/>
+      </w:r>
+      <w:r>
+        <w:rPr>
+          <w:sz w:val="24"/>
+          <w:szCs w:val="24"/>
+        </w:rPr>
+        <w:t xml:space="preserve"> – </w:t>
+      </w:r>
+      <w:r>
+        <w:rPr>
+          <w:b w:val="0"/>
+          <w:bCs w:val="0"/>
+          <w:sz w:val="24"/>
+          <w:szCs w:val="24"/>
+        </w:rPr>
+        <w:t>executarTestes()</w:t>
+      </w:r>
+    </w:p>
+    <w:p>
+      <w:pPr>
+        <w:ind w:firstLine="0"/>
+        <w:jc w:val="center"/>
+      </w:pPr>
+      <w:r>
+        <w:rPr>
+          <w:noProof/>
+        </w:rPr>
+        <w:drawing>
+          <wp:inline distT="0" distB="0" distL="0" distR="0" wp14:anchorId="397ECB32" wp14:editId="3FC165BE">
+            <wp:extent cx="5443870" cy="6289974"/>
+            <wp:effectExtent l="0" t="0" r="4445" b="0"/>
+            <wp:docPr id="20" name="Imagem 20" descr="Uma imagem contendo Texto&#10;&#10;Descrição gerada automaticamente"/>
+            <wp:cNvGraphicFramePr>
+              <a:graphicFrameLocks xmlns:a="http://schemas.openxmlformats.org/drawingml/2006/main" noChangeAspect="1"/>
+            </wp:cNvGraphicFramePr>
+            <a:graphic xmlns:a="http://schemas.openxmlformats.org/drawingml/2006/main">
+              <a:graphicData uri="http://schemas.openxmlformats.org/drawingml/2006/picture">
+                <pic:pic xmlns:pic="http://schemas.openxmlformats.org/drawingml/2006/picture">
+                  <pic:nvPicPr>
+                    <pic:cNvPr id="20" name="Imagem 20" descr="Uma imagem contendo Texto&#10;&#10;Descrição gerada automaticamente"/>
+                    <pic:cNvPicPr/>
+                  </pic:nvPicPr>
+                  <pic:blipFill>
+                    <a:blip r:embed="rId18">
+                      <a:extLst>
+                        <a:ext uri="{28A0092B-C50C-407E-A947-70E740481C1C}">
+                          <a14:useLocalDpi xmlns:a14="http://schemas.microsoft.com/office/drawing/2010/main" val="0"/>
+                        </a:ext>
+                      </a:extLst>
+                    </a:blip>
+                    <a:stretch>
+                      <a:fillRect/>
+                    </a:stretch>
+                  </pic:blipFill>
+                  <pic:spPr>
+                    <a:xfrm>
+                      <a:off x="0" y="0"/>
+                      <a:ext cx="5446068" cy="6292513"/>
+                    </a:xfrm>
+                    <a:prstGeom prst="rect">
+                      <a:avLst/>
+                    </a:prstGeom>
+                  </pic:spPr>
+                </pic:pic>
+              </a:graphicData>
+            </a:graphic>
+          </wp:inline>
+        </w:drawing>
+      </w:r>
+    </w:p>
+    <w:p>
+      <w:pPr>
+        <w:pStyle w:val="Legenda"/>
+        <w:spacing w:before="0" w:after="0" w:line="240" w:lineRule="auto"/>
+        <w:rPr>
+          <w:b w:val="0"/>
+          <w:bCs w:val="0"/>
+          <w:sz w:val="24"/>
+          <w:szCs w:val="24"/>
+        </w:rPr>
+      </w:pPr>
+      <w:r>
+        <w:rPr>
+          <w:sz w:val="24"/>
+          <w:szCs w:val="24"/>
+        </w:rPr>
+        <w:t xml:space="preserve">Fonte: </w:t>
+      </w:r>
+      <w:r>
+        <w:rPr>
+          <w:b w:val="0"/>
+          <w:bCs w:val="0"/>
+          <w:sz w:val="24"/>
+          <w:szCs w:val="24"/>
+        </w:rPr>
+        <w:t>O autor</w:t>
+      </w:r>
+    </w:p>
+    <w:p>
+      <w:r>
+        <w:lastRenderedPageBreak/>
+        <w:t>A Figura 1</w:t>
+      </w:r>
+      <w:r>
+        <w:t>1</w:t>
+      </w:r>
+      <w:r>
+        <w:t xml:space="preserve"> apresenta o método responsável por </w:t>
+      </w:r>
+      <w:r>
+        <w:t xml:space="preserve">retornar o by de acordo com o que foi definido para o teste recebido como parâmetro. </w:t>
+      </w:r>
+    </w:p>
+    <w:p>
+      <w:pPr>
+        <w:pStyle w:val="Legenda"/>
+        <w:rPr>
+          <w:sz w:val="24"/>
+          <w:szCs w:val="24"/>
+        </w:rPr>
+      </w:pPr>
+      <w:r>
+        <w:rPr>
+          <w:sz w:val="24"/>
+          <w:szCs w:val="24"/>
+        </w:rPr>
+        <w:t xml:space="preserve">Figura </w:t>
+      </w:r>
+      <w:r>
+        <w:rPr>
+          <w:sz w:val="24"/>
+          <w:szCs w:val="24"/>
+        </w:rPr>
+        <w:fldChar w:fldCharType="begin"/>
+      </w:r>
+      <w:r>
+        <w:rPr>
+          <w:sz w:val="24"/>
+          <w:szCs w:val="24"/>
+        </w:rPr>
+        <w:instrText xml:space="preserve"> SEQ Figura \* ARABIC </w:instrText>
+      </w:r>
+      <w:r>
+        <w:rPr>
+          <w:sz w:val="24"/>
+          <w:szCs w:val="24"/>
+        </w:rPr>
+        <w:fldChar w:fldCharType="separate"/>
+      </w:r>
+      <w:r>
+        <w:rPr>
+          <w:noProof/>
+          <w:sz w:val="24"/>
+          <w:szCs w:val="24"/>
+        </w:rPr>
+        <w:t>11</w:t>
+      </w:r>
+      <w:r>
+        <w:rPr>
+          <w:sz w:val="24"/>
+          <w:szCs w:val="24"/>
+        </w:rPr>
+        <w:fldChar w:fldCharType="end"/>
+      </w:r>
+      <w:r>
+        <w:rPr>
+          <w:sz w:val="24"/>
+          <w:szCs w:val="24"/>
+        </w:rPr>
+        <w:t xml:space="preserve"> – </w:t>
+      </w:r>
+      <w:r>
+        <w:rPr>
+          <w:b w:val="0"/>
+          <w:bCs w:val="0"/>
+          <w:sz w:val="24"/>
+          <w:szCs w:val="24"/>
+        </w:rPr>
+        <w:t>retornarElemento()</w:t>
+      </w:r>
+    </w:p>
+    <w:p>
+      <w:pPr>
+        <w:ind w:firstLine="0"/>
+        <w:jc w:val="center"/>
+      </w:pPr>
+      <w:r>
+        <w:rPr>
+          <w:noProof/>
+        </w:rPr>
+        <w:drawing>
+          <wp:inline distT="0" distB="0" distL="0" distR="0" wp14:anchorId="74E0257E" wp14:editId="6F66A498">
+            <wp:extent cx="4772691" cy="3315163"/>
+            <wp:effectExtent l="0" t="0" r="0" b="0"/>
+            <wp:docPr id="22" name="Imagem 22" descr="Uma imagem contendo pessoa&#10;&#10;Descrição gerada automaticamente"/>
+            <wp:cNvGraphicFramePr>
+              <a:graphicFrameLocks xmlns:a="http://schemas.openxmlformats.org/drawingml/2006/main" noChangeAspect="1"/>
+            </wp:cNvGraphicFramePr>
+            <a:graphic xmlns:a="http://schemas.openxmlformats.org/drawingml/2006/main">
+              <a:graphicData uri="http://schemas.openxmlformats.org/drawingml/2006/picture">
+                <pic:pic xmlns:pic="http://schemas.openxmlformats.org/drawingml/2006/picture">
+                  <pic:nvPicPr>
+                    <pic:cNvPr id="22" name="Imagem 22" descr="Uma imagem contendo pessoa&#10;&#10;Descrição gerada automaticamente"/>
+                    <pic:cNvPicPr/>
+                  </pic:nvPicPr>
+                  <pic:blipFill>
+                    <a:blip r:embed="rId19">
+                      <a:extLst>
+                        <a:ext uri="{28A0092B-C50C-407E-A947-70E740481C1C}">
+                          <a14:useLocalDpi xmlns:a14="http://schemas.microsoft.com/office/drawing/2010/main" val="0"/>
+                        </a:ext>
+                      </a:extLst>
+                    </a:blip>
+                    <a:stretch>
+                      <a:fillRect/>
+                    </a:stretch>
+                  </pic:blipFill>
+                  <pic:spPr>
+                    <a:xfrm>
+                      <a:off x="0" y="0"/>
+                      <a:ext cx="4772691" cy="3315163"/>
+                    </a:xfrm>
+                    <a:prstGeom prst="rect">
+                      <a:avLst/>
+                    </a:prstGeom>
+                  </pic:spPr>
+                </pic:pic>
+              </a:graphicData>
+            </a:graphic>
+          </wp:inline>
+        </w:drawing>
+      </w:r>
+    </w:p>
+    <w:p>
+      <w:pPr>
+        <w:pStyle w:val="Legenda"/>
+        <w:spacing w:before="0" w:after="0" w:line="240" w:lineRule="auto"/>
+        <w:rPr>
+          <w:b w:val="0"/>
+          <w:bCs w:val="0"/>
+          <w:sz w:val="24"/>
+          <w:szCs w:val="24"/>
+        </w:rPr>
+      </w:pPr>
+      <w:r>
+        <w:rPr>
+          <w:sz w:val="24"/>
+          <w:szCs w:val="24"/>
+        </w:rPr>
+        <w:t xml:space="preserve">Fonte: </w:t>
+      </w:r>
+      <w:r>
+        <w:rPr>
+          <w:b w:val="0"/>
+          <w:bCs w:val="0"/>
+          <w:sz w:val="24"/>
+          <w:szCs w:val="24"/>
+        </w:rPr>
+        <w:t>O autor</w:t>
+      </w:r>
+    </w:p>
+    <w:p>
+      <w:pPr>
+        <w:ind w:firstLine="0"/>
+      </w:pPr>
+    </w:p>
+    <w:p>
+      <w:pPr>
+        <w:spacing w:line="240" w:lineRule="auto"/>
+        <w:jc w:val="left"/>
+      </w:pPr>
+      <w:r>
+        <w:t>A</w:t>
+      </w:r>
+      <w:r>
+        <w:t xml:space="preserve">s figuras abaixo </w:t>
+      </w:r>
+      <w:r>
+        <w:t>apresenta</w:t>
+      </w:r>
+      <w:r>
+        <w:t xml:space="preserve">m alguns dos métodos referentes as ações do selenium. </w:t>
+      </w:r>
+      <w:r>
+        <w:t xml:space="preserve"> </w:t>
+      </w:r>
+    </w:p>
+    <w:p>
+      <w:pPr>
+        <w:pStyle w:val="Legenda"/>
+        <w:rPr>
+          <w:sz w:val="24"/>
+          <w:szCs w:val="24"/>
+        </w:rPr>
+      </w:pPr>
+      <w:r>
+        <w:rPr>
+          <w:sz w:val="24"/>
+          <w:szCs w:val="24"/>
+        </w:rPr>
+        <w:t xml:space="preserve">Figura </w:t>
+      </w:r>
+      <w:r>
+        <w:rPr>
+          <w:sz w:val="24"/>
+          <w:szCs w:val="24"/>
+        </w:rPr>
+        <w:fldChar w:fldCharType="begin"/>
+      </w:r>
+      <w:r>
+        <w:rPr>
+          <w:sz w:val="24"/>
+          <w:szCs w:val="24"/>
+        </w:rPr>
+        <w:instrText xml:space="preserve"> SEQ Figura \* ARABIC </w:instrText>
+      </w:r>
+      <w:r>
+        <w:rPr>
+          <w:sz w:val="24"/>
+          <w:szCs w:val="24"/>
+        </w:rPr>
+        <w:fldChar w:fldCharType="separate"/>
+      </w:r>
+      <w:r>
+        <w:rPr>
+          <w:noProof/>
+          <w:sz w:val="24"/>
+          <w:szCs w:val="24"/>
+        </w:rPr>
+        <w:t>12</w:t>
+      </w:r>
+      <w:r>
+        <w:rPr>
+          <w:sz w:val="24"/>
+          <w:szCs w:val="24"/>
+        </w:rPr>
+        <w:fldChar w:fldCharType="end"/>
+      </w:r>
+      <w:r>
+        <w:rPr>
+          <w:sz w:val="24"/>
+          <w:szCs w:val="24"/>
+        </w:rPr>
+        <w:t xml:space="preserve"> – </w:t>
+      </w:r>
+      <w:r>
+        <w:rPr>
+          <w:b w:val="0"/>
+          <w:bCs w:val="0"/>
+          <w:sz w:val="24"/>
+          <w:szCs w:val="24"/>
+        </w:rPr>
+        <w:t>MetodosTeste()</w:t>
+      </w:r>
+    </w:p>
+    <w:p>
+      <w:pPr>
+        <w:ind w:firstLine="0"/>
+        <w:jc w:val="center"/>
+      </w:pPr>
+      <w:r>
+        <w:rPr>
+          <w:noProof/>
+        </w:rPr>
+        <w:drawing>
+          <wp:inline distT="0" distB="0" distL="0" distR="0" wp14:anchorId="2428815D" wp14:editId="0E263BF0">
+            <wp:extent cx="2811780" cy="2801963"/>
+            <wp:effectExtent l="0" t="0" r="7620" b="0"/>
+            <wp:docPr id="24" name="Imagem 24" descr="Texto&#10;&#10;Descrição gerada automaticamente"/>
+            <wp:cNvGraphicFramePr>
+              <a:graphicFrameLocks xmlns:a="http://schemas.openxmlformats.org/drawingml/2006/main" noChangeAspect="1"/>
+            </wp:cNvGraphicFramePr>
+            <a:graphic xmlns:a="http://schemas.openxmlformats.org/drawingml/2006/main">
+              <a:graphicData uri="http://schemas.openxmlformats.org/drawingml/2006/picture">
+                <pic:pic xmlns:pic="http://schemas.openxmlformats.org/drawingml/2006/picture">
+                  <pic:nvPicPr>
+                    <pic:cNvPr id="24" name="Imagem 24" descr="Texto&#10;&#10;Descrição gerada automaticamente"/>
+                    <pic:cNvPicPr/>
+                  </pic:nvPicPr>
+                  <pic:blipFill>
+                    <a:blip r:embed="rId20">
+                      <a:extLst>
+                        <a:ext uri="{28A0092B-C50C-407E-A947-70E740481C1C}">
+                          <a14:useLocalDpi xmlns:a14="http://schemas.microsoft.com/office/drawing/2010/main" val="0"/>
+                        </a:ext>
+                      </a:extLst>
+                    </a:blip>
+                    <a:stretch>
+                      <a:fillRect/>
+                    </a:stretch>
+                  </pic:blipFill>
+                  <pic:spPr>
+                    <a:xfrm>
+                      <a:off x="0" y="0"/>
+                      <a:ext cx="2817135" cy="2807300"/>
+                    </a:xfrm>
+                    <a:prstGeom prst="rect">
+                      <a:avLst/>
+                    </a:prstGeom>
+                  </pic:spPr>
+                </pic:pic>
+              </a:graphicData>
+            </a:graphic>
+          </wp:inline>
+        </w:drawing>
+      </w:r>
+    </w:p>
+    <w:p>
+      <w:pPr>
+        <w:pStyle w:val="Legenda"/>
+        <w:spacing w:before="0" w:after="0" w:line="240" w:lineRule="auto"/>
+        <w:rPr>
+          <w:b w:val="0"/>
+          <w:bCs w:val="0"/>
+          <w:sz w:val="24"/>
+          <w:szCs w:val="24"/>
+        </w:rPr>
+      </w:pPr>
+      <w:r>
+        <w:rPr>
+          <w:sz w:val="24"/>
+          <w:szCs w:val="24"/>
+        </w:rPr>
+        <w:t xml:space="preserve">Fonte: </w:t>
+      </w:r>
+      <w:r>
+        <w:rPr>
+          <w:b w:val="0"/>
+          <w:bCs w:val="0"/>
+          <w:sz w:val="24"/>
+          <w:szCs w:val="24"/>
+        </w:rPr>
+        <w:t>O autor</w:t>
+      </w:r>
+    </w:p>
+    <w:p/>
+    <w:p>
+      <w:pPr>
+        <w:pStyle w:val="Legenda"/>
+        <w:rPr>
+          <w:sz w:val="24"/>
+          <w:szCs w:val="24"/>
+        </w:rPr>
+      </w:pPr>
+      <w:r>
+        <w:rPr>
+          <w:sz w:val="24"/>
+          <w:szCs w:val="24"/>
+        </w:rPr>
+        <w:lastRenderedPageBreak/>
+        <w:t xml:space="preserve">Figura </w:t>
+      </w:r>
+      <w:r>
+        <w:rPr>
+          <w:sz w:val="24"/>
+          <w:szCs w:val="24"/>
+        </w:rPr>
+        <w:fldChar w:fldCharType="begin"/>
+      </w:r>
+      <w:r>
+        <w:rPr>
+          <w:sz w:val="24"/>
+          <w:szCs w:val="24"/>
+        </w:rPr>
+        <w:instrText xml:space="preserve"> SEQ Figura \* ARABIC </w:instrText>
+      </w:r>
+      <w:r>
+        <w:rPr>
+          <w:sz w:val="24"/>
+          <w:szCs w:val="24"/>
+        </w:rPr>
+        <w:fldChar w:fldCharType="separate"/>
+      </w:r>
+      <w:r>
+        <w:rPr>
+          <w:noProof/>
+          <w:sz w:val="24"/>
+          <w:szCs w:val="24"/>
+        </w:rPr>
+        <w:t>13</w:t>
+      </w:r>
+      <w:r>
+        <w:rPr>
+          <w:sz w:val="24"/>
+          <w:szCs w:val="24"/>
+        </w:rPr>
+        <w:fldChar w:fldCharType="end"/>
+      </w:r>
+      <w:r>
+        <w:rPr>
+          <w:sz w:val="24"/>
+          <w:szCs w:val="24"/>
+        </w:rPr>
+        <w:t xml:space="preserve"> – </w:t>
+      </w:r>
+      <w:r>
+        <w:rPr>
+          <w:b w:val="0"/>
+          <w:bCs w:val="0"/>
+          <w:sz w:val="24"/>
+          <w:szCs w:val="24"/>
+        </w:rPr>
+        <w:t>MetodosTeste()</w:t>
+      </w:r>
+    </w:p>
+    <w:p>
+      <w:pPr>
+        <w:ind w:firstLine="0"/>
+        <w:jc w:val="center"/>
+      </w:pPr>
+      <w:r>
+        <w:rPr>
+          <w:noProof/>
+        </w:rPr>
+        <w:drawing>
+          <wp:inline distT="0" distB="0" distL="0" distR="0" wp14:anchorId="3793CAA8" wp14:editId="3494D589">
+            <wp:extent cx="3965944" cy="3606596"/>
+            <wp:effectExtent l="0" t="0" r="0" b="0"/>
+            <wp:docPr id="25" name="Imagem 25" descr="Interface gráfica do usuário, Texto&#10;&#10;Descrição gerada automaticamente"/>
+            <wp:cNvGraphicFramePr>
+              <a:graphicFrameLocks xmlns:a="http://schemas.openxmlformats.org/drawingml/2006/main" noChangeAspect="1"/>
+            </wp:cNvGraphicFramePr>
+            <a:graphic xmlns:a="http://schemas.openxmlformats.org/drawingml/2006/main">
+              <a:graphicData uri="http://schemas.openxmlformats.org/drawingml/2006/picture">
+                <pic:pic xmlns:pic="http://schemas.openxmlformats.org/drawingml/2006/picture">
+                  <pic:nvPicPr>
+                    <pic:cNvPr id="25" name="Imagem 25" descr="Interface gráfica do usuário, Texto&#10;&#10;Descrição gerada automaticamente"/>
+                    <pic:cNvPicPr/>
+                  </pic:nvPicPr>
+                  <pic:blipFill>
+                    <a:blip r:embed="rId21">
+                      <a:extLst>
+                        <a:ext uri="{28A0092B-C50C-407E-A947-70E740481C1C}">
+                          <a14:useLocalDpi xmlns:a14="http://schemas.microsoft.com/office/drawing/2010/main" val="0"/>
+                        </a:ext>
+                      </a:extLst>
+                    </a:blip>
+                    <a:stretch>
+                      <a:fillRect/>
+                    </a:stretch>
+                  </pic:blipFill>
+                  <pic:spPr>
+                    <a:xfrm>
+                      <a:off x="0" y="0"/>
+                      <a:ext cx="3972092" cy="3612187"/>
+                    </a:xfrm>
+                    <a:prstGeom prst="rect">
+                      <a:avLst/>
+                    </a:prstGeom>
+                  </pic:spPr>
+                </pic:pic>
+              </a:graphicData>
+            </a:graphic>
+          </wp:inline>
+        </w:drawing>
+      </w:r>
+    </w:p>
+    <w:p>
+      <w:pPr>
+        <w:pStyle w:val="Legenda"/>
+        <w:spacing w:before="0" w:after="0" w:line="240" w:lineRule="auto"/>
+        <w:rPr>
+          <w:b w:val="0"/>
+          <w:bCs w:val="0"/>
+          <w:sz w:val="24"/>
+          <w:szCs w:val="24"/>
+        </w:rPr>
+      </w:pPr>
+      <w:r>
+        <w:rPr>
+          <w:sz w:val="24"/>
+          <w:szCs w:val="24"/>
+        </w:rPr>
+        <w:t xml:space="preserve">Fonte: </w:t>
+      </w:r>
+      <w:r>
+        <w:rPr>
+          <w:b w:val="0"/>
+          <w:bCs w:val="0"/>
+          <w:sz w:val="24"/>
+          <w:szCs w:val="24"/>
+        </w:rPr>
+        <w:t>O autor</w:t>
+      </w:r>
+    </w:p>
+    <w:p>
+      <w:pPr>
+        <w:ind w:firstLine="0"/>
+      </w:pPr>
+    </w:p>
+    <w:p>
+      <w:pPr>
+        <w:pStyle w:val="Legenda"/>
+        <w:rPr>
+          <w:sz w:val="24"/>
+          <w:szCs w:val="24"/>
+        </w:rPr>
+      </w:pPr>
+      <w:r>
+        <w:rPr>
+          <w:sz w:val="24"/>
+          <w:szCs w:val="24"/>
+        </w:rPr>
+        <w:t xml:space="preserve">Figura </w:t>
+      </w:r>
+      <w:r>
+        <w:rPr>
+          <w:sz w:val="24"/>
+          <w:szCs w:val="24"/>
+        </w:rPr>
+        <w:fldChar w:fldCharType="begin"/>
+      </w:r>
+      <w:r>
+        <w:rPr>
+          <w:sz w:val="24"/>
+          <w:szCs w:val="24"/>
+        </w:rPr>
+        <w:instrText xml:space="preserve"> SEQ Figura \* ARABIC </w:instrText>
+      </w:r>
+      <w:r>
+        <w:rPr>
+          <w:sz w:val="24"/>
+          <w:szCs w:val="24"/>
+        </w:rPr>
+        <w:fldChar w:fldCharType="separate"/>
+      </w:r>
+      <w:r>
+        <w:rPr>
+          <w:noProof/>
+          <w:sz w:val="24"/>
+          <w:szCs w:val="24"/>
+        </w:rPr>
+        <w:t>14</w:t>
+      </w:r>
+      <w:r>
+        <w:rPr>
+          <w:sz w:val="24"/>
+          <w:szCs w:val="24"/>
+        </w:rPr>
+        <w:fldChar w:fldCharType="end"/>
+      </w:r>
+      <w:r>
+        <w:rPr>
+          <w:sz w:val="24"/>
+          <w:szCs w:val="24"/>
+        </w:rPr>
+        <w:t xml:space="preserve"> - </w:t>
+      </w:r>
+      <w:r>
+        <w:rPr>
+          <w:b w:val="0"/>
+          <w:bCs w:val="0"/>
+          <w:sz w:val="24"/>
+          <w:szCs w:val="24"/>
+        </w:rPr>
+        <w:t>MetodosTeste()</w:t>
+      </w:r>
+    </w:p>
+    <w:p>
+      <w:pPr>
+        <w:ind w:firstLine="0"/>
+        <w:jc w:val="center"/>
+      </w:pPr>
+      <w:r>
+        <w:rPr>
+          <w:noProof/>
+        </w:rPr>
+        <w:drawing>
+          <wp:inline distT="0" distB="0" distL="0" distR="0" wp14:anchorId="7AF79C07" wp14:editId="38FD988F">
+            <wp:extent cx="4029739" cy="3173331"/>
+            <wp:effectExtent l="0" t="0" r="8890" b="8255"/>
+            <wp:docPr id="26" name="Imagem 26" descr="Texto&#10;&#10;Descrição gerada automaticamente"/>
+            <wp:cNvGraphicFramePr>
+              <a:graphicFrameLocks xmlns:a="http://schemas.openxmlformats.org/drawingml/2006/main" noChangeAspect="1"/>
+            </wp:cNvGraphicFramePr>
+            <a:graphic xmlns:a="http://schemas.openxmlformats.org/drawingml/2006/main">
+              <a:graphicData uri="http://schemas.openxmlformats.org/drawingml/2006/picture">
+                <pic:pic xmlns:pic="http://schemas.openxmlformats.org/drawingml/2006/picture">
+                  <pic:nvPicPr>
+                    <pic:cNvPr id="26" name="Imagem 26" descr="Texto&#10;&#10;Descrição gerada automaticamente"/>
+                    <pic:cNvPicPr/>
+                  </pic:nvPicPr>
+                  <pic:blipFill>
+                    <a:blip r:embed="rId22">
+                      <a:extLst>
+                        <a:ext uri="{28A0092B-C50C-407E-A947-70E740481C1C}">
+                          <a14:useLocalDpi xmlns:a14="http://schemas.microsoft.com/office/drawing/2010/main" val="0"/>
+                        </a:ext>
+                      </a:extLst>
+                    </a:blip>
+                    <a:stretch>
+                      <a:fillRect/>
+                    </a:stretch>
+                  </pic:blipFill>
+                  <pic:spPr>
+                    <a:xfrm>
+                      <a:off x="0" y="0"/>
+                      <a:ext cx="4033329" cy="3176158"/>
+                    </a:xfrm>
+                    <a:prstGeom prst="rect">
+                      <a:avLst/>
+                    </a:prstGeom>
+                  </pic:spPr>
+                </pic:pic>
+              </a:graphicData>
+            </a:graphic>
+          </wp:inline>
+        </w:drawing>
+      </w:r>
+    </w:p>
+    <w:p>
+      <w:pPr>
+        <w:pStyle w:val="Legenda"/>
+        <w:spacing w:before="0" w:after="0" w:line="240" w:lineRule="auto"/>
+        <w:rPr>
+          <w:b w:val="0"/>
+          <w:bCs w:val="0"/>
+          <w:sz w:val="24"/>
+          <w:szCs w:val="24"/>
+        </w:rPr>
+      </w:pPr>
+      <w:r>
+        <w:rPr>
+          <w:sz w:val="24"/>
+          <w:szCs w:val="24"/>
+        </w:rPr>
+        <w:t xml:space="preserve">Fonte: </w:t>
+      </w:r>
+      <w:r>
+        <w:rPr>
+          <w:b w:val="0"/>
+          <w:bCs w:val="0"/>
+          <w:sz w:val="24"/>
+          <w:szCs w:val="24"/>
+        </w:rPr>
+        <w:t>O autor</w:t>
+      </w:r>
+    </w:p>
+    <w:p/>
+    <w:p>
+      <w:pPr>
+        <w:pStyle w:val="Legenda"/>
+        <w:rPr>
+          <w:sz w:val="24"/>
+          <w:szCs w:val="24"/>
+        </w:rPr>
+      </w:pPr>
+      <w:r>
+        <w:rPr>
+          <w:sz w:val="24"/>
+          <w:szCs w:val="24"/>
+        </w:rPr>
+        <w:lastRenderedPageBreak/>
+        <w:t xml:space="preserve">Figura </w:t>
+      </w:r>
+      <w:r>
+        <w:rPr>
+          <w:sz w:val="24"/>
+          <w:szCs w:val="24"/>
+        </w:rPr>
+        <w:fldChar w:fldCharType="begin"/>
+      </w:r>
+      <w:r>
+        <w:rPr>
+          <w:sz w:val="24"/>
+          <w:szCs w:val="24"/>
+        </w:rPr>
+        <w:instrText xml:space="preserve"> SEQ Figura \* ARABIC </w:instrText>
+      </w:r>
+      <w:r>
+        <w:rPr>
+          <w:sz w:val="24"/>
+          <w:szCs w:val="24"/>
+        </w:rPr>
+        <w:fldChar w:fldCharType="separate"/>
+      </w:r>
+      <w:r>
+        <w:rPr>
+          <w:noProof/>
+          <w:sz w:val="24"/>
+          <w:szCs w:val="24"/>
+        </w:rPr>
+        <w:t>15</w:t>
+      </w:r>
+      <w:r>
+        <w:rPr>
+          <w:sz w:val="24"/>
+          <w:szCs w:val="24"/>
+        </w:rPr>
+        <w:fldChar w:fldCharType="end"/>
+      </w:r>
+      <w:r>
+        <w:rPr>
+          <w:sz w:val="24"/>
+          <w:szCs w:val="24"/>
+        </w:rPr>
+        <w:t xml:space="preserve"> - </w:t>
+      </w:r>
+      <w:r>
+        <w:rPr>
+          <w:b w:val="0"/>
+          <w:bCs w:val="0"/>
+          <w:sz w:val="24"/>
+          <w:szCs w:val="24"/>
+        </w:rPr>
+        <w:t>MetodosTeste()</w:t>
+      </w:r>
+    </w:p>
+    <w:p>
+      <w:r>
+        <w:rPr>
+          <w:noProof/>
+        </w:rPr>
+        <w:drawing>
+          <wp:inline distT="0" distB="0" distL="0" distR="0" wp14:anchorId="429779B3" wp14:editId="256EE454">
+            <wp:extent cx="5125165" cy="3505689"/>
+            <wp:effectExtent l="0" t="0" r="0" b="0"/>
+            <wp:docPr id="27" name="Imagem 27" descr="Texto&#10;&#10;Descrição gerada automaticamente"/>
+            <wp:cNvGraphicFramePr>
+              <a:graphicFrameLocks xmlns:a="http://schemas.openxmlformats.org/drawingml/2006/main" noChangeAspect="1"/>
+            </wp:cNvGraphicFramePr>
+            <a:graphic xmlns:a="http://schemas.openxmlformats.org/drawingml/2006/main">
+              <a:graphicData uri="http://schemas.openxmlformats.org/drawingml/2006/picture">
+                <pic:pic xmlns:pic="http://schemas.openxmlformats.org/drawingml/2006/picture">
+                  <pic:nvPicPr>
+                    <pic:cNvPr id="27" name="Imagem 27" descr="Texto&#10;&#10;Descrição gerada automaticamente"/>
+                    <pic:cNvPicPr/>
+                  </pic:nvPicPr>
+                  <pic:blipFill>
+                    <a:blip r:embed="rId23">
+                      <a:extLst>
+                        <a:ext uri="{28A0092B-C50C-407E-A947-70E740481C1C}">
+                          <a14:useLocalDpi xmlns:a14="http://schemas.microsoft.com/office/drawing/2010/main" val="0"/>
+                        </a:ext>
+                      </a:extLst>
+                    </a:blip>
+                    <a:stretch>
+                      <a:fillRect/>
+                    </a:stretch>
+                  </pic:blipFill>
+                  <pic:spPr>
+                    <a:xfrm>
+                      <a:off x="0" y="0"/>
+                      <a:ext cx="5125165" cy="3505689"/>
+                    </a:xfrm>
+                    <a:prstGeom prst="rect">
+                      <a:avLst/>
+                    </a:prstGeom>
+                  </pic:spPr>
+                </pic:pic>
+              </a:graphicData>
+            </a:graphic>
+          </wp:inline>
+        </w:drawing>
+      </w:r>
+    </w:p>
+    <w:p>
+      <w:pPr>
+        <w:pStyle w:val="Legenda"/>
+        <w:spacing w:before="0" w:after="0" w:line="240" w:lineRule="auto"/>
+        <w:rPr>
+          <w:b w:val="0"/>
+          <w:bCs w:val="0"/>
+          <w:sz w:val="24"/>
+          <w:szCs w:val="24"/>
+        </w:rPr>
+      </w:pPr>
+      <w:r>
+        <w:rPr>
+          <w:sz w:val="24"/>
+          <w:szCs w:val="24"/>
+        </w:rPr>
+        <w:t xml:space="preserve">Fonte: </w:t>
+      </w:r>
+      <w:r>
+        <w:rPr>
+          <w:b w:val="0"/>
+          <w:bCs w:val="0"/>
+          <w:sz w:val="24"/>
+          <w:szCs w:val="24"/>
+        </w:rPr>
+        <w:t>O autor</w:t>
+      </w:r>
+    </w:p>
+    <w:p/>
+    <w:p>
+      <w:pPr>
+        <w:pStyle w:val="Legenda"/>
+        <w:rPr>
+          <w:sz w:val="24"/>
+          <w:szCs w:val="24"/>
+        </w:rPr>
+      </w:pPr>
+      <w:r>
+        <w:rPr>
+          <w:sz w:val="24"/>
+          <w:szCs w:val="24"/>
+        </w:rPr>
+        <w:t xml:space="preserve">Figura </w:t>
+      </w:r>
+      <w:r>
+        <w:rPr>
+          <w:sz w:val="24"/>
+          <w:szCs w:val="24"/>
+        </w:rPr>
+        <w:fldChar w:fldCharType="begin"/>
+      </w:r>
+      <w:r>
+        <w:rPr>
+          <w:sz w:val="24"/>
+          <w:szCs w:val="24"/>
+        </w:rPr>
+        <w:instrText xml:space="preserve"> SEQ Figura \* ARABIC </w:instrText>
+      </w:r>
+      <w:r>
+        <w:rPr>
+          <w:sz w:val="24"/>
+          <w:szCs w:val="24"/>
+        </w:rPr>
+        <w:fldChar w:fldCharType="separate"/>
+      </w:r>
+      <w:r>
+        <w:rPr>
+          <w:noProof/>
+          <w:sz w:val="24"/>
+          <w:szCs w:val="24"/>
+        </w:rPr>
+        <w:t>16</w:t>
+      </w:r>
+      <w:r>
+        <w:rPr>
+          <w:sz w:val="24"/>
+          <w:szCs w:val="24"/>
+        </w:rPr>
+        <w:fldChar w:fldCharType="end"/>
+      </w:r>
+      <w:r>
+        <w:rPr>
+          <w:sz w:val="24"/>
+          <w:szCs w:val="24"/>
+        </w:rPr>
+        <w:t xml:space="preserve"> - </w:t>
+      </w:r>
+      <w:r>
+        <w:rPr>
+          <w:b w:val="0"/>
+          <w:bCs w:val="0"/>
+          <w:sz w:val="24"/>
+          <w:szCs w:val="24"/>
+        </w:rPr>
+        <w:t>MetodosTeste()</w:t>
+      </w:r>
+    </w:p>
+    <w:p>
+      <w:pPr>
+        <w:ind w:firstLine="0"/>
+        <w:jc w:val="center"/>
+      </w:pPr>
+      <w:r>
+        <w:rPr>
+          <w:noProof/>
+        </w:rPr>
+        <w:drawing>
+          <wp:inline distT="0" distB="0" distL="0" distR="0" wp14:anchorId="14BF2FA7" wp14:editId="46F632C4">
+            <wp:extent cx="5760720" cy="2250440"/>
+            <wp:effectExtent l="0" t="0" r="0" b="0"/>
+            <wp:docPr id="28" name="Imagem 28" descr="Texto&#10;&#10;Descrição gerada automaticamente"/>
+            <wp:cNvGraphicFramePr>
+              <a:graphicFrameLocks xmlns:a="http://schemas.openxmlformats.org/drawingml/2006/main" noChangeAspect="1"/>
+            </wp:cNvGraphicFramePr>
+            <a:graphic xmlns:a="http://schemas.openxmlformats.org/drawingml/2006/main">
+              <a:graphicData uri="http://schemas.openxmlformats.org/drawingml/2006/picture">
+                <pic:pic xmlns:pic="http://schemas.openxmlformats.org/drawingml/2006/picture">
+                  <pic:nvPicPr>
+                    <pic:cNvPr id="28" name="Imagem 28" descr="Texto&#10;&#10;Descrição gerada automaticamente"/>
+                    <pic:cNvPicPr/>
+                  </pic:nvPicPr>
+                  <pic:blipFill>
+                    <a:blip r:embed="rId24">
+                      <a:extLst>
+                        <a:ext uri="{28A0092B-C50C-407E-A947-70E740481C1C}">
+                          <a14:useLocalDpi xmlns:a14="http://schemas.microsoft.com/office/drawing/2010/main" val="0"/>
+                        </a:ext>
+                      </a:extLst>
+                    </a:blip>
+                    <a:stretch>
+                      <a:fillRect/>
+                    </a:stretch>
+                  </pic:blipFill>
+                  <pic:spPr>
+                    <a:xfrm>
+                      <a:off x="0" y="0"/>
+                      <a:ext cx="5760720" cy="2250440"/>
+                    </a:xfrm>
+                    <a:prstGeom prst="rect">
+                      <a:avLst/>
+                    </a:prstGeom>
+                  </pic:spPr>
+                </pic:pic>
+              </a:graphicData>
+            </a:graphic>
+          </wp:inline>
+        </w:drawing>
+      </w:r>
+    </w:p>
+    <w:p>
+      <w:pPr>
+        <w:pStyle w:val="Legenda"/>
+        <w:spacing w:before="0" w:after="0" w:line="240" w:lineRule="auto"/>
+        <w:rPr>
+          <w:b w:val="0"/>
+          <w:bCs w:val="0"/>
+          <w:sz w:val="24"/>
+          <w:szCs w:val="24"/>
+        </w:rPr>
+      </w:pPr>
+      <w:r>
+        <w:rPr>
+          <w:sz w:val="24"/>
+          <w:szCs w:val="24"/>
+        </w:rPr>
+        <w:t xml:space="preserve">Fonte: </w:t>
+      </w:r>
+      <w:r>
+        <w:rPr>
+          <w:b w:val="0"/>
+          <w:bCs w:val="0"/>
+          <w:sz w:val="24"/>
+          <w:szCs w:val="24"/>
+        </w:rPr>
+        <w:t>O autor</w:t>
+      </w:r>
+    </w:p>
     <w:p/>
     <w:p/>
     <w:p/>
     <w:p/>
     <w:p/>
+    <w:p>
+      <w:pPr>
+        <w:pStyle w:val="Ttulo3"/>
+      </w:pPr>
+      <w:r>
+        <w:lastRenderedPageBreak/>
+        <w:t xml:space="preserve">O sistema </w:t>
+      </w:r>
+    </w:p>
+    <w:p>
+      <w:r>
+        <w:t>As Figuras abaixo apresentam o sistema final, disponibilizado para uso em diversos sistemas. As Figuras 1</w:t>
+      </w:r>
+      <w:r>
+        <w:t>7</w:t>
+      </w:r>
+      <w:r>
+        <w:t xml:space="preserve"> e 1</w:t>
+      </w:r>
+      <w:r>
+        <w:t>8</w:t>
+      </w:r>
+      <w:r>
+        <w:t xml:space="preserve"> apresentam a tela inicial do sistema sem e com dados no banco. A</w:t>
+      </w:r>
+      <w:r>
+        <w:t xml:space="preserve"> Figura 1</w:t>
+      </w:r>
+      <w:r>
+        <w:t>9</w:t>
+      </w:r>
+      <w:r>
+        <w:t xml:space="preserve"> apresenta a tela de cadastro de um novo caso de teste e as Figuras </w:t>
+      </w:r>
+      <w:r>
+        <w:t>20</w:t>
+      </w:r>
+      <w:r>
+        <w:t xml:space="preserve"> e </w:t>
+      </w:r>
+      <w:r>
+        <w:t>21</w:t>
+      </w:r>
+      <w:r>
+        <w:t xml:space="preserve"> apresenta a seleção de uma ação e um elemento. A Figura </w:t>
+      </w:r>
+      <w:r>
+        <w:t>22</w:t>
+      </w:r>
+      <w:r>
+        <w:t xml:space="preserve"> apresenta a tabela de ações cadastradas pelo usuário e a Figura </w:t>
+      </w:r>
+      <w:r>
+        <w:t>23</w:t>
+      </w:r>
+      <w:r>
+        <w:t xml:space="preserve"> apresenta o load na tela, aguardando o resultado da execução. Finalmente, as Figuras </w:t>
+      </w:r>
+      <w:r>
+        <w:t>24</w:t>
+      </w:r>
+      <w:r>
+        <w:t xml:space="preserve"> e </w:t>
+      </w:r>
+      <w:r>
+        <w:t>25</w:t>
+      </w:r>
+      <w:r>
+        <w:t xml:space="preserve"> apresentam o resultado exibido para o usuário, sendo Sucesso na Figura </w:t>
+      </w:r>
+      <w:r>
+        <w:t>24</w:t>
+      </w:r>
+      <w:r>
+        <w:t xml:space="preserve"> e Erro na Figura </w:t>
+      </w:r>
+      <w:r>
+        <w:t>25</w:t>
+      </w:r>
+      <w:r>
+        <w:t xml:space="preserve">. </w:t>
+      </w:r>
+    </w:p>
+    <w:p>
+      <w:pPr>
+        <w:pStyle w:val="Legenda"/>
+        <w:rPr>
+          <w:sz w:val="24"/>
+          <w:szCs w:val="24"/>
+        </w:rPr>
+      </w:pPr>
+      <w:r>
+        <w:rPr>
+          <w:sz w:val="24"/>
+          <w:szCs w:val="24"/>
+        </w:rPr>
+        <w:t xml:space="preserve">Figura </w:t>
+      </w:r>
+      <w:r>
+        <w:rPr>
+          <w:sz w:val="24"/>
+          <w:szCs w:val="24"/>
+        </w:rPr>
+        <w:fldChar w:fldCharType="begin"/>
+      </w:r>
+      <w:r>
+        <w:rPr>
+          <w:sz w:val="24"/>
+          <w:szCs w:val="24"/>
+        </w:rPr>
+        <w:instrText xml:space="preserve"> SEQ Figura \* ARABIC </w:instrText>
+      </w:r>
+      <w:r>
+        <w:rPr>
+          <w:sz w:val="24"/>
+          <w:szCs w:val="24"/>
+        </w:rPr>
+        <w:fldChar w:fldCharType="separate"/>
+      </w:r>
+      <w:r>
+        <w:rPr>
+          <w:noProof/>
+          <w:sz w:val="24"/>
+          <w:szCs w:val="24"/>
+        </w:rPr>
+        <w:t>17</w:t>
+      </w:r>
+      <w:r>
+        <w:rPr>
+          <w:sz w:val="24"/>
+          <w:szCs w:val="24"/>
+        </w:rPr>
+        <w:fldChar w:fldCharType="end"/>
+      </w:r>
+      <w:r>
+        <w:rPr>
+          <w:sz w:val="24"/>
+          <w:szCs w:val="24"/>
+        </w:rPr>
+        <w:t xml:space="preserve"> </w:t>
+      </w:r>
+      <w:r>
+        <w:rPr>
+          <w:sz w:val="24"/>
+          <w:szCs w:val="24"/>
+        </w:rPr>
+        <w:t>–</w:t>
+      </w:r>
+      <w:r>
+        <w:rPr>
+          <w:sz w:val="24"/>
+          <w:szCs w:val="24"/>
+        </w:rPr>
+        <w:t xml:space="preserve"> </w:t>
+      </w:r>
+      <w:r>
+        <w:rPr>
+          <w:b w:val="0"/>
+          <w:bCs w:val="0"/>
+          <w:sz w:val="24"/>
+          <w:szCs w:val="24"/>
+        </w:rPr>
+        <w:t>Tela Inicial sem Dados</w:t>
+      </w:r>
+    </w:p>
+    <w:p>
+      <w:pPr>
+        <w:ind w:firstLine="0"/>
+      </w:pPr>
+      <w:r>
+        <w:rPr>
+          <w:noProof/>
+        </w:rPr>
+        <w:drawing>
+          <wp:inline distT="0" distB="0" distL="0" distR="0" wp14:anchorId="7D2E4132" wp14:editId="36EE9366">
+            <wp:extent cx="5760720" cy="2633345"/>
+            <wp:effectExtent l="0" t="0" r="0" b="0"/>
+            <wp:docPr id="1" name="Imagem 1" descr="Interface gráfica do usuário, Aplicativo, Word&#10;&#10;Descrição gerada automaticamente"/>
+            <wp:cNvGraphicFramePr>
+              <a:graphicFrameLocks xmlns:a="http://schemas.openxmlformats.org/drawingml/2006/main" noChangeAspect="1"/>
+            </wp:cNvGraphicFramePr>
+            <a:graphic xmlns:a="http://schemas.openxmlformats.org/drawingml/2006/main">
+              <a:graphicData uri="http://schemas.openxmlformats.org/drawingml/2006/picture">
+                <pic:pic xmlns:pic="http://schemas.openxmlformats.org/drawingml/2006/picture">
+                  <pic:nvPicPr>
+                    <pic:cNvPr id="1" name="Imagem 1" descr="Interface gráfica do usuário, Aplicativo, Word&#10;&#10;Descrição gerada automaticamente"/>
+                    <pic:cNvPicPr/>
+                  </pic:nvPicPr>
+                  <pic:blipFill>
+                    <a:blip r:embed="rId25">
+                      <a:extLst>
+                        <a:ext uri="{28A0092B-C50C-407E-A947-70E740481C1C}">
+                          <a14:useLocalDpi xmlns:a14="http://schemas.microsoft.com/office/drawing/2010/main" val="0"/>
+                        </a:ext>
+                      </a:extLst>
+                    </a:blip>
+                    <a:stretch>
+                      <a:fillRect/>
+                    </a:stretch>
+                  </pic:blipFill>
+                  <pic:spPr>
+                    <a:xfrm>
+                      <a:off x="0" y="0"/>
+                      <a:ext cx="5760720" cy="2633345"/>
+                    </a:xfrm>
+                    <a:prstGeom prst="rect">
+                      <a:avLst/>
+                    </a:prstGeom>
+                  </pic:spPr>
+                </pic:pic>
+              </a:graphicData>
+            </a:graphic>
+          </wp:inline>
+        </w:drawing>
+      </w:r>
+    </w:p>
+    <w:p>
+      <w:pPr>
+        <w:pStyle w:val="Legenda"/>
+        <w:spacing w:before="0" w:after="0" w:line="240" w:lineRule="auto"/>
+        <w:rPr>
+          <w:b w:val="0"/>
+          <w:bCs w:val="0"/>
+          <w:sz w:val="24"/>
+          <w:szCs w:val="24"/>
+        </w:rPr>
+      </w:pPr>
+      <w:r>
+        <w:rPr>
+          <w:sz w:val="24"/>
+          <w:szCs w:val="24"/>
+        </w:rPr>
+        <w:t xml:space="preserve">Fonte: </w:t>
+      </w:r>
+      <w:r>
+        <w:rPr>
+          <w:b w:val="0"/>
+          <w:bCs w:val="0"/>
+          <w:sz w:val="24"/>
+          <w:szCs w:val="24"/>
+        </w:rPr>
+        <w:t>O autor</w:t>
+      </w:r>
+    </w:p>
+    <w:p>
+      <w:pPr>
+        <w:ind w:firstLine="0"/>
+      </w:pPr>
+    </w:p>
+    <w:p>
+      <w:pPr>
+        <w:ind w:firstLine="0"/>
+      </w:pPr>
+    </w:p>
+    <w:p>
+      <w:pPr>
+        <w:ind w:firstLine="0"/>
+      </w:pPr>
+    </w:p>
+    <w:p>
+      <w:pPr>
+        <w:ind w:firstLine="0"/>
+      </w:pPr>
+    </w:p>
+    <w:p>
+      <w:pPr>
+        <w:ind w:firstLine="0"/>
+      </w:pPr>
+    </w:p>
+    <w:p>
+      <w:pPr>
+        <w:ind w:firstLine="0"/>
+      </w:pPr>
+    </w:p>
+    <w:p>
+      <w:pPr>
+        <w:ind w:firstLine="0"/>
+      </w:pPr>
+    </w:p>
+    <w:p>
+      <w:pPr>
+        <w:ind w:firstLine="0"/>
+      </w:pPr>
+    </w:p>
+    <w:p>
+      <w:pPr>
+        <w:ind w:firstLine="0"/>
+      </w:pPr>
+    </w:p>
+    <w:p>
+      <w:pPr>
+        <w:ind w:firstLine="0"/>
+      </w:pPr>
+    </w:p>
+    <w:p>
+      <w:pPr>
+        <w:ind w:firstLine="0"/>
+      </w:pPr>
+    </w:p>
+    <w:p>
+      <w:pPr>
+        <w:ind w:firstLine="0"/>
+      </w:pPr>
+    </w:p>
+    <w:p>
+      <w:pPr>
+        <w:pStyle w:val="Legenda"/>
+        <w:rPr>
+          <w:sz w:val="24"/>
+          <w:szCs w:val="24"/>
+        </w:rPr>
+      </w:pPr>
+      <w:r>
+        <w:rPr>
+          <w:sz w:val="24"/>
+          <w:szCs w:val="24"/>
+        </w:rPr>
+        <w:lastRenderedPageBreak/>
+        <w:t xml:space="preserve">Figura </w:t>
+      </w:r>
+      <w:r>
+        <w:rPr>
+          <w:sz w:val="24"/>
+          <w:szCs w:val="24"/>
+        </w:rPr>
+        <w:fldChar w:fldCharType="begin"/>
+      </w:r>
+      <w:r>
+        <w:rPr>
+          <w:sz w:val="24"/>
+          <w:szCs w:val="24"/>
+        </w:rPr>
+        <w:instrText xml:space="preserve"> SEQ Figura \* ARABIC </w:instrText>
+      </w:r>
+      <w:r>
+        <w:rPr>
+          <w:sz w:val="24"/>
+          <w:szCs w:val="24"/>
+        </w:rPr>
+        <w:fldChar w:fldCharType="separate"/>
+      </w:r>
+      <w:r>
+        <w:rPr>
+          <w:noProof/>
+          <w:sz w:val="24"/>
+          <w:szCs w:val="24"/>
+        </w:rPr>
+        <w:t>18</w:t>
+      </w:r>
+      <w:r>
+        <w:rPr>
+          <w:sz w:val="24"/>
+          <w:szCs w:val="24"/>
+        </w:rPr>
+        <w:fldChar w:fldCharType="end"/>
+      </w:r>
+      <w:r>
+        <w:rPr>
+          <w:sz w:val="24"/>
+          <w:szCs w:val="24"/>
+        </w:rPr>
+        <w:t xml:space="preserve"> </w:t>
+      </w:r>
+      <w:r>
+        <w:rPr>
+          <w:sz w:val="24"/>
+          <w:szCs w:val="24"/>
+        </w:rPr>
+        <w:t>–</w:t>
+      </w:r>
+      <w:r>
+        <w:rPr>
+          <w:sz w:val="24"/>
+          <w:szCs w:val="24"/>
+        </w:rPr>
+        <w:t xml:space="preserve"> </w:t>
+      </w:r>
+      <w:r>
+        <w:rPr>
+          <w:b w:val="0"/>
+          <w:bCs w:val="0"/>
+          <w:sz w:val="24"/>
+          <w:szCs w:val="24"/>
+        </w:rPr>
+        <w:t>Tela Inicial com Dados</w:t>
+      </w:r>
+    </w:p>
+    <w:p>
+      <w:pPr>
+        <w:ind w:firstLine="0"/>
+      </w:pPr>
+      <w:r>
+        <w:rPr>
+          <w:noProof/>
+        </w:rPr>
+        <w:drawing>
+          <wp:inline distT="0" distB="0" distL="0" distR="0" wp14:anchorId="27E89BFF" wp14:editId="6F2D464B">
+            <wp:extent cx="5760720" cy="2652395"/>
+            <wp:effectExtent l="0" t="0" r="0" b="0"/>
+            <wp:docPr id="2" name="Imagem 2" descr="Interface gráfica do usuário, Texto, Aplicativo&#10;&#10;Descrição gerada automaticamente"/>
+            <wp:cNvGraphicFramePr>
+              <a:graphicFrameLocks xmlns:a="http://schemas.openxmlformats.org/drawingml/2006/main" noChangeAspect="1"/>
+            </wp:cNvGraphicFramePr>
+            <a:graphic xmlns:a="http://schemas.openxmlformats.org/drawingml/2006/main">
+              <a:graphicData uri="http://schemas.openxmlformats.org/drawingml/2006/picture">
+                <pic:pic xmlns:pic="http://schemas.openxmlformats.org/drawingml/2006/picture">
+                  <pic:nvPicPr>
+                    <pic:cNvPr id="2" name="Imagem 2" descr="Interface gráfica do usuário, Texto, Aplicativo&#10;&#10;Descrição gerada automaticamente"/>
+                    <pic:cNvPicPr/>
+                  </pic:nvPicPr>
+                  <pic:blipFill>
+                    <a:blip r:embed="rId26">
+                      <a:extLst>
+                        <a:ext uri="{28A0092B-C50C-407E-A947-70E740481C1C}">
+                          <a14:useLocalDpi xmlns:a14="http://schemas.microsoft.com/office/drawing/2010/main" val="0"/>
+                        </a:ext>
+                      </a:extLst>
+                    </a:blip>
+                    <a:stretch>
+                      <a:fillRect/>
+                    </a:stretch>
+                  </pic:blipFill>
+                  <pic:spPr>
+                    <a:xfrm>
+                      <a:off x="0" y="0"/>
+                      <a:ext cx="5760720" cy="2652395"/>
+                    </a:xfrm>
+                    <a:prstGeom prst="rect">
+                      <a:avLst/>
+                    </a:prstGeom>
+                  </pic:spPr>
+                </pic:pic>
+              </a:graphicData>
+            </a:graphic>
+          </wp:inline>
+        </w:drawing>
+      </w:r>
+    </w:p>
+    <w:p>
+      <w:pPr>
+        <w:pStyle w:val="Legenda"/>
+        <w:spacing w:before="0" w:after="0" w:line="240" w:lineRule="auto"/>
+        <w:rPr>
+          <w:b w:val="0"/>
+          <w:bCs w:val="0"/>
+          <w:sz w:val="24"/>
+          <w:szCs w:val="24"/>
+        </w:rPr>
+      </w:pPr>
+      <w:r>
+        <w:rPr>
+          <w:sz w:val="24"/>
+          <w:szCs w:val="24"/>
+        </w:rPr>
+        <w:t xml:space="preserve">Fonte: </w:t>
+      </w:r>
+      <w:r>
+        <w:rPr>
+          <w:b w:val="0"/>
+          <w:bCs w:val="0"/>
+          <w:sz w:val="24"/>
+          <w:szCs w:val="24"/>
+        </w:rPr>
+        <w:t>O autor</w:t>
+      </w:r>
+    </w:p>
+    <w:p>
+      <w:pPr>
+        <w:pStyle w:val="Legenda"/>
+        <w:rPr>
+          <w:sz w:val="24"/>
+          <w:szCs w:val="24"/>
+        </w:rPr>
+      </w:pPr>
+    </w:p>
+    <w:p>
+      <w:pPr>
+        <w:pStyle w:val="Legenda"/>
+        <w:rPr>
+          <w:sz w:val="24"/>
+          <w:szCs w:val="24"/>
+        </w:rPr>
+      </w:pPr>
+      <w:r>
+        <w:rPr>
+          <w:sz w:val="24"/>
+          <w:szCs w:val="24"/>
+        </w:rPr>
+        <w:t xml:space="preserve">Figura </w:t>
+      </w:r>
+      <w:r>
+        <w:rPr>
+          <w:sz w:val="24"/>
+          <w:szCs w:val="24"/>
+        </w:rPr>
+        <w:fldChar w:fldCharType="begin"/>
+      </w:r>
+      <w:r>
+        <w:rPr>
+          <w:sz w:val="24"/>
+          <w:szCs w:val="24"/>
+        </w:rPr>
+        <w:instrText xml:space="preserve"> SEQ Figura \* ARABIC </w:instrText>
+      </w:r>
+      <w:r>
+        <w:rPr>
+          <w:sz w:val="24"/>
+          <w:szCs w:val="24"/>
+        </w:rPr>
+        <w:fldChar w:fldCharType="separate"/>
+      </w:r>
+      <w:r>
+        <w:rPr>
+          <w:noProof/>
+          <w:sz w:val="24"/>
+          <w:szCs w:val="24"/>
+        </w:rPr>
+        <w:t>19</w:t>
+      </w:r>
+      <w:r>
+        <w:rPr>
+          <w:sz w:val="24"/>
+          <w:szCs w:val="24"/>
+        </w:rPr>
+        <w:fldChar w:fldCharType="end"/>
+      </w:r>
+      <w:r>
+        <w:rPr>
+          <w:sz w:val="24"/>
+          <w:szCs w:val="24"/>
+        </w:rPr>
+        <w:t xml:space="preserve"> </w:t>
+      </w:r>
+      <w:r>
+        <w:rPr>
+          <w:sz w:val="24"/>
+          <w:szCs w:val="24"/>
+        </w:rPr>
+        <w:t>–</w:t>
+      </w:r>
+      <w:r>
+        <w:rPr>
+          <w:sz w:val="24"/>
+          <w:szCs w:val="24"/>
+        </w:rPr>
+        <w:t xml:space="preserve"> </w:t>
+      </w:r>
+      <w:r>
+        <w:rPr>
+          <w:b w:val="0"/>
+          <w:bCs w:val="0"/>
+          <w:sz w:val="24"/>
+          <w:szCs w:val="24"/>
+        </w:rPr>
+        <w:t>Tela Inserir Caso de Teste</w:t>
+      </w:r>
+    </w:p>
+    <w:p>
+      <w:pPr>
+        <w:ind w:firstLine="0"/>
+      </w:pPr>
+      <w:r>
+        <w:rPr>
+          <w:noProof/>
+        </w:rPr>
+        <w:drawing>
+          <wp:inline distT="0" distB="0" distL="0" distR="0" wp14:anchorId="43E365F8" wp14:editId="23C24712">
+            <wp:extent cx="5760720" cy="2588260"/>
+            <wp:effectExtent l="0" t="0" r="0" b="2540"/>
+            <wp:docPr id="5" name="Imagem 5" descr="Interface gráfica do usuário, Aplicativo&#10;&#10;Descrição gerada automaticamente"/>
+            <wp:cNvGraphicFramePr>
+              <a:graphicFrameLocks xmlns:a="http://schemas.openxmlformats.org/drawingml/2006/main" noChangeAspect="1"/>
+            </wp:cNvGraphicFramePr>
+            <a:graphic xmlns:a="http://schemas.openxmlformats.org/drawingml/2006/main">
+              <a:graphicData uri="http://schemas.openxmlformats.org/drawingml/2006/picture">
+                <pic:pic xmlns:pic="http://schemas.openxmlformats.org/drawingml/2006/picture">
+                  <pic:nvPicPr>
+                    <pic:cNvPr id="5" name="Imagem 5" descr="Interface gráfica do usuário, Aplicativo&#10;&#10;Descrição gerada automaticamente"/>
+                    <pic:cNvPicPr/>
+                  </pic:nvPicPr>
+                  <pic:blipFill>
+                    <a:blip r:embed="rId27">
+                      <a:extLst>
+                        <a:ext uri="{28A0092B-C50C-407E-A947-70E740481C1C}">
+                          <a14:useLocalDpi xmlns:a14="http://schemas.microsoft.com/office/drawing/2010/main" val="0"/>
+                        </a:ext>
+                      </a:extLst>
+                    </a:blip>
+                    <a:stretch>
+                      <a:fillRect/>
+                    </a:stretch>
+                  </pic:blipFill>
+                  <pic:spPr>
+                    <a:xfrm>
+                      <a:off x="0" y="0"/>
+                      <a:ext cx="5760720" cy="2588260"/>
+                    </a:xfrm>
+                    <a:prstGeom prst="rect">
+                      <a:avLst/>
+                    </a:prstGeom>
+                  </pic:spPr>
+                </pic:pic>
+              </a:graphicData>
+            </a:graphic>
+          </wp:inline>
+        </w:drawing>
+      </w:r>
+    </w:p>
+    <w:p>
+      <w:pPr>
+        <w:pStyle w:val="Legenda"/>
+        <w:spacing w:before="0" w:after="0" w:line="240" w:lineRule="auto"/>
+        <w:rPr>
+          <w:b w:val="0"/>
+          <w:bCs w:val="0"/>
+          <w:sz w:val="24"/>
+          <w:szCs w:val="24"/>
+        </w:rPr>
+      </w:pPr>
+      <w:r>
+        <w:rPr>
+          <w:sz w:val="24"/>
+          <w:szCs w:val="24"/>
+        </w:rPr>
+        <w:t xml:space="preserve">Fonte: </w:t>
+      </w:r>
+      <w:r>
+        <w:rPr>
+          <w:b w:val="0"/>
+          <w:bCs w:val="0"/>
+          <w:sz w:val="24"/>
+          <w:szCs w:val="24"/>
+        </w:rPr>
+        <w:t>O autor</w:t>
+      </w:r>
+    </w:p>
+    <w:p>
+      <w:pPr>
+        <w:ind w:firstLine="0"/>
+      </w:pPr>
+    </w:p>
+    <w:p>
+      <w:pPr>
+        <w:ind w:firstLine="0"/>
+      </w:pPr>
+    </w:p>
+    <w:p>
+      <w:pPr>
+        <w:ind w:firstLine="0"/>
+      </w:pPr>
+    </w:p>
+    <w:p>
+      <w:pPr>
+        <w:ind w:firstLine="0"/>
+      </w:pPr>
+    </w:p>
+    <w:p>
+      <w:pPr>
+        <w:ind w:firstLine="0"/>
+      </w:pPr>
+    </w:p>
+    <w:p>
+      <w:pPr>
+        <w:ind w:firstLine="0"/>
+      </w:pPr>
+    </w:p>
+    <w:p>
+      <w:pPr>
+        <w:ind w:firstLine="0"/>
+      </w:pPr>
+    </w:p>
+    <w:p>
+      <w:pPr>
+        <w:pStyle w:val="Legenda"/>
+        <w:rPr>
+          <w:sz w:val="24"/>
+          <w:szCs w:val="24"/>
+        </w:rPr>
+      </w:pPr>
+      <w:r>
+        <w:rPr>
+          <w:sz w:val="24"/>
+          <w:szCs w:val="24"/>
+        </w:rPr>
+        <w:lastRenderedPageBreak/>
+        <w:t xml:space="preserve">Figura </w:t>
+      </w:r>
+      <w:r>
+        <w:rPr>
+          <w:sz w:val="24"/>
+          <w:szCs w:val="24"/>
+        </w:rPr>
+        <w:fldChar w:fldCharType="begin"/>
+      </w:r>
+      <w:r>
+        <w:rPr>
+          <w:sz w:val="24"/>
+          <w:szCs w:val="24"/>
+        </w:rPr>
+        <w:instrText xml:space="preserve"> SEQ Figura \* ARABIC </w:instrText>
+      </w:r>
+      <w:r>
+        <w:rPr>
+          <w:sz w:val="24"/>
+          <w:szCs w:val="24"/>
+        </w:rPr>
+        <w:fldChar w:fldCharType="separate"/>
+      </w:r>
+      <w:r>
+        <w:rPr>
+          <w:noProof/>
+          <w:sz w:val="24"/>
+          <w:szCs w:val="24"/>
+        </w:rPr>
+        <w:t>20</w:t>
+      </w:r>
+      <w:r>
+        <w:rPr>
+          <w:sz w:val="24"/>
+          <w:szCs w:val="24"/>
+        </w:rPr>
+        <w:fldChar w:fldCharType="end"/>
+      </w:r>
+      <w:r>
+        <w:rPr>
+          <w:sz w:val="24"/>
+          <w:szCs w:val="24"/>
+        </w:rPr>
+        <w:t xml:space="preserve"> - </w:t>
+      </w:r>
+      <w:r>
+        <w:rPr>
+          <w:b w:val="0"/>
+          <w:bCs w:val="0"/>
+          <w:sz w:val="24"/>
+          <w:szCs w:val="24"/>
+        </w:rPr>
+        <w:t>Ações</w:t>
+      </w:r>
+    </w:p>
+    <w:p>
+      <w:pPr>
+        <w:ind w:firstLine="0"/>
+      </w:pPr>
+      <w:r>
+        <w:rPr>
+          <w:noProof/>
+        </w:rPr>
+        <w:drawing>
+          <wp:inline distT="0" distB="0" distL="0" distR="0" wp14:anchorId="0B57229B" wp14:editId="77F59782">
+            <wp:extent cx="5760720" cy="1290955"/>
+            <wp:effectExtent l="0" t="0" r="0" b="4445"/>
+            <wp:docPr id="14" name="Imagem 14" descr="Interface gráfica do usuário, Aplicativo&#10;&#10;Descrição gerada automaticamente"/>
+            <wp:cNvGraphicFramePr>
+              <a:graphicFrameLocks xmlns:a="http://schemas.openxmlformats.org/drawingml/2006/main" noChangeAspect="1"/>
+            </wp:cNvGraphicFramePr>
+            <a:graphic xmlns:a="http://schemas.openxmlformats.org/drawingml/2006/main">
+              <a:graphicData uri="http://schemas.openxmlformats.org/drawingml/2006/picture">
+                <pic:pic xmlns:pic="http://schemas.openxmlformats.org/drawingml/2006/picture">
+                  <pic:nvPicPr>
+                    <pic:cNvPr id="14" name="Imagem 14" descr="Interface gráfica do usuário, Aplicativo&#10;&#10;Descrição gerada automaticamente"/>
+                    <pic:cNvPicPr/>
+                  </pic:nvPicPr>
+                  <pic:blipFill>
+                    <a:blip r:embed="rId28">
+                      <a:extLst>
+                        <a:ext uri="{28A0092B-C50C-407E-A947-70E740481C1C}">
+                          <a14:useLocalDpi xmlns:a14="http://schemas.microsoft.com/office/drawing/2010/main" val="0"/>
+                        </a:ext>
+                      </a:extLst>
+                    </a:blip>
+                    <a:stretch>
+                      <a:fillRect/>
+                    </a:stretch>
+                  </pic:blipFill>
+                  <pic:spPr>
+                    <a:xfrm>
+                      <a:off x="0" y="0"/>
+                      <a:ext cx="5760720" cy="1290955"/>
+                    </a:xfrm>
+                    <a:prstGeom prst="rect">
+                      <a:avLst/>
+                    </a:prstGeom>
+                  </pic:spPr>
+                </pic:pic>
+              </a:graphicData>
+            </a:graphic>
+          </wp:inline>
+        </w:drawing>
+      </w:r>
+    </w:p>
+    <w:p>
+      <w:pPr>
+        <w:pStyle w:val="Legenda"/>
+        <w:spacing w:before="0" w:after="0" w:line="240" w:lineRule="auto"/>
+        <w:rPr>
+          <w:b w:val="0"/>
+          <w:bCs w:val="0"/>
+          <w:sz w:val="24"/>
+          <w:szCs w:val="24"/>
+        </w:rPr>
+      </w:pPr>
+      <w:r>
+        <w:rPr>
+          <w:sz w:val="24"/>
+          <w:szCs w:val="24"/>
+        </w:rPr>
+        <w:t xml:space="preserve">Fonte: </w:t>
+      </w:r>
+      <w:r>
+        <w:rPr>
+          <w:b w:val="0"/>
+          <w:bCs w:val="0"/>
+          <w:sz w:val="24"/>
+          <w:szCs w:val="24"/>
+        </w:rPr>
+        <w:t>O autor</w:t>
+      </w:r>
+    </w:p>
+    <w:p>
+      <w:pPr>
+        <w:ind w:firstLine="0"/>
+      </w:pPr>
+    </w:p>
+    <w:p>
+      <w:pPr>
+        <w:pStyle w:val="Legenda"/>
+        <w:rPr>
+          <w:sz w:val="24"/>
+          <w:szCs w:val="24"/>
+        </w:rPr>
+      </w:pPr>
+      <w:r>
+        <w:rPr>
+          <w:sz w:val="24"/>
+          <w:szCs w:val="24"/>
+        </w:rPr>
+        <w:t xml:space="preserve">Figura </w:t>
+      </w:r>
+      <w:r>
+        <w:rPr>
+          <w:sz w:val="24"/>
+          <w:szCs w:val="24"/>
+        </w:rPr>
+        <w:fldChar w:fldCharType="begin"/>
+      </w:r>
+      <w:r>
+        <w:rPr>
+          <w:sz w:val="24"/>
+          <w:szCs w:val="24"/>
+        </w:rPr>
+        <w:instrText xml:space="preserve"> SEQ Figura \* ARABIC </w:instrText>
+      </w:r>
+      <w:r>
+        <w:rPr>
+          <w:sz w:val="24"/>
+          <w:szCs w:val="24"/>
+        </w:rPr>
+        <w:fldChar w:fldCharType="separate"/>
+      </w:r>
+      <w:r>
+        <w:rPr>
+          <w:noProof/>
+          <w:sz w:val="24"/>
+          <w:szCs w:val="24"/>
+        </w:rPr>
+        <w:t>21</w:t>
+      </w:r>
+      <w:r>
+        <w:rPr>
+          <w:sz w:val="24"/>
+          <w:szCs w:val="24"/>
+        </w:rPr>
+        <w:fldChar w:fldCharType="end"/>
+      </w:r>
+      <w:r>
+        <w:rPr>
+          <w:sz w:val="24"/>
+          <w:szCs w:val="24"/>
+        </w:rPr>
+        <w:t xml:space="preserve"> - </w:t>
+      </w:r>
+      <w:r>
+        <w:rPr>
+          <w:b w:val="0"/>
+          <w:bCs w:val="0"/>
+          <w:sz w:val="24"/>
+          <w:szCs w:val="24"/>
+        </w:rPr>
+        <w:t>Elemento</w:t>
+      </w:r>
+    </w:p>
+    <w:p>
+      <w:pPr>
+        <w:ind w:firstLine="0"/>
+      </w:pPr>
+      <w:r>
+        <w:rPr>
+          <w:noProof/>
+        </w:rPr>
+        <w:drawing>
+          <wp:inline distT="0" distB="0" distL="0" distR="0" wp14:anchorId="64278F8E" wp14:editId="1EECA7FF">
+            <wp:extent cx="5760720" cy="1361440"/>
+            <wp:effectExtent l="0" t="0" r="0" b="0"/>
+            <wp:docPr id="15" name="Imagem 15" descr="Interface gráfica do usuário, Aplicativo&#10;&#10;Descrição gerada automaticamente"/>
+            <wp:cNvGraphicFramePr>
+              <a:graphicFrameLocks xmlns:a="http://schemas.openxmlformats.org/drawingml/2006/main" noChangeAspect="1"/>
+            </wp:cNvGraphicFramePr>
+            <a:graphic xmlns:a="http://schemas.openxmlformats.org/drawingml/2006/main">
+              <a:graphicData uri="http://schemas.openxmlformats.org/drawingml/2006/picture">
+                <pic:pic xmlns:pic="http://schemas.openxmlformats.org/drawingml/2006/picture">
+                  <pic:nvPicPr>
+                    <pic:cNvPr id="15" name="Imagem 15" descr="Interface gráfica do usuário, Aplicativo&#10;&#10;Descrição gerada automaticamente"/>
+                    <pic:cNvPicPr/>
+                  </pic:nvPicPr>
+                  <pic:blipFill>
+                    <a:blip r:embed="rId29">
+                      <a:extLst>
+                        <a:ext uri="{28A0092B-C50C-407E-A947-70E740481C1C}">
+                          <a14:useLocalDpi xmlns:a14="http://schemas.microsoft.com/office/drawing/2010/main" val="0"/>
+                        </a:ext>
+                      </a:extLst>
+                    </a:blip>
+                    <a:stretch>
+                      <a:fillRect/>
+                    </a:stretch>
+                  </pic:blipFill>
+                  <pic:spPr>
+                    <a:xfrm>
+                      <a:off x="0" y="0"/>
+                      <a:ext cx="5760720" cy="1361440"/>
+                    </a:xfrm>
+                    <a:prstGeom prst="rect">
+                      <a:avLst/>
+                    </a:prstGeom>
+                  </pic:spPr>
+                </pic:pic>
+              </a:graphicData>
+            </a:graphic>
+          </wp:inline>
+        </w:drawing>
+      </w:r>
+    </w:p>
+    <w:p>
+      <w:pPr>
+        <w:pStyle w:val="Legenda"/>
+        <w:spacing w:before="0" w:after="0" w:line="240" w:lineRule="auto"/>
+        <w:rPr>
+          <w:b w:val="0"/>
+          <w:bCs w:val="0"/>
+          <w:sz w:val="24"/>
+          <w:szCs w:val="24"/>
+        </w:rPr>
+      </w:pPr>
+      <w:r>
+        <w:rPr>
+          <w:sz w:val="24"/>
+          <w:szCs w:val="24"/>
+        </w:rPr>
+        <w:t xml:space="preserve">Fonte: </w:t>
+      </w:r>
+      <w:r>
+        <w:rPr>
+          <w:b w:val="0"/>
+          <w:bCs w:val="0"/>
+          <w:sz w:val="24"/>
+          <w:szCs w:val="24"/>
+        </w:rPr>
+        <w:t>O autor</w:t>
+      </w:r>
+    </w:p>
+    <w:p>
+      <w:pPr>
+        <w:ind w:firstLine="0"/>
+      </w:pPr>
+    </w:p>
+    <w:p>
+      <w:pPr>
+        <w:pStyle w:val="Legenda"/>
+        <w:rPr>
+          <w:sz w:val="24"/>
+          <w:szCs w:val="24"/>
+        </w:rPr>
+      </w:pPr>
+      <w:r>
+        <w:rPr>
+          <w:sz w:val="24"/>
+          <w:szCs w:val="24"/>
+        </w:rPr>
+        <w:t xml:space="preserve">Figura </w:t>
+      </w:r>
+      <w:r>
+        <w:rPr>
+          <w:sz w:val="24"/>
+          <w:szCs w:val="24"/>
+        </w:rPr>
+        <w:fldChar w:fldCharType="begin"/>
+      </w:r>
+      <w:r>
+        <w:rPr>
+          <w:sz w:val="24"/>
+          <w:szCs w:val="24"/>
+        </w:rPr>
+        <w:instrText xml:space="preserve"> SEQ Figura \* ARABIC </w:instrText>
+      </w:r>
+      <w:r>
+        <w:rPr>
+          <w:sz w:val="24"/>
+          <w:szCs w:val="24"/>
+        </w:rPr>
+        <w:fldChar w:fldCharType="separate"/>
+      </w:r>
+      <w:r>
+        <w:rPr>
+          <w:noProof/>
+          <w:sz w:val="24"/>
+          <w:szCs w:val="24"/>
+        </w:rPr>
+        <w:t>22</w:t>
+      </w:r>
+      <w:r>
+        <w:rPr>
+          <w:sz w:val="24"/>
+          <w:szCs w:val="24"/>
+        </w:rPr>
+        <w:fldChar w:fldCharType="end"/>
+      </w:r>
+      <w:r>
+        <w:rPr>
+          <w:sz w:val="24"/>
+          <w:szCs w:val="24"/>
+        </w:rPr>
+        <w:t xml:space="preserve"> - </w:t>
+      </w:r>
+      <w:r>
+        <w:rPr>
+          <w:b w:val="0"/>
+          <w:bCs w:val="0"/>
+          <w:sz w:val="24"/>
+          <w:szCs w:val="24"/>
+        </w:rPr>
+        <w:t>Load</w:t>
+      </w:r>
+    </w:p>
+    <w:p>
+      <w:pPr>
+        <w:ind w:firstLine="0"/>
+      </w:pPr>
+      <w:r>
+        <w:rPr>
+          <w:noProof/>
+        </w:rPr>
+        <w:drawing>
+          <wp:inline distT="0" distB="0" distL="0" distR="0" wp14:anchorId="2F522324" wp14:editId="42DC0F6D">
+            <wp:extent cx="5760720" cy="1724025"/>
+            <wp:effectExtent l="0" t="0" r="0" b="9525"/>
+            <wp:docPr id="16" name="Imagem 16" descr="Interface gráfica do usuário, Aplicativo&#10;&#10;Descrição gerada automaticamente"/>
+            <wp:cNvGraphicFramePr>
+              <a:graphicFrameLocks xmlns:a="http://schemas.openxmlformats.org/drawingml/2006/main" noChangeAspect="1"/>
+            </wp:cNvGraphicFramePr>
+            <a:graphic xmlns:a="http://schemas.openxmlformats.org/drawingml/2006/main">
+              <a:graphicData uri="http://schemas.openxmlformats.org/drawingml/2006/picture">
+                <pic:pic xmlns:pic="http://schemas.openxmlformats.org/drawingml/2006/picture">
+                  <pic:nvPicPr>
+                    <pic:cNvPr id="16" name="Imagem 16" descr="Interface gráfica do usuário, Aplicativo&#10;&#10;Descrição gerada automaticamente"/>
+                    <pic:cNvPicPr/>
+                  </pic:nvPicPr>
+                  <pic:blipFill>
+                    <a:blip r:embed="rId30">
+                      <a:extLst>
+                        <a:ext uri="{28A0092B-C50C-407E-A947-70E740481C1C}">
+                          <a14:useLocalDpi xmlns:a14="http://schemas.microsoft.com/office/drawing/2010/main" val="0"/>
+                        </a:ext>
+                      </a:extLst>
+                    </a:blip>
+                    <a:stretch>
+                      <a:fillRect/>
+                    </a:stretch>
+                  </pic:blipFill>
+                  <pic:spPr>
+                    <a:xfrm>
+                      <a:off x="0" y="0"/>
+                      <a:ext cx="5760720" cy="1724025"/>
+                    </a:xfrm>
+                    <a:prstGeom prst="rect">
+                      <a:avLst/>
+                    </a:prstGeom>
+                  </pic:spPr>
+                </pic:pic>
+              </a:graphicData>
+            </a:graphic>
+          </wp:inline>
+        </w:drawing>
+      </w:r>
+    </w:p>
+    <w:p>
+      <w:pPr>
+        <w:pStyle w:val="Legenda"/>
+        <w:spacing w:before="0" w:after="0" w:line="240" w:lineRule="auto"/>
+        <w:rPr>
+          <w:b w:val="0"/>
+          <w:bCs w:val="0"/>
+          <w:sz w:val="24"/>
+          <w:szCs w:val="24"/>
+        </w:rPr>
+      </w:pPr>
+      <w:r>
+        <w:rPr>
+          <w:sz w:val="24"/>
+          <w:szCs w:val="24"/>
+        </w:rPr>
+        <w:t xml:space="preserve">Fonte: </w:t>
+      </w:r>
+      <w:r>
+        <w:rPr>
+          <w:b w:val="0"/>
+          <w:bCs w:val="0"/>
+          <w:sz w:val="24"/>
+          <w:szCs w:val="24"/>
+        </w:rPr>
+        <w:t>O autor</w:t>
+      </w:r>
+    </w:p>
+    <w:p>
+      <w:pPr>
+        <w:ind w:firstLine="0"/>
+      </w:pPr>
+    </w:p>
+    <w:p>
+      <w:pPr>
+        <w:ind w:firstLine="0"/>
+      </w:pPr>
+    </w:p>
+    <w:p>
+      <w:pPr>
+        <w:ind w:firstLine="0"/>
+      </w:pPr>
+    </w:p>
+    <w:p>
+      <w:pPr>
+        <w:ind w:firstLine="0"/>
+      </w:pPr>
+    </w:p>
+    <w:p>
+      <w:pPr>
+        <w:ind w:firstLine="0"/>
+      </w:pPr>
+    </w:p>
+    <w:p>
+      <w:pPr>
+        <w:ind w:firstLine="0"/>
+      </w:pPr>
+    </w:p>
+    <w:p>
+      <w:pPr>
+        <w:ind w:firstLine="0"/>
+      </w:pPr>
+    </w:p>
+    <w:p>
+      <w:pPr>
+        <w:pStyle w:val="Legenda"/>
+        <w:rPr>
+          <w:sz w:val="24"/>
+          <w:szCs w:val="24"/>
+        </w:rPr>
+      </w:pPr>
+      <w:r>
+        <w:rPr>
+          <w:sz w:val="24"/>
+          <w:szCs w:val="24"/>
+        </w:rPr>
+        <w:lastRenderedPageBreak/>
+        <w:t xml:space="preserve">Figura </w:t>
+      </w:r>
+      <w:r>
+        <w:rPr>
+          <w:sz w:val="24"/>
+          <w:szCs w:val="24"/>
+        </w:rPr>
+        <w:fldChar w:fldCharType="begin"/>
+      </w:r>
+      <w:r>
+        <w:rPr>
+          <w:sz w:val="24"/>
+          <w:szCs w:val="24"/>
+        </w:rPr>
+        <w:instrText xml:space="preserve"> SEQ Figura \* ARABIC </w:instrText>
+      </w:r>
+      <w:r>
+        <w:rPr>
+          <w:sz w:val="24"/>
+          <w:szCs w:val="24"/>
+        </w:rPr>
+        <w:fldChar w:fldCharType="separate"/>
+      </w:r>
+      <w:r>
+        <w:rPr>
+          <w:noProof/>
+          <w:sz w:val="24"/>
+          <w:szCs w:val="24"/>
+        </w:rPr>
+        <w:t>23</w:t>
+      </w:r>
+      <w:r>
+        <w:rPr>
+          <w:sz w:val="24"/>
+          <w:szCs w:val="24"/>
+        </w:rPr>
+        <w:fldChar w:fldCharType="end"/>
+      </w:r>
+      <w:r>
+        <w:rPr>
+          <w:sz w:val="24"/>
+          <w:szCs w:val="24"/>
+        </w:rPr>
+        <w:t xml:space="preserve"> </w:t>
+      </w:r>
+      <w:r>
+        <w:rPr>
+          <w:sz w:val="24"/>
+          <w:szCs w:val="24"/>
+        </w:rPr>
+        <w:t>–</w:t>
+      </w:r>
+      <w:r>
+        <w:rPr>
+          <w:sz w:val="24"/>
+          <w:szCs w:val="24"/>
+        </w:rPr>
+        <w:t xml:space="preserve"> </w:t>
+      </w:r>
+      <w:r>
+        <w:rPr>
+          <w:b w:val="0"/>
+          <w:bCs w:val="0"/>
+          <w:sz w:val="24"/>
+          <w:szCs w:val="24"/>
+        </w:rPr>
+        <w:t>Tabela de Ações</w:t>
+      </w:r>
+    </w:p>
+    <w:p>
+      <w:pPr>
+        <w:ind w:firstLine="0"/>
+      </w:pPr>
+      <w:r>
+        <w:rPr>
+          <w:noProof/>
+        </w:rPr>
+        <w:drawing>
+          <wp:inline distT="0" distB="0" distL="0" distR="0" wp14:anchorId="786C26EF" wp14:editId="7A5EB903">
+            <wp:extent cx="5760720" cy="2747645"/>
+            <wp:effectExtent l="0" t="0" r="0" b="0"/>
+            <wp:docPr id="13" name="Imagem 13" descr="Interface gráfica do usuário, Texto, Aplicativo&#10;&#10;Descrição gerada automaticamente"/>
+            <wp:cNvGraphicFramePr>
+              <a:graphicFrameLocks xmlns:a="http://schemas.openxmlformats.org/drawingml/2006/main" noChangeAspect="1"/>
+            </wp:cNvGraphicFramePr>
+            <a:graphic xmlns:a="http://schemas.openxmlformats.org/drawingml/2006/main">
+              <a:graphicData uri="http://schemas.openxmlformats.org/drawingml/2006/picture">
+                <pic:pic xmlns:pic="http://schemas.openxmlformats.org/drawingml/2006/picture">
+                  <pic:nvPicPr>
+                    <pic:cNvPr id="13" name="Imagem 13" descr="Interface gráfica do usuário, Texto, Aplicativo&#10;&#10;Descrição gerada automaticamente"/>
+                    <pic:cNvPicPr/>
+                  </pic:nvPicPr>
+                  <pic:blipFill>
+                    <a:blip r:embed="rId31">
+                      <a:extLst>
+                        <a:ext uri="{28A0092B-C50C-407E-A947-70E740481C1C}">
+                          <a14:useLocalDpi xmlns:a14="http://schemas.microsoft.com/office/drawing/2010/main" val="0"/>
+                        </a:ext>
+                      </a:extLst>
+                    </a:blip>
+                    <a:stretch>
+                      <a:fillRect/>
+                    </a:stretch>
+                  </pic:blipFill>
+                  <pic:spPr>
+                    <a:xfrm>
+                      <a:off x="0" y="0"/>
+                      <a:ext cx="5760720" cy="2747645"/>
+                    </a:xfrm>
+                    <a:prstGeom prst="rect">
+                      <a:avLst/>
+                    </a:prstGeom>
+                  </pic:spPr>
+                </pic:pic>
+              </a:graphicData>
+            </a:graphic>
+          </wp:inline>
+        </w:drawing>
+      </w:r>
+    </w:p>
+    <w:p>
+      <w:pPr>
+        <w:pStyle w:val="Legenda"/>
+        <w:spacing w:before="0" w:after="0" w:line="240" w:lineRule="auto"/>
+        <w:rPr>
+          <w:b w:val="0"/>
+          <w:bCs w:val="0"/>
+          <w:sz w:val="24"/>
+          <w:szCs w:val="24"/>
+        </w:rPr>
+      </w:pPr>
+      <w:r>
+        <w:rPr>
+          <w:sz w:val="24"/>
+          <w:szCs w:val="24"/>
+        </w:rPr>
+        <w:t xml:space="preserve">Fonte: </w:t>
+      </w:r>
+      <w:r>
+        <w:rPr>
+          <w:b w:val="0"/>
+          <w:bCs w:val="0"/>
+          <w:sz w:val="24"/>
+          <w:szCs w:val="24"/>
+        </w:rPr>
+        <w:t>O autor</w:t>
+      </w:r>
+    </w:p>
+    <w:p>
+      <w:pPr>
+        <w:ind w:firstLine="0"/>
+      </w:pPr>
+    </w:p>
+    <w:p>
+      <w:pPr>
+        <w:pStyle w:val="Legenda"/>
+        <w:rPr>
+          <w:sz w:val="24"/>
+          <w:szCs w:val="24"/>
+        </w:rPr>
+      </w:pPr>
+      <w:r>
+        <w:rPr>
+          <w:sz w:val="24"/>
+          <w:szCs w:val="24"/>
+        </w:rPr>
+        <w:t xml:space="preserve">Figura </w:t>
+      </w:r>
+      <w:r>
+        <w:rPr>
+          <w:sz w:val="24"/>
+          <w:szCs w:val="24"/>
+        </w:rPr>
+        <w:fldChar w:fldCharType="begin"/>
+      </w:r>
+      <w:r>
+        <w:rPr>
+          <w:sz w:val="24"/>
+          <w:szCs w:val="24"/>
+        </w:rPr>
+        <w:instrText xml:space="preserve"> SEQ Figura \* ARABIC </w:instrText>
+      </w:r>
+      <w:r>
+        <w:rPr>
+          <w:sz w:val="24"/>
+          <w:szCs w:val="24"/>
+        </w:rPr>
+        <w:fldChar w:fldCharType="separate"/>
+      </w:r>
+      <w:r>
+        <w:rPr>
+          <w:noProof/>
+          <w:sz w:val="24"/>
+          <w:szCs w:val="24"/>
+        </w:rPr>
+        <w:t>24</w:t>
+      </w:r>
+      <w:r>
+        <w:rPr>
+          <w:sz w:val="24"/>
+          <w:szCs w:val="24"/>
+        </w:rPr>
+        <w:fldChar w:fldCharType="end"/>
+      </w:r>
+      <w:r>
+        <w:rPr>
+          <w:sz w:val="24"/>
+          <w:szCs w:val="24"/>
+        </w:rPr>
+        <w:t xml:space="preserve"> - </w:t>
+      </w:r>
+      <w:r>
+        <w:rPr>
+          <w:b w:val="0"/>
+          <w:bCs w:val="0"/>
+          <w:sz w:val="24"/>
+          <w:szCs w:val="24"/>
+        </w:rPr>
+        <w:t>Sucesso</w:t>
+      </w:r>
+    </w:p>
+    <w:p>
+      <w:pPr>
+        <w:ind w:firstLine="0"/>
+      </w:pPr>
+      <w:r>
+        <w:rPr>
+          <w:noProof/>
+        </w:rPr>
+        <w:drawing>
+          <wp:inline distT="0" distB="0" distL="0" distR="0" wp14:anchorId="760B3C59" wp14:editId="67FCF04B">
+            <wp:extent cx="5760720" cy="1890395"/>
+            <wp:effectExtent l="0" t="0" r="0" b="0"/>
+            <wp:docPr id="17" name="Imagem 17" descr="Interface gráfica do usuário, Texto, Aplicativo&#10;&#10;Descrição gerada automaticamente"/>
+            <wp:cNvGraphicFramePr>
+              <a:graphicFrameLocks xmlns:a="http://schemas.openxmlformats.org/drawingml/2006/main" noChangeAspect="1"/>
+            </wp:cNvGraphicFramePr>
+            <a:graphic xmlns:a="http://schemas.openxmlformats.org/drawingml/2006/main">
+              <a:graphicData uri="http://schemas.openxmlformats.org/drawingml/2006/picture">
+                <pic:pic xmlns:pic="http://schemas.openxmlformats.org/drawingml/2006/picture">
+                  <pic:nvPicPr>
+                    <pic:cNvPr id="17" name="Imagem 17" descr="Interface gráfica do usuário, Texto, Aplicativo&#10;&#10;Descrição gerada automaticamente"/>
+                    <pic:cNvPicPr/>
+                  </pic:nvPicPr>
+                  <pic:blipFill>
+                    <a:blip r:embed="rId32">
+                      <a:extLst>
+                        <a:ext uri="{28A0092B-C50C-407E-A947-70E740481C1C}">
+                          <a14:useLocalDpi xmlns:a14="http://schemas.microsoft.com/office/drawing/2010/main" val="0"/>
+                        </a:ext>
+                      </a:extLst>
+                    </a:blip>
+                    <a:stretch>
+                      <a:fillRect/>
+                    </a:stretch>
+                  </pic:blipFill>
+                  <pic:spPr>
+                    <a:xfrm>
+                      <a:off x="0" y="0"/>
+                      <a:ext cx="5760720" cy="1890395"/>
+                    </a:xfrm>
+                    <a:prstGeom prst="rect">
+                      <a:avLst/>
+                    </a:prstGeom>
+                  </pic:spPr>
+                </pic:pic>
+              </a:graphicData>
+            </a:graphic>
+          </wp:inline>
+        </w:drawing>
+      </w:r>
+    </w:p>
+    <w:p>
+      <w:pPr>
+        <w:pStyle w:val="Legenda"/>
+        <w:spacing w:before="0" w:after="0" w:line="240" w:lineRule="auto"/>
+        <w:rPr>
+          <w:b w:val="0"/>
+          <w:bCs w:val="0"/>
+          <w:sz w:val="24"/>
+          <w:szCs w:val="24"/>
+        </w:rPr>
+      </w:pPr>
+      <w:r>
+        <w:rPr>
+          <w:sz w:val="24"/>
+          <w:szCs w:val="24"/>
+        </w:rPr>
+        <w:t xml:space="preserve">Fonte: </w:t>
+      </w:r>
+      <w:r>
+        <w:rPr>
+          <w:b w:val="0"/>
+          <w:bCs w:val="0"/>
+          <w:sz w:val="24"/>
+          <w:szCs w:val="24"/>
+        </w:rPr>
+        <w:t>O autor</w:t>
+      </w:r>
+    </w:p>
+    <w:p>
+      <w:pPr>
+        <w:ind w:firstLine="0"/>
+      </w:pPr>
+    </w:p>
+    <w:p>
+      <w:pPr>
+        <w:ind w:firstLine="0"/>
+      </w:pPr>
+    </w:p>
+    <w:p>
+      <w:pPr>
+        <w:ind w:firstLine="0"/>
+      </w:pPr>
+    </w:p>
+    <w:p>
+      <w:pPr>
+        <w:ind w:firstLine="0"/>
+      </w:pPr>
+    </w:p>
+    <w:p>
+      <w:pPr>
+        <w:ind w:firstLine="0"/>
+      </w:pPr>
+    </w:p>
+    <w:p>
+      <w:pPr>
+        <w:ind w:firstLine="0"/>
+      </w:pPr>
+    </w:p>
+    <w:p>
+      <w:pPr>
+        <w:ind w:firstLine="0"/>
+      </w:pPr>
+    </w:p>
+    <w:p>
+      <w:pPr>
+        <w:ind w:firstLine="0"/>
+      </w:pPr>
+    </w:p>
+    <w:p>
+      <w:pPr>
+        <w:pStyle w:val="Legenda"/>
+        <w:rPr>
+          <w:sz w:val="24"/>
+          <w:szCs w:val="24"/>
+        </w:rPr>
+      </w:pPr>
+    </w:p>
+    <w:p>
+      <w:pPr>
+        <w:pStyle w:val="Legenda"/>
+        <w:rPr>
+          <w:sz w:val="24"/>
+          <w:szCs w:val="24"/>
+        </w:rPr>
+      </w:pPr>
+      <w:r>
+        <w:rPr>
+          <w:sz w:val="24"/>
+          <w:szCs w:val="24"/>
+        </w:rPr>
+        <w:lastRenderedPageBreak/>
+        <w:t>F</w:t>
+      </w:r>
+      <w:r>
+        <w:rPr>
+          <w:sz w:val="24"/>
+          <w:szCs w:val="24"/>
+        </w:rPr>
+        <w:t xml:space="preserve">igura </w:t>
+      </w:r>
+      <w:r>
+        <w:rPr>
+          <w:sz w:val="24"/>
+          <w:szCs w:val="24"/>
+        </w:rPr>
+        <w:fldChar w:fldCharType="begin"/>
+      </w:r>
+      <w:r>
+        <w:rPr>
+          <w:sz w:val="24"/>
+          <w:szCs w:val="24"/>
+        </w:rPr>
+        <w:instrText xml:space="preserve"> SEQ Figura \* ARABIC </w:instrText>
+      </w:r>
+      <w:r>
+        <w:rPr>
+          <w:sz w:val="24"/>
+          <w:szCs w:val="24"/>
+        </w:rPr>
+        <w:fldChar w:fldCharType="separate"/>
+      </w:r>
+      <w:r>
+        <w:rPr>
+          <w:noProof/>
+          <w:sz w:val="24"/>
+          <w:szCs w:val="24"/>
+        </w:rPr>
+        <w:t>25</w:t>
+      </w:r>
+      <w:r>
+        <w:rPr>
+          <w:sz w:val="24"/>
+          <w:szCs w:val="24"/>
+        </w:rPr>
+        <w:fldChar w:fldCharType="end"/>
+      </w:r>
+      <w:r>
+        <w:rPr>
+          <w:sz w:val="24"/>
+          <w:szCs w:val="24"/>
+        </w:rPr>
+        <w:t xml:space="preserve"> - </w:t>
+      </w:r>
+      <w:r>
+        <w:rPr>
+          <w:b w:val="0"/>
+          <w:bCs w:val="0"/>
+          <w:sz w:val="24"/>
+          <w:szCs w:val="24"/>
+        </w:rPr>
+        <w:t>Erro</w:t>
+      </w:r>
+    </w:p>
+    <w:p>
+      <w:pPr>
+        <w:ind w:firstLine="0"/>
+      </w:pPr>
+      <w:r>
+        <w:rPr>
+          <w:noProof/>
+        </w:rPr>
+        <w:drawing>
+          <wp:inline distT="0" distB="0" distL="0" distR="0" wp14:anchorId="142EA92A" wp14:editId="4EBEC9DC">
+            <wp:extent cx="5760720" cy="2782570"/>
+            <wp:effectExtent l="0" t="0" r="0" b="0"/>
+            <wp:docPr id="18" name="Imagem 18" descr="Interface gráfica do usuário, Aplicativo&#10;&#10;Descrição gerada automaticamente"/>
+            <wp:cNvGraphicFramePr>
+              <a:graphicFrameLocks xmlns:a="http://schemas.openxmlformats.org/drawingml/2006/main" noChangeAspect="1"/>
+            </wp:cNvGraphicFramePr>
+            <a:graphic xmlns:a="http://schemas.openxmlformats.org/drawingml/2006/main">
+              <a:graphicData uri="http://schemas.openxmlformats.org/drawingml/2006/picture">
+                <pic:pic xmlns:pic="http://schemas.openxmlformats.org/drawingml/2006/picture">
+                  <pic:nvPicPr>
+                    <pic:cNvPr id="18" name="Imagem 18" descr="Interface gráfica do usuário, Aplicativo&#10;&#10;Descrição gerada automaticamente"/>
+                    <pic:cNvPicPr/>
+                  </pic:nvPicPr>
+                  <pic:blipFill>
+                    <a:blip r:embed="rId33">
+                      <a:extLst>
+                        <a:ext uri="{28A0092B-C50C-407E-A947-70E740481C1C}">
+                          <a14:useLocalDpi xmlns:a14="http://schemas.microsoft.com/office/drawing/2010/main" val="0"/>
+                        </a:ext>
+                      </a:extLst>
+                    </a:blip>
+                    <a:stretch>
+                      <a:fillRect/>
+                    </a:stretch>
+                  </pic:blipFill>
+                  <pic:spPr>
+                    <a:xfrm>
+                      <a:off x="0" y="0"/>
+                      <a:ext cx="5760720" cy="2782570"/>
+                    </a:xfrm>
+                    <a:prstGeom prst="rect">
+                      <a:avLst/>
+                    </a:prstGeom>
+                  </pic:spPr>
+                </pic:pic>
+              </a:graphicData>
+            </a:graphic>
+          </wp:inline>
+        </w:drawing>
+      </w:r>
+    </w:p>
+    <w:p>
+      <w:pPr>
+        <w:pStyle w:val="Legenda"/>
+        <w:spacing w:before="0" w:after="0" w:line="240" w:lineRule="auto"/>
+        <w:rPr>
+          <w:b w:val="0"/>
+          <w:bCs w:val="0"/>
+          <w:sz w:val="24"/>
+          <w:szCs w:val="24"/>
+        </w:rPr>
+      </w:pPr>
+      <w:r>
+        <w:rPr>
+          <w:sz w:val="24"/>
+          <w:szCs w:val="24"/>
+        </w:rPr>
+        <w:t xml:space="preserve">Fonte: </w:t>
+      </w:r>
+      <w:r>
+        <w:rPr>
+          <w:b w:val="0"/>
+          <w:bCs w:val="0"/>
+          <w:sz w:val="24"/>
+          <w:szCs w:val="24"/>
+        </w:rPr>
+        <w:t>O autor</w:t>
+      </w:r>
+    </w:p>
     <w:p/>
+    <w:p>
+      <w:pPr>
+        <w:pStyle w:val="Ttulo1"/>
+      </w:pPr>
+      <w:bookmarkStart w:id="15" w:name="_Toc56182750"/>
+      <w:r>
+        <w:t>Resultados e Discussão</w:t>
+      </w:r>
+      <w:bookmarkEnd w:id="15"/>
+    </w:p>
+    <w:p>
+      <w:pPr>
+        <w:textAlignment w:val="baseline"/>
+      </w:pPr>
+      <w:r>
+        <w:t xml:space="preserve">Dentre as tecnologias utilizadas neste sistema, são dignos de nota os seguintes itens: Angular7, JAVA, Spring Boot, API REST, Selenium, Junit. </w:t>
+      </w:r>
+    </w:p>
+    <w:p>
+      <w:pPr>
+        <w:textAlignment w:val="baseline"/>
+      </w:pPr>
+      <w:r>
+        <w:t xml:space="preserve">A divisão do projeto em FrontEnd e BackEnd facilitou muito o desenvolvimento do sistema e consequentemente sua organização. Outro ponto </w:t>
+      </w:r>
+      <w:r>
+        <w:t>a se destacar</w:t>
+      </w:r>
+      <w:r>
+        <w:t xml:space="preserve"> é que o backend disponibiliza uma API REST que futuramente poderá ser consumida por outros sistemas, permitindo assim a integração deste projeto com interfaces externas</w:t>
+      </w:r>
+      <w:r>
+        <w:t>.</w:t>
+      </w:r>
+    </w:p>
     <w:p/>
-    <w:p/>
-    <w:p/>
-    <w:p/>
-    <w:p/>
-    <w:p/>
-    <w:p/>
-    <w:p/>
-    <w:p/>
-    <w:p/>
-    <w:p/>
-    <w:p/>
-    <w:p/>
-    <w:p/>
-    <w:p/>
-    <w:p/>
-    <w:p/>
-    <w:p>
-      <w:pPr>
-        <w:pStyle w:val="Ttulo1"/>
-      </w:pPr>
-      <w:bookmarkStart w:id="16" w:name="_Toc56182750"/>
-      <w:r>
-        <w:lastRenderedPageBreak/>
-        <w:t>Resultados e Discussão</w:t>
-      </w:r>
-      <w:bookmarkEnd w:id="16"/>
-    </w:p>
-    <w:p>
-      <w:pPr>
-        <w:rPr>
-          <w:color w:val="00B050"/>
-        </w:rPr>
-      </w:pPr>
-      <w:r>
-        <w:rPr>
-          <w:color w:val="00B050"/>
-        </w:rPr>
-        <w:t xml:space="preserve">Apresente neste Capítulo uma discussão sobre cada uma das tecnologias utilizadas no desenvolvimento do </w:t>
-      </w:r>
-      <w:r>
-        <w:rPr>
-          <w:color w:val="00B050"/>
-        </w:rPr>
-        <w:t>produto</w:t>
-      </w:r>
-      <w:r>
-        <w:rPr>
-          <w:color w:val="00B050"/>
-        </w:rPr>
-        <w:t>. Indique a motivação para utilização da tecnologia e como ela auxiliou no desenvolvimento. Apresente também que problemas foram encontrados e como foram solucionados.</w:t>
-      </w:r>
-    </w:p>
-    <w:p>
-      <w:r>
-        <w:rPr>
-          <w:color w:val="00B050"/>
-        </w:rPr>
-        <w:t>Se há um cliente, indique se a solução foi implantada e qual a opinião dos usuários.</w:t>
-      </w:r>
-    </w:p>
     <w:sectPr>
-      <w:headerReference w:type="default" r:id="rId17"/>
-      <w:footerReference w:type="default" r:id="rId18"/>
+      <w:headerReference w:type="default" r:id="rId34"/>
+      <w:footerReference w:type="default" r:id="rId35"/>
       <w:pgSz w:w="11907" w:h="16840" w:code="9"/>
       <w:pgMar w:top="1701" w:right="1134" w:bottom="1134" w:left="1701" w:header="1134" w:footer="1134" w:gutter="0"/>
       <w:cols w:space="720"/>
@@ -3612,7 +6765,7 @@
 </file>
 
 <file path=word/endnotes.xml><?xml version="1.0" encoding="utf-8"?>
-<w:endnotes xmlns:wpc="http://schemas.microsoft.com/office/word/2010/wordprocessingCanvas" xmlns:cx="http://schemas.microsoft.com/office/drawing/2014/chartex" xmlns:mc="http://schemas.openxmlformats.org/markup-compatibility/2006" xmlns:o="urn:schemas-microsoft-com:office:office" xmlns:r="http://schemas.openxmlformats.org/officeDocument/2006/relationships" xmlns:m="http://schemas.openxmlformats.org/officeDocument/2006/math" xmlns:v="urn:schemas-microsoft-com:vml" xmlns:wp14="http://schemas.microsoft.com/office/word/2010/wordprocessingDrawing" xmlns:wp="http://schemas.openxmlformats.org/drawingml/2006/wordprocessingDrawing" xmlns:w10="urn:schemas-microsoft-com:office:word" xmlns:w="http://schemas.openxmlformats.org/wordprocessingml/2006/main" xmlns:w14="http://schemas.microsoft.com/office/word/2010/wordml" xmlns:w15="http://schemas.microsoft.com/office/word/2012/wordml" xmlns:w16se="http://schemas.microsoft.com/office/word/2015/wordml/symex" xmlns:wpg="http://schemas.microsoft.com/office/word/2010/wordprocessingGroup" xmlns:wpi="http://schemas.microsoft.com/office/word/2010/wordprocessingInk" xmlns:wne="http://schemas.microsoft.com/office/word/2006/wordml" xmlns:wps="http://schemas.microsoft.com/office/word/2010/wordprocessingShape" mc:Ignorable="w14 w15 w16se wp14">
+<w:endnotes xmlns:wpc="http://schemas.microsoft.com/office/word/2010/wordprocessingCanvas" xmlns:cx="http://schemas.microsoft.com/office/drawing/2014/chartex" xmlns:cx1="http://schemas.microsoft.com/office/drawing/2015/9/8/chartex" xmlns:cx2="http://schemas.microsoft.com/office/drawing/2015/10/21/chartex" xmlns:cx3="http://schemas.microsoft.com/office/drawing/2016/5/9/chartex" xmlns:cx4="http://schemas.microsoft.com/office/drawing/2016/5/10/chartex" xmlns:cx5="http://schemas.microsoft.com/office/drawing/2016/5/11/chartex" xmlns:cx6="http://schemas.microsoft.com/office/drawing/2016/5/12/chartex" xmlns:cx7="http://schemas.microsoft.com/office/drawing/2016/5/13/chartex" xmlns:cx8="http://schemas.microsoft.com/office/drawing/2016/5/14/chartex" xmlns:mc="http://schemas.openxmlformats.org/markup-compatibility/2006" xmlns:aink="http://schemas.microsoft.com/office/drawing/2016/ink" xmlns:am3d="http://schemas.microsoft.com/office/drawing/2017/model3d" xmlns:o="urn:schemas-microsoft-com:office:office" xmlns:r="http://schemas.openxmlformats.org/officeDocument/2006/relationships" xmlns:m="http://schemas.openxmlformats.org/officeDocument/2006/math" xmlns:v="urn:schemas-microsoft-com:vml" xmlns:wp14="http://schemas.microsoft.com/office/word/2010/wordprocessingDrawing" xmlns:wp="http://schemas.openxmlformats.org/drawingml/2006/wordprocessingDrawing" xmlns:w10="urn:schemas-microsoft-com:office:word" xmlns:w="http://schemas.openxmlformats.org/wordprocessingml/2006/main" xmlns:w14="http://schemas.microsoft.com/office/word/2010/wordml" xmlns:w15="http://schemas.microsoft.com/office/word/2012/wordml" xmlns:w16cex="http://schemas.microsoft.com/office/word/2018/wordml/cex" xmlns:w16cid="http://schemas.microsoft.com/office/word/2016/wordml/cid" xmlns:w16="http://schemas.microsoft.com/office/word/2018/wordml" xmlns:w16se="http://schemas.microsoft.com/office/word/2015/wordml/symex" xmlns:wpg="http://schemas.microsoft.com/office/word/2010/wordprocessingGroup" xmlns:wpi="http://schemas.microsoft.com/office/word/2010/wordprocessingInk" xmlns:wne="http://schemas.microsoft.com/office/word/2006/wordml" xmlns:wps="http://schemas.microsoft.com/office/word/2010/wordprocessingShape" mc:Ignorable="w14 w15 w16se w16cid w16 w16cex wp14">
   <w:endnote w:type="separator" w:id="-1">
     <w:p>
       <w:r>
@@ -3633,7 +6786,7 @@
 </file>
 
 <file path=word/footer1.xml><?xml version="1.0" encoding="utf-8"?>
-<w:ftr xmlns:wpc="http://schemas.microsoft.com/office/word/2010/wordprocessingCanvas" xmlns:cx="http://schemas.microsoft.com/office/drawing/2014/chartex" xmlns:mc="http://schemas.openxmlformats.org/markup-compatibility/2006" xmlns:o="urn:schemas-microsoft-com:office:office" xmlns:r="http://schemas.openxmlformats.org/officeDocument/2006/relationships" xmlns:m="http://schemas.openxmlformats.org/officeDocument/2006/math" xmlns:v="urn:schemas-microsoft-com:vml" xmlns:wp14="http://schemas.microsoft.com/office/word/2010/wordprocessingDrawing" xmlns:wp="http://schemas.openxmlformats.org/drawingml/2006/wordprocessingDrawing" xmlns:w10="urn:schemas-microsoft-com:office:word" xmlns:w="http://schemas.openxmlformats.org/wordprocessingml/2006/main" xmlns:w14="http://schemas.microsoft.com/office/word/2010/wordml" xmlns:w15="http://schemas.microsoft.com/office/word/2012/wordml" xmlns:w16se="http://schemas.microsoft.com/office/word/2015/wordml/symex" xmlns:wpg="http://schemas.microsoft.com/office/word/2010/wordprocessingGroup" xmlns:wpi="http://schemas.microsoft.com/office/word/2010/wordprocessingInk" xmlns:wne="http://schemas.microsoft.com/office/word/2006/wordml" xmlns:wps="http://schemas.microsoft.com/office/word/2010/wordprocessingShape" mc:Ignorable="w14 w15 w16se wp14">
+<w:ftr xmlns:wpc="http://schemas.microsoft.com/office/word/2010/wordprocessingCanvas" xmlns:cx="http://schemas.microsoft.com/office/drawing/2014/chartex" xmlns:cx1="http://schemas.microsoft.com/office/drawing/2015/9/8/chartex" xmlns:cx2="http://schemas.microsoft.com/office/drawing/2015/10/21/chartex" xmlns:cx3="http://schemas.microsoft.com/office/drawing/2016/5/9/chartex" xmlns:cx4="http://schemas.microsoft.com/office/drawing/2016/5/10/chartex" xmlns:cx5="http://schemas.microsoft.com/office/drawing/2016/5/11/chartex" xmlns:cx6="http://schemas.microsoft.com/office/drawing/2016/5/12/chartex" xmlns:cx7="http://schemas.microsoft.com/office/drawing/2016/5/13/chartex" xmlns:cx8="http://schemas.microsoft.com/office/drawing/2016/5/14/chartex" xmlns:mc="http://schemas.openxmlformats.org/markup-compatibility/2006" xmlns:aink="http://schemas.microsoft.com/office/drawing/2016/ink" xmlns:am3d="http://schemas.microsoft.com/office/drawing/2017/model3d" xmlns:o="urn:schemas-microsoft-com:office:office" xmlns:r="http://schemas.openxmlformats.org/officeDocument/2006/relationships" xmlns:m="http://schemas.openxmlformats.org/officeDocument/2006/math" xmlns:v="urn:schemas-microsoft-com:vml" xmlns:wp14="http://schemas.microsoft.com/office/word/2010/wordprocessingDrawing" xmlns:wp="http://schemas.openxmlformats.org/drawingml/2006/wordprocessingDrawing" xmlns:w10="urn:schemas-microsoft-com:office:word" xmlns:w="http://schemas.openxmlformats.org/wordprocessingml/2006/main" xmlns:w14="http://schemas.microsoft.com/office/word/2010/wordml" xmlns:w15="http://schemas.microsoft.com/office/word/2012/wordml" xmlns:w16cex="http://schemas.microsoft.com/office/word/2018/wordml/cex" xmlns:w16cid="http://schemas.microsoft.com/office/word/2016/wordml/cid" xmlns:w16="http://schemas.microsoft.com/office/word/2018/wordml" xmlns:w16se="http://schemas.microsoft.com/office/word/2015/wordml/symex" xmlns:wpg="http://schemas.microsoft.com/office/word/2010/wordprocessingGroup" xmlns:wpi="http://schemas.microsoft.com/office/word/2010/wordprocessingInk" xmlns:wne="http://schemas.microsoft.com/office/word/2006/wordml" xmlns:wps="http://schemas.microsoft.com/office/word/2010/wordprocessingShape" mc:Ignorable="w14 w15 w16se w16cid w16 w16cex wp14">
   <w:p>
     <w:pPr>
       <w:pStyle w:val="Rodap"/>
@@ -3644,7 +6797,7 @@
 </file>
 
 <file path=word/footer2.xml><?xml version="1.0" encoding="utf-8"?>
-<w:ftr xmlns:wpc="http://schemas.microsoft.com/office/word/2010/wordprocessingCanvas" xmlns:cx="http://schemas.microsoft.com/office/drawing/2014/chartex" xmlns:mc="http://schemas.openxmlformats.org/markup-compatibility/2006" xmlns:o="urn:schemas-microsoft-com:office:office" xmlns:r="http://schemas.openxmlformats.org/officeDocument/2006/relationships" xmlns:m="http://schemas.openxmlformats.org/officeDocument/2006/math" xmlns:v="urn:schemas-microsoft-com:vml" xmlns:wp14="http://schemas.microsoft.com/office/word/2010/wordprocessingDrawing" xmlns:wp="http://schemas.openxmlformats.org/drawingml/2006/wordprocessingDrawing" xmlns:w10="urn:schemas-microsoft-com:office:word" xmlns:w="http://schemas.openxmlformats.org/wordprocessingml/2006/main" xmlns:w14="http://schemas.microsoft.com/office/word/2010/wordml" xmlns:w15="http://schemas.microsoft.com/office/word/2012/wordml" xmlns:w16se="http://schemas.microsoft.com/office/word/2015/wordml/symex" xmlns:wpg="http://schemas.microsoft.com/office/word/2010/wordprocessingGroup" xmlns:wpi="http://schemas.microsoft.com/office/word/2010/wordprocessingInk" xmlns:wne="http://schemas.microsoft.com/office/word/2006/wordml" xmlns:wps="http://schemas.microsoft.com/office/word/2010/wordprocessingShape" mc:Ignorable="w14 w15 w16se wp14">
+<w:ftr xmlns:wpc="http://schemas.microsoft.com/office/word/2010/wordprocessingCanvas" xmlns:cx="http://schemas.microsoft.com/office/drawing/2014/chartex" xmlns:cx1="http://schemas.microsoft.com/office/drawing/2015/9/8/chartex" xmlns:cx2="http://schemas.microsoft.com/office/drawing/2015/10/21/chartex" xmlns:cx3="http://schemas.microsoft.com/office/drawing/2016/5/9/chartex" xmlns:cx4="http://schemas.microsoft.com/office/drawing/2016/5/10/chartex" xmlns:cx5="http://schemas.microsoft.com/office/drawing/2016/5/11/chartex" xmlns:cx6="http://schemas.microsoft.com/office/drawing/2016/5/12/chartex" xmlns:cx7="http://schemas.microsoft.com/office/drawing/2016/5/13/chartex" xmlns:cx8="http://schemas.microsoft.com/office/drawing/2016/5/14/chartex" xmlns:mc="http://schemas.openxmlformats.org/markup-compatibility/2006" xmlns:aink="http://schemas.microsoft.com/office/drawing/2016/ink" xmlns:am3d="http://schemas.microsoft.com/office/drawing/2017/model3d" xmlns:o="urn:schemas-microsoft-com:office:office" xmlns:r="http://schemas.openxmlformats.org/officeDocument/2006/relationships" xmlns:m="http://schemas.openxmlformats.org/officeDocument/2006/math" xmlns:v="urn:schemas-microsoft-com:vml" xmlns:wp14="http://schemas.microsoft.com/office/word/2010/wordprocessingDrawing" xmlns:wp="http://schemas.openxmlformats.org/drawingml/2006/wordprocessingDrawing" xmlns:w10="urn:schemas-microsoft-com:office:word" xmlns:w="http://schemas.openxmlformats.org/wordprocessingml/2006/main" xmlns:w14="http://schemas.microsoft.com/office/word/2010/wordml" xmlns:w15="http://schemas.microsoft.com/office/word/2012/wordml" xmlns:w16cex="http://schemas.microsoft.com/office/word/2018/wordml/cex" xmlns:w16cid="http://schemas.microsoft.com/office/word/2016/wordml/cid" xmlns:w16="http://schemas.microsoft.com/office/word/2018/wordml" xmlns:w16se="http://schemas.microsoft.com/office/word/2015/wordml/symex" xmlns:wpg="http://schemas.microsoft.com/office/word/2010/wordprocessingGroup" xmlns:wpi="http://schemas.microsoft.com/office/word/2010/wordprocessingInk" xmlns:wne="http://schemas.microsoft.com/office/word/2006/wordml" xmlns:wps="http://schemas.microsoft.com/office/word/2010/wordprocessingShape" mc:Ignorable="w14 w15 w16se w16cid w16 w16cex wp14">
   <w:sdt>
     <w:sdtPr>
       <w:id w:val="1307351738"/>
@@ -3685,7 +6838,7 @@
 </file>
 
 <file path=word/footnotes.xml><?xml version="1.0" encoding="utf-8"?>
-<w:footnotes xmlns:wpc="http://schemas.microsoft.com/office/word/2010/wordprocessingCanvas" xmlns:cx="http://schemas.microsoft.com/office/drawing/2014/chartex" xmlns:mc="http://schemas.openxmlformats.org/markup-compatibility/2006" xmlns:o="urn:schemas-microsoft-com:office:office" xmlns:r="http://schemas.openxmlformats.org/officeDocument/2006/relationships" xmlns:m="http://schemas.openxmlformats.org/officeDocument/2006/math" xmlns:v="urn:schemas-microsoft-com:vml" xmlns:wp14="http://schemas.microsoft.com/office/word/2010/wordprocessingDrawing" xmlns:wp="http://schemas.openxmlformats.org/drawingml/2006/wordprocessingDrawing" xmlns:w10="urn:schemas-microsoft-com:office:word" xmlns:w="http://schemas.openxmlformats.org/wordprocessingml/2006/main" xmlns:w14="http://schemas.microsoft.com/office/word/2010/wordml" xmlns:w15="http://schemas.microsoft.com/office/word/2012/wordml" xmlns:w16se="http://schemas.microsoft.com/office/word/2015/wordml/symex" xmlns:wpg="http://schemas.microsoft.com/office/word/2010/wordprocessingGroup" xmlns:wpi="http://schemas.microsoft.com/office/word/2010/wordprocessingInk" xmlns:wne="http://schemas.microsoft.com/office/word/2006/wordml" xmlns:wps="http://schemas.microsoft.com/office/word/2010/wordprocessingShape" mc:Ignorable="w14 w15 w16se wp14">
+<w:footnotes xmlns:wpc="http://schemas.microsoft.com/office/word/2010/wordprocessingCanvas" xmlns:cx="http://schemas.microsoft.com/office/drawing/2014/chartex" xmlns:cx1="http://schemas.microsoft.com/office/drawing/2015/9/8/chartex" xmlns:cx2="http://schemas.microsoft.com/office/drawing/2015/10/21/chartex" xmlns:cx3="http://schemas.microsoft.com/office/drawing/2016/5/9/chartex" xmlns:cx4="http://schemas.microsoft.com/office/drawing/2016/5/10/chartex" xmlns:cx5="http://schemas.microsoft.com/office/drawing/2016/5/11/chartex" xmlns:cx6="http://schemas.microsoft.com/office/drawing/2016/5/12/chartex" xmlns:cx7="http://schemas.microsoft.com/office/drawing/2016/5/13/chartex" xmlns:cx8="http://schemas.microsoft.com/office/drawing/2016/5/14/chartex" xmlns:mc="http://schemas.openxmlformats.org/markup-compatibility/2006" xmlns:aink="http://schemas.microsoft.com/office/drawing/2016/ink" xmlns:am3d="http://schemas.microsoft.com/office/drawing/2017/model3d" xmlns:o="urn:schemas-microsoft-com:office:office" xmlns:r="http://schemas.openxmlformats.org/officeDocument/2006/relationships" xmlns:m="http://schemas.openxmlformats.org/officeDocument/2006/math" xmlns:v="urn:schemas-microsoft-com:vml" xmlns:wp14="http://schemas.microsoft.com/office/word/2010/wordprocessingDrawing" xmlns:wp="http://schemas.openxmlformats.org/drawingml/2006/wordprocessingDrawing" xmlns:w10="urn:schemas-microsoft-com:office:word" xmlns:w="http://schemas.openxmlformats.org/wordprocessingml/2006/main" xmlns:w14="http://schemas.microsoft.com/office/word/2010/wordml" xmlns:w15="http://schemas.microsoft.com/office/word/2012/wordml" xmlns:w16cex="http://schemas.microsoft.com/office/word/2018/wordml/cex" xmlns:w16cid="http://schemas.microsoft.com/office/word/2016/wordml/cid" xmlns:w16="http://schemas.microsoft.com/office/word/2018/wordml" xmlns:w16se="http://schemas.microsoft.com/office/word/2015/wordml/symex" xmlns:wpg="http://schemas.microsoft.com/office/word/2010/wordprocessingGroup" xmlns:wpi="http://schemas.microsoft.com/office/word/2010/wordprocessingInk" xmlns:wne="http://schemas.microsoft.com/office/word/2006/wordml" xmlns:wps="http://schemas.microsoft.com/office/word/2010/wordprocessingShape" mc:Ignorable="w14 w15 w16se w16cid w16 w16cex wp14">
   <w:footnote w:type="separator" w:id="-1">
     <w:p>
       <w:r>
@@ -3706,7 +6859,7 @@
 </file>
 
 <file path=word/header1.xml><?xml version="1.0" encoding="utf-8"?>
-<w:hdr xmlns:wpc="http://schemas.microsoft.com/office/word/2010/wordprocessingCanvas" xmlns:cx="http://schemas.microsoft.com/office/drawing/2014/chartex" xmlns:mc="http://schemas.openxmlformats.org/markup-compatibility/2006" xmlns:o="urn:schemas-microsoft-com:office:office" xmlns:r="http://schemas.openxmlformats.org/officeDocument/2006/relationships" xmlns:m="http://schemas.openxmlformats.org/officeDocument/2006/math" xmlns:v="urn:schemas-microsoft-com:vml" xmlns:wp14="http://schemas.microsoft.com/office/word/2010/wordprocessingDrawing" xmlns:wp="http://schemas.openxmlformats.org/drawingml/2006/wordprocessingDrawing" xmlns:w10="urn:schemas-microsoft-com:office:word" xmlns:w="http://schemas.openxmlformats.org/wordprocessingml/2006/main" xmlns:w14="http://schemas.microsoft.com/office/word/2010/wordml" xmlns:w15="http://schemas.microsoft.com/office/word/2012/wordml" xmlns:w16se="http://schemas.microsoft.com/office/word/2015/wordml/symex" xmlns:wpg="http://schemas.microsoft.com/office/word/2010/wordprocessingGroup" xmlns:wpi="http://schemas.microsoft.com/office/word/2010/wordprocessingInk" xmlns:wne="http://schemas.microsoft.com/office/word/2006/wordml" xmlns:wps="http://schemas.microsoft.com/office/word/2010/wordprocessingShape" mc:Ignorable="w14 w15 w16se wp14">
+<w:hdr xmlns:wpc="http://schemas.microsoft.com/office/word/2010/wordprocessingCanvas" xmlns:cx="http://schemas.microsoft.com/office/drawing/2014/chartex" xmlns:cx1="http://schemas.microsoft.com/office/drawing/2015/9/8/chartex" xmlns:cx2="http://schemas.microsoft.com/office/drawing/2015/10/21/chartex" xmlns:cx3="http://schemas.microsoft.com/office/drawing/2016/5/9/chartex" xmlns:cx4="http://schemas.microsoft.com/office/drawing/2016/5/10/chartex" xmlns:cx5="http://schemas.microsoft.com/office/drawing/2016/5/11/chartex" xmlns:cx6="http://schemas.microsoft.com/office/drawing/2016/5/12/chartex" xmlns:cx7="http://schemas.microsoft.com/office/drawing/2016/5/13/chartex" xmlns:cx8="http://schemas.microsoft.com/office/drawing/2016/5/14/chartex" xmlns:mc="http://schemas.openxmlformats.org/markup-compatibility/2006" xmlns:aink="http://schemas.microsoft.com/office/drawing/2016/ink" xmlns:am3d="http://schemas.microsoft.com/office/drawing/2017/model3d" xmlns:o="urn:schemas-microsoft-com:office:office" xmlns:r="http://schemas.openxmlformats.org/officeDocument/2006/relationships" xmlns:m="http://schemas.openxmlformats.org/officeDocument/2006/math" xmlns:v="urn:schemas-microsoft-com:vml" xmlns:wp14="http://schemas.microsoft.com/office/word/2010/wordprocessingDrawing" xmlns:wp="http://schemas.openxmlformats.org/drawingml/2006/wordprocessingDrawing" xmlns:w10="urn:schemas-microsoft-com:office:word" xmlns:w="http://schemas.openxmlformats.org/wordprocessingml/2006/main" xmlns:w14="http://schemas.microsoft.com/office/word/2010/wordml" xmlns:w15="http://schemas.microsoft.com/office/word/2012/wordml" xmlns:w16cex="http://schemas.microsoft.com/office/word/2018/wordml/cex" xmlns:w16cid="http://schemas.microsoft.com/office/word/2016/wordml/cid" xmlns:w16="http://schemas.microsoft.com/office/word/2018/wordml" xmlns:w16se="http://schemas.microsoft.com/office/word/2015/wordml/symex" xmlns:wpg="http://schemas.microsoft.com/office/word/2010/wordprocessingGroup" xmlns:wpi="http://schemas.microsoft.com/office/word/2010/wordprocessingInk" xmlns:wne="http://schemas.microsoft.com/office/word/2006/wordml" xmlns:wps="http://schemas.microsoft.com/office/word/2010/wordprocessingShape" mc:Ignorable="w14 w15 w16se w16cid w16 w16cex wp14">
   <w:p>
     <w:pPr>
       <w:pStyle w:val="Cabealho"/>
@@ -3716,7 +6869,7 @@
 </file>
 
 <file path=word/numbering.xml><?xml version="1.0" encoding="utf-8"?>
-<w:numbering xmlns:wpc="http://schemas.microsoft.com/office/word/2010/wordprocessingCanvas" xmlns:cx="http://schemas.microsoft.com/office/drawing/2014/chartex" xmlns:mc="http://schemas.openxmlformats.org/markup-compatibility/2006" xmlns:o="urn:schemas-microsoft-com:office:office" xmlns:r="http://schemas.openxmlformats.org/officeDocument/2006/relationships" xmlns:m="http://schemas.openxmlformats.org/officeDocument/2006/math" xmlns:v="urn:schemas-microsoft-com:vml" xmlns:wp14="http://schemas.microsoft.com/office/word/2010/wordprocessingDrawing" xmlns:wp="http://schemas.openxmlformats.org/drawingml/2006/wordprocessingDrawing" xmlns:w10="urn:schemas-microsoft-com:office:word" xmlns:w="http://schemas.openxmlformats.org/wordprocessingml/2006/main" xmlns:w14="http://schemas.microsoft.com/office/word/2010/wordml" xmlns:w15="http://schemas.microsoft.com/office/word/2012/wordml" xmlns:w16se="http://schemas.microsoft.com/office/word/2015/wordml/symex" xmlns:wpg="http://schemas.microsoft.com/office/word/2010/wordprocessingGroup" xmlns:wpi="http://schemas.microsoft.com/office/word/2010/wordprocessingInk" xmlns:wne="http://schemas.microsoft.com/office/word/2006/wordml" xmlns:wps="http://schemas.microsoft.com/office/word/2010/wordprocessingShape" mc:Ignorable="w14 w15 w16se wp14">
+<w:numbering xmlns:wpc="http://schemas.microsoft.com/office/word/2010/wordprocessingCanvas" xmlns:cx="http://schemas.microsoft.com/office/drawing/2014/chartex" xmlns:cx1="http://schemas.microsoft.com/office/drawing/2015/9/8/chartex" xmlns:cx2="http://schemas.microsoft.com/office/drawing/2015/10/21/chartex" xmlns:cx3="http://schemas.microsoft.com/office/drawing/2016/5/9/chartex" xmlns:cx4="http://schemas.microsoft.com/office/drawing/2016/5/10/chartex" xmlns:cx5="http://schemas.microsoft.com/office/drawing/2016/5/11/chartex" xmlns:cx6="http://schemas.microsoft.com/office/drawing/2016/5/12/chartex" xmlns:cx7="http://schemas.microsoft.com/office/drawing/2016/5/13/chartex" xmlns:cx8="http://schemas.microsoft.com/office/drawing/2016/5/14/chartex" xmlns:mc="http://schemas.openxmlformats.org/markup-compatibility/2006" xmlns:aink="http://schemas.microsoft.com/office/drawing/2016/ink" xmlns:am3d="http://schemas.microsoft.com/office/drawing/2017/model3d" xmlns:o="urn:schemas-microsoft-com:office:office" xmlns:r="http://schemas.openxmlformats.org/officeDocument/2006/relationships" xmlns:m="http://schemas.openxmlformats.org/officeDocument/2006/math" xmlns:v="urn:schemas-microsoft-com:vml" xmlns:wp14="http://schemas.microsoft.com/office/word/2010/wordprocessingDrawing" xmlns:wp="http://schemas.openxmlformats.org/drawingml/2006/wordprocessingDrawing" xmlns:w10="urn:schemas-microsoft-com:office:word" xmlns:w="http://schemas.openxmlformats.org/wordprocessingml/2006/main" xmlns:w14="http://schemas.microsoft.com/office/word/2010/wordml" xmlns:w15="http://schemas.microsoft.com/office/word/2012/wordml" xmlns:w16cex="http://schemas.microsoft.com/office/word/2018/wordml/cex" xmlns:w16cid="http://schemas.microsoft.com/office/word/2016/wordml/cid" xmlns:w16="http://schemas.microsoft.com/office/word/2018/wordml" xmlns:w16se="http://schemas.microsoft.com/office/word/2015/wordml/symex" xmlns:wpg="http://schemas.microsoft.com/office/word/2010/wordprocessingGroup" xmlns:wpi="http://schemas.microsoft.com/office/word/2010/wordprocessingInk" xmlns:wne="http://schemas.microsoft.com/office/word/2006/wordml" xmlns:wps="http://schemas.microsoft.com/office/word/2010/wordprocessingShape" mc:Ignorable="w14 w15 w16se w16cid w16 w16cex wp14">
   <w:numPicBullet w:numPicBulletId="0">
     <w:pict>
       <v:shapetype id="_x0000_t75" coordsize="21600,21600" o:spt="75" o:preferrelative="t" path="m@4@5l@4@11@9@11@9@5xe" filled="f" stroked="f">
@@ -3738,17 +6891,17 @@
         <v:path o:extrusionok="f" gradientshapeok="t" o:connecttype="rect"/>
         <o:lock v:ext="edit" aspectratio="t"/>
       </v:shapetype>
-      <v:shape id="_x0000_i1249" type="#_x0000_t75" style="width:3in;height:3in" o:bullet="t"/>
+      <v:shape id="_x0000_i1281" type="#_x0000_t75" style="width:3in;height:3in" o:bullet="t"/>
     </w:pict>
   </w:numPicBullet>
   <w:numPicBullet w:numPicBulletId="1">
     <w:pict>
-      <v:shape id="_x0000_i1250" type="#_x0000_t75" style="width:3in;height:3in" o:bullet="t"/>
+      <v:shape id="_x0000_i1282" type="#_x0000_t75" style="width:3in;height:3in" o:bullet="t"/>
     </w:pict>
   </w:numPicBullet>
   <w:numPicBullet w:numPicBulletId="2">
     <w:pict>
-      <v:shape id="_x0000_i1251" type="#_x0000_t75" style="width:3in;height:3in" o:bullet="t"/>
+      <v:shape id="_x0000_i1283" type="#_x0000_t75" style="width:3in;height:3in" o:bullet="t"/>
     </w:pict>
   </w:numPicBullet>
   <w:abstractNum w:abstractNumId="0" w15:restartNumberingAfterBreak="0">
@@ -4302,6 +7455,184 @@
     </w:lvl>
   </w:abstractNum>
   <w:abstractNum w:abstractNumId="5" w15:restartNumberingAfterBreak="0">
+    <w:nsid w:val="279E023F"/>
+    <w:multiLevelType w:val="hybridMultilevel"/>
+    <w:tmpl w:val="A0BE3D34"/>
+    <w:lvl w:ilvl="0" w:tplc="A2D89FA2">
+      <w:start w:val="1"/>
+      <w:numFmt w:val="decimal"/>
+      <w:lvlText w:val="%1)"/>
+      <w:lvlJc w:val="left"/>
+      <w:pPr>
+        <w:ind w:left="1069" w:hanging="360"/>
+      </w:pPr>
+      <w:rPr>
+        <w:rFonts w:hint="default"/>
+      </w:rPr>
+    </w:lvl>
+    <w:lvl w:ilvl="1" w:tplc="04160019" w:tentative="1">
+      <w:start w:val="1"/>
+      <w:numFmt w:val="lowerLetter"/>
+      <w:lvlText w:val="%2."/>
+      <w:lvlJc w:val="left"/>
+      <w:pPr>
+        <w:ind w:left="1789" w:hanging="360"/>
+      </w:pPr>
+    </w:lvl>
+    <w:lvl w:ilvl="2" w:tplc="0416001B" w:tentative="1">
+      <w:start w:val="1"/>
+      <w:numFmt w:val="lowerRoman"/>
+      <w:lvlText w:val="%3."/>
+      <w:lvlJc w:val="right"/>
+      <w:pPr>
+        <w:ind w:left="2509" w:hanging="180"/>
+      </w:pPr>
+    </w:lvl>
+    <w:lvl w:ilvl="3" w:tplc="0416000F" w:tentative="1">
+      <w:start w:val="1"/>
+      <w:numFmt w:val="decimal"/>
+      <w:lvlText w:val="%4."/>
+      <w:lvlJc w:val="left"/>
+      <w:pPr>
+        <w:ind w:left="3229" w:hanging="360"/>
+      </w:pPr>
+    </w:lvl>
+    <w:lvl w:ilvl="4" w:tplc="04160019" w:tentative="1">
+      <w:start w:val="1"/>
+      <w:numFmt w:val="lowerLetter"/>
+      <w:lvlText w:val="%5."/>
+      <w:lvlJc w:val="left"/>
+      <w:pPr>
+        <w:ind w:left="3949" w:hanging="360"/>
+      </w:pPr>
+    </w:lvl>
+    <w:lvl w:ilvl="5" w:tplc="0416001B" w:tentative="1">
+      <w:start w:val="1"/>
+      <w:numFmt w:val="lowerRoman"/>
+      <w:lvlText w:val="%6."/>
+      <w:lvlJc w:val="right"/>
+      <w:pPr>
+        <w:ind w:left="4669" w:hanging="180"/>
+      </w:pPr>
+    </w:lvl>
+    <w:lvl w:ilvl="6" w:tplc="0416000F" w:tentative="1">
+      <w:start w:val="1"/>
+      <w:numFmt w:val="decimal"/>
+      <w:lvlText w:val="%7."/>
+      <w:lvlJc w:val="left"/>
+      <w:pPr>
+        <w:ind w:left="5389" w:hanging="360"/>
+      </w:pPr>
+    </w:lvl>
+    <w:lvl w:ilvl="7" w:tplc="04160019" w:tentative="1">
+      <w:start w:val="1"/>
+      <w:numFmt w:val="lowerLetter"/>
+      <w:lvlText w:val="%8."/>
+      <w:lvlJc w:val="left"/>
+      <w:pPr>
+        <w:ind w:left="6109" w:hanging="360"/>
+      </w:pPr>
+    </w:lvl>
+    <w:lvl w:ilvl="8" w:tplc="0416001B" w:tentative="1">
+      <w:start w:val="1"/>
+      <w:numFmt w:val="lowerRoman"/>
+      <w:lvlText w:val="%9."/>
+      <w:lvlJc w:val="right"/>
+      <w:pPr>
+        <w:ind w:left="6829" w:hanging="180"/>
+      </w:pPr>
+    </w:lvl>
+  </w:abstractNum>
+  <w:abstractNum w:abstractNumId="6" w15:restartNumberingAfterBreak="0">
+    <w:nsid w:val="28E33FDC"/>
+    <w:multiLevelType w:val="hybridMultilevel"/>
+    <w:tmpl w:val="4EB28AAC"/>
+    <w:lvl w:ilvl="0" w:tplc="CCE4EADA">
+      <w:start w:val="1"/>
+      <w:numFmt w:val="decimal"/>
+      <w:lvlText w:val="%1)"/>
+      <w:lvlJc w:val="left"/>
+      <w:pPr>
+        <w:ind w:left="644" w:hanging="360"/>
+      </w:pPr>
+      <w:rPr>
+        <w:rFonts w:hint="default"/>
+      </w:rPr>
+    </w:lvl>
+    <w:lvl w:ilvl="1" w:tplc="04160019" w:tentative="1">
+      <w:start w:val="1"/>
+      <w:numFmt w:val="lowerLetter"/>
+      <w:lvlText w:val="%2."/>
+      <w:lvlJc w:val="left"/>
+      <w:pPr>
+        <w:ind w:left="1364" w:hanging="360"/>
+      </w:pPr>
+    </w:lvl>
+    <w:lvl w:ilvl="2" w:tplc="0416001B" w:tentative="1">
+      <w:start w:val="1"/>
+      <w:numFmt w:val="lowerRoman"/>
+      <w:lvlText w:val="%3."/>
+      <w:lvlJc w:val="right"/>
+      <w:pPr>
+        <w:ind w:left="2084" w:hanging="180"/>
+      </w:pPr>
+    </w:lvl>
+    <w:lvl w:ilvl="3" w:tplc="0416000F" w:tentative="1">
+      <w:start w:val="1"/>
+      <w:numFmt w:val="decimal"/>
+      <w:lvlText w:val="%4."/>
+      <w:lvlJc w:val="left"/>
+      <w:pPr>
+        <w:ind w:left="2804" w:hanging="360"/>
+      </w:pPr>
+    </w:lvl>
+    <w:lvl w:ilvl="4" w:tplc="04160019" w:tentative="1">
+      <w:start w:val="1"/>
+      <w:numFmt w:val="lowerLetter"/>
+      <w:lvlText w:val="%5."/>
+      <w:lvlJc w:val="left"/>
+      <w:pPr>
+        <w:ind w:left="3524" w:hanging="360"/>
+      </w:pPr>
+    </w:lvl>
+    <w:lvl w:ilvl="5" w:tplc="0416001B" w:tentative="1">
+      <w:start w:val="1"/>
+      <w:numFmt w:val="lowerRoman"/>
+      <w:lvlText w:val="%6."/>
+      <w:lvlJc w:val="right"/>
+      <w:pPr>
+        <w:ind w:left="4244" w:hanging="180"/>
+      </w:pPr>
+    </w:lvl>
+    <w:lvl w:ilvl="6" w:tplc="0416000F" w:tentative="1">
+      <w:start w:val="1"/>
+      <w:numFmt w:val="decimal"/>
+      <w:lvlText w:val="%7."/>
+      <w:lvlJc w:val="left"/>
+      <w:pPr>
+        <w:ind w:left="4964" w:hanging="360"/>
+      </w:pPr>
+    </w:lvl>
+    <w:lvl w:ilvl="7" w:tplc="04160019" w:tentative="1">
+      <w:start w:val="1"/>
+      <w:numFmt w:val="lowerLetter"/>
+      <w:lvlText w:val="%8."/>
+      <w:lvlJc w:val="left"/>
+      <w:pPr>
+        <w:ind w:left="5684" w:hanging="360"/>
+      </w:pPr>
+    </w:lvl>
+    <w:lvl w:ilvl="8" w:tplc="0416001B" w:tentative="1">
+      <w:start w:val="1"/>
+      <w:numFmt w:val="lowerRoman"/>
+      <w:lvlText w:val="%9."/>
+      <w:lvlJc w:val="right"/>
+      <w:pPr>
+        <w:ind w:left="6404" w:hanging="180"/>
+      </w:pPr>
+    </w:lvl>
+  </w:abstractNum>
+  <w:abstractNum w:abstractNumId="7" w15:restartNumberingAfterBreak="0">
     <w:nsid w:val="2DC51E03"/>
     <w:multiLevelType w:val="multilevel"/>
     <w:tmpl w:val="F8626C9E"/>
@@ -4391,7 +7722,7 @@
       </w:pPr>
     </w:lvl>
   </w:abstractNum>
-  <w:abstractNum w:abstractNumId="6" w15:restartNumberingAfterBreak="0">
+  <w:abstractNum w:abstractNumId="8" w15:restartNumberingAfterBreak="0">
     <w:nsid w:val="2E565B70"/>
     <w:multiLevelType w:val="hybridMultilevel"/>
     <w:tmpl w:val="405EC554"/>
@@ -4531,7 +7862,7 @@
       </w:rPr>
     </w:lvl>
   </w:abstractNum>
-  <w:abstractNum w:abstractNumId="7" w15:restartNumberingAfterBreak="0">
+  <w:abstractNum w:abstractNumId="9" w15:restartNumberingAfterBreak="0">
     <w:nsid w:val="37395400"/>
     <w:multiLevelType w:val="hybridMultilevel"/>
     <w:tmpl w:val="BC1AE7CC"/>
@@ -4617,7 +7948,7 @@
       </w:pPr>
     </w:lvl>
   </w:abstractNum>
-  <w:abstractNum w:abstractNumId="8" w15:restartNumberingAfterBreak="0">
+  <w:abstractNum w:abstractNumId="10" w15:restartNumberingAfterBreak="0">
     <w:nsid w:val="373F1ED7"/>
     <w:multiLevelType w:val="hybridMultilevel"/>
     <w:tmpl w:val="9BF2FDA2"/>
@@ -4730,7 +8061,7 @@
       </w:rPr>
     </w:lvl>
   </w:abstractNum>
-  <w:abstractNum w:abstractNumId="9" w15:restartNumberingAfterBreak="0">
+  <w:abstractNum w:abstractNumId="11" w15:restartNumberingAfterBreak="0">
     <w:nsid w:val="392169EA"/>
     <w:multiLevelType w:val="hybridMultilevel"/>
     <w:tmpl w:val="07EE7B9A"/>
@@ -4846,7 +8177,7 @@
       </w:pPr>
     </w:lvl>
   </w:abstractNum>
-  <w:abstractNum w:abstractNumId="10" w15:restartNumberingAfterBreak="0">
+  <w:abstractNum w:abstractNumId="12" w15:restartNumberingAfterBreak="0">
     <w:nsid w:val="3A9648DA"/>
     <w:multiLevelType w:val="hybridMultilevel"/>
     <w:tmpl w:val="202A36B8"/>
@@ -4959,7 +8290,7 @@
       </w:rPr>
     </w:lvl>
   </w:abstractNum>
-  <w:abstractNum w:abstractNumId="11" w15:restartNumberingAfterBreak="0">
+  <w:abstractNum w:abstractNumId="13" w15:restartNumberingAfterBreak="0">
     <w:nsid w:val="3FBD73A6"/>
     <w:multiLevelType w:val="hybridMultilevel"/>
     <w:tmpl w:val="09A2EDB8"/>
@@ -5072,7 +8403,7 @@
       </w:rPr>
     </w:lvl>
   </w:abstractNum>
-  <w:abstractNum w:abstractNumId="12" w15:restartNumberingAfterBreak="0">
+  <w:abstractNum w:abstractNumId="14" w15:restartNumberingAfterBreak="0">
     <w:nsid w:val="441768F1"/>
     <w:multiLevelType w:val="hybridMultilevel"/>
     <w:tmpl w:val="52A4B8AC"/>
@@ -5185,7 +8516,7 @@
       </w:rPr>
     </w:lvl>
   </w:abstractNum>
-  <w:abstractNum w:abstractNumId="13" w15:restartNumberingAfterBreak="0">
+  <w:abstractNum w:abstractNumId="15" w15:restartNumberingAfterBreak="0">
     <w:nsid w:val="44DD224D"/>
     <w:multiLevelType w:val="hybridMultilevel"/>
     <w:tmpl w:val="E5EAFD78"/>
@@ -5274,7 +8605,98 @@
       </w:pPr>
     </w:lvl>
   </w:abstractNum>
-  <w:abstractNum w:abstractNumId="14" w15:restartNumberingAfterBreak="0">
+  <w:abstractNum w:abstractNumId="16" w15:restartNumberingAfterBreak="0">
+    <w:nsid w:val="4EC80DF4"/>
+    <w:multiLevelType w:val="hybridMultilevel"/>
+    <w:tmpl w:val="FE3A8A58"/>
+    <w:lvl w:ilvl="0" w:tplc="E182B1EA">
+      <w:start w:val="1"/>
+      <w:numFmt w:val="decimal"/>
+      <w:lvlText w:val="%1)"/>
+      <w:lvlJc w:val="left"/>
+      <w:pPr>
+        <w:ind w:left="644" w:hanging="360"/>
+      </w:pPr>
+      <w:rPr>
+        <w:rFonts w:hint="default"/>
+        <w:i w:val="0"/>
+        <w:iCs w:val="0"/>
+      </w:rPr>
+    </w:lvl>
+    <w:lvl w:ilvl="1" w:tplc="04160019" w:tentative="1">
+      <w:start w:val="1"/>
+      <w:numFmt w:val="lowerLetter"/>
+      <w:lvlText w:val="%2."/>
+      <w:lvlJc w:val="left"/>
+      <w:pPr>
+        <w:ind w:left="1440" w:hanging="360"/>
+      </w:pPr>
+    </w:lvl>
+    <w:lvl w:ilvl="2" w:tplc="0416001B" w:tentative="1">
+      <w:start w:val="1"/>
+      <w:numFmt w:val="lowerRoman"/>
+      <w:lvlText w:val="%3."/>
+      <w:lvlJc w:val="right"/>
+      <w:pPr>
+        <w:ind w:left="2160" w:hanging="180"/>
+      </w:pPr>
+    </w:lvl>
+    <w:lvl w:ilvl="3" w:tplc="0416000F" w:tentative="1">
+      <w:start w:val="1"/>
+      <w:numFmt w:val="decimal"/>
+      <w:lvlText w:val="%4."/>
+      <w:lvlJc w:val="left"/>
+      <w:pPr>
+        <w:ind w:left="2880" w:hanging="360"/>
+      </w:pPr>
+    </w:lvl>
+    <w:lvl w:ilvl="4" w:tplc="04160019" w:tentative="1">
+      <w:start w:val="1"/>
+      <w:numFmt w:val="lowerLetter"/>
+      <w:lvlText w:val="%5."/>
+      <w:lvlJc w:val="left"/>
+      <w:pPr>
+        <w:ind w:left="3600" w:hanging="360"/>
+      </w:pPr>
+    </w:lvl>
+    <w:lvl w:ilvl="5" w:tplc="0416001B" w:tentative="1">
+      <w:start w:val="1"/>
+      <w:numFmt w:val="lowerRoman"/>
+      <w:lvlText w:val="%6."/>
+      <w:lvlJc w:val="right"/>
+      <w:pPr>
+        <w:ind w:left="4320" w:hanging="180"/>
+      </w:pPr>
+    </w:lvl>
+    <w:lvl w:ilvl="6" w:tplc="0416000F" w:tentative="1">
+      <w:start w:val="1"/>
+      <w:numFmt w:val="decimal"/>
+      <w:lvlText w:val="%7."/>
+      <w:lvlJc w:val="left"/>
+      <w:pPr>
+        <w:ind w:left="5040" w:hanging="360"/>
+      </w:pPr>
+    </w:lvl>
+    <w:lvl w:ilvl="7" w:tplc="04160019" w:tentative="1">
+      <w:start w:val="1"/>
+      <w:numFmt w:val="lowerLetter"/>
+      <w:lvlText w:val="%8."/>
+      <w:lvlJc w:val="left"/>
+      <w:pPr>
+        <w:ind w:left="5760" w:hanging="360"/>
+      </w:pPr>
+    </w:lvl>
+    <w:lvl w:ilvl="8" w:tplc="0416001B" w:tentative="1">
+      <w:start w:val="1"/>
+      <w:numFmt w:val="lowerRoman"/>
+      <w:lvlText w:val="%9."/>
+      <w:lvlJc w:val="right"/>
+      <w:pPr>
+        <w:ind w:left="6480" w:hanging="180"/>
+      </w:pPr>
+    </w:lvl>
+  </w:abstractNum>
+  <w:abstractNum w:abstractNumId="17" w15:restartNumberingAfterBreak="0">
     <w:nsid w:val="544B0D61"/>
     <w:multiLevelType w:val="hybridMultilevel"/>
     <w:tmpl w:val="CA8AC2B4"/>
@@ -5387,7 +8809,7 @@
       </w:rPr>
     </w:lvl>
   </w:abstractNum>
-  <w:abstractNum w:abstractNumId="15" w15:restartNumberingAfterBreak="0">
+  <w:abstractNum w:abstractNumId="18" w15:restartNumberingAfterBreak="0">
     <w:nsid w:val="56205988"/>
     <w:multiLevelType w:val="hybridMultilevel"/>
     <w:tmpl w:val="1D0A68C4"/>
@@ -5500,7 +8922,7 @@
       </w:rPr>
     </w:lvl>
   </w:abstractNum>
-  <w:abstractNum w:abstractNumId="16" w15:restartNumberingAfterBreak="0">
+  <w:abstractNum w:abstractNumId="19" w15:restartNumberingAfterBreak="0">
     <w:nsid w:val="577566B3"/>
     <w:multiLevelType w:val="hybridMultilevel"/>
     <w:tmpl w:val="69488FD2"/>
@@ -5640,7 +9062,7 @@
       </w:rPr>
     </w:lvl>
   </w:abstractNum>
-  <w:abstractNum w:abstractNumId="17" w15:restartNumberingAfterBreak="0">
+  <w:abstractNum w:abstractNumId="20" w15:restartNumberingAfterBreak="0">
     <w:nsid w:val="5FA87471"/>
     <w:multiLevelType w:val="hybridMultilevel"/>
     <w:tmpl w:val="AB402598"/>
@@ -5753,7 +9175,7 @@
       </w:rPr>
     </w:lvl>
   </w:abstractNum>
-  <w:abstractNum w:abstractNumId="18" w15:restartNumberingAfterBreak="0">
+  <w:abstractNum w:abstractNumId="21" w15:restartNumberingAfterBreak="0">
     <w:nsid w:val="686B1BCE"/>
     <w:multiLevelType w:val="hybridMultilevel"/>
     <w:tmpl w:val="AAE81FDE"/>
@@ -5866,7 +9288,7 @@
       </w:rPr>
     </w:lvl>
   </w:abstractNum>
-  <w:abstractNum w:abstractNumId="19" w15:restartNumberingAfterBreak="0">
+  <w:abstractNum w:abstractNumId="22" w15:restartNumberingAfterBreak="0">
     <w:nsid w:val="69F0690B"/>
     <w:multiLevelType w:val="hybridMultilevel"/>
     <w:tmpl w:val="25FECC7C"/>
@@ -5983,71 +9405,83 @@
     <w:abstractNumId w:val="0"/>
   </w:num>
   <w:num w:numId="2">
-    <w:abstractNumId w:val="6"/>
+    <w:abstractNumId w:val="8"/>
   </w:num>
   <w:num w:numId="3">
     <w:abstractNumId w:val="1"/>
   </w:num>
   <w:num w:numId="4">
-    <w:abstractNumId w:val="16"/>
+    <w:abstractNumId w:val="19"/>
   </w:num>
   <w:num w:numId="5">
-    <w:abstractNumId w:val="15"/>
+    <w:abstractNumId w:val="18"/>
   </w:num>
   <w:num w:numId="6">
     <w:abstractNumId w:val="4"/>
   </w:num>
   <w:num w:numId="7">
-    <w:abstractNumId w:val="9"/>
+    <w:abstractNumId w:val="11"/>
   </w:num>
   <w:num w:numId="8">
-    <w:abstractNumId w:val="5"/>
+    <w:abstractNumId w:val="7"/>
   </w:num>
   <w:num w:numId="9">
     <w:abstractNumId w:val="3"/>
   </w:num>
   <w:num w:numId="10">
+    <w:abstractNumId w:val="15"/>
+  </w:num>
+  <w:num w:numId="11">
     <w:abstractNumId w:val="13"/>
   </w:num>
-  <w:num w:numId="11">
-    <w:abstractNumId w:val="11"/>
-  </w:num>
   <w:num w:numId="12">
-    <w:abstractNumId w:val="7"/>
+    <w:abstractNumId w:val="9"/>
   </w:num>
   <w:num w:numId="13">
-    <w:abstractNumId w:val="18"/>
+    <w:abstractNumId w:val="21"/>
   </w:num>
   <w:num w:numId="14">
-    <w:abstractNumId w:val="12"/>
+    <w:abstractNumId w:val="14"/>
   </w:num>
   <w:num w:numId="15">
-    <w:abstractNumId w:val="14"/>
+    <w:abstractNumId w:val="17"/>
   </w:num>
   <w:num w:numId="16">
-    <w:abstractNumId w:val="8"/>
+    <w:abstractNumId w:val="10"/>
   </w:num>
   <w:num w:numId="17">
-    <w:abstractNumId w:val="17"/>
+    <w:abstractNumId w:val="20"/>
   </w:num>
   <w:num w:numId="18">
-    <w:abstractNumId w:val="19"/>
+    <w:abstractNumId w:val="22"/>
   </w:num>
   <w:num w:numId="19">
     <w:abstractNumId w:val="2"/>
   </w:num>
   <w:num w:numId="20">
-    <w:abstractNumId w:val="10"/>
+    <w:abstractNumId w:val="12"/>
   </w:num>
   <w:num w:numId="21">
     <w:abstractNumId w:val="4"/>
+  </w:num>
+  <w:num w:numId="22">
+    <w:abstractNumId w:val="4"/>
+  </w:num>
+  <w:num w:numId="23">
+    <w:abstractNumId w:val="5"/>
+  </w:num>
+  <w:num w:numId="24">
+    <w:abstractNumId w:val="16"/>
+  </w:num>
+  <w:num w:numId="25">
+    <w:abstractNumId w:val="6"/>
   </w:num>
   <w:numIdMacAtCleanup w:val="7"/>
 </w:numbering>
 </file>
 
 <file path=word/styles.xml><?xml version="1.0" encoding="utf-8"?>
-<w:styles xmlns:mc="http://schemas.openxmlformats.org/markup-compatibility/2006" xmlns:r="http://schemas.openxmlformats.org/officeDocument/2006/relationships" xmlns:w="http://schemas.openxmlformats.org/wordprocessingml/2006/main" xmlns:w14="http://schemas.microsoft.com/office/word/2010/wordml" xmlns:w15="http://schemas.microsoft.com/office/word/2012/wordml" xmlns:w16se="http://schemas.microsoft.com/office/word/2015/wordml/symex" mc:Ignorable="w14 w15 w16se">
+<w:styles xmlns:mc="http://schemas.openxmlformats.org/markup-compatibility/2006" xmlns:r="http://schemas.openxmlformats.org/officeDocument/2006/relationships" xmlns:w="http://schemas.openxmlformats.org/wordprocessingml/2006/main" xmlns:w14="http://schemas.microsoft.com/office/word/2010/wordml" xmlns:w15="http://schemas.microsoft.com/office/word/2012/wordml" xmlns:w16cex="http://schemas.microsoft.com/office/word/2018/wordml/cex" xmlns:w16cid="http://schemas.microsoft.com/office/word/2016/wordml/cid" xmlns:w16="http://schemas.microsoft.com/office/word/2018/wordml" xmlns:w16se="http://schemas.microsoft.com/office/word/2015/wordml/symex" mc:Ignorable="w14 w15 w16se w16cid w16 w16cex">
   <w:docDefaults>
     <w:rPrDefault>
       <w:rPr>
@@ -6057,7 +9491,7 @@
     </w:rPrDefault>
     <w:pPrDefault/>
   </w:docDefaults>
-  <w:latentStyles w:defLockedState="0" w:defUIPriority="99" w:defSemiHidden="0" w:defUnhideWhenUsed="0" w:defQFormat="0" w:count="371">
+  <w:latentStyles w:defLockedState="0" w:defUIPriority="99" w:defSemiHidden="0" w:defUnhideWhenUsed="0" w:defQFormat="0" w:count="376">
     <w:lsdException w:name="Normal" w:uiPriority="0" w:qFormat="1"/>
     <w:lsdException w:name="heading 1" w:uiPriority="0" w:qFormat="1"/>
     <w:lsdException w:name="heading 2" w:uiPriority="9" w:qFormat="1"/>
@@ -6429,6 +9863,11 @@
     <w:lsdException w:name="List Table 5 Dark Accent 6" w:uiPriority="50"/>
     <w:lsdException w:name="List Table 6 Colorful Accent 6" w:uiPriority="51"/>
     <w:lsdException w:name="List Table 7 Colorful Accent 6" w:uiPriority="52"/>
+    <w:lsdException w:name="Mention" w:semiHidden="1" w:unhideWhenUsed="1"/>
+    <w:lsdException w:name="Smart Hyperlink" w:semiHidden="1" w:unhideWhenUsed="1"/>
+    <w:lsdException w:name="Hashtag" w:semiHidden="1" w:unhideWhenUsed="1"/>
+    <w:lsdException w:name="Unresolved Mention" w:semiHidden="1" w:unhideWhenUsed="1"/>
+    <w:lsdException w:name="Smart Link" w:semiHidden="1" w:unhideWhenUsed="1"/>
   </w:latentStyles>
   <w:style w:type="paragraph" w:default="1" w:styleId="Normal">
     <w:name w:val="Normal"/>
@@ -7685,6 +11124,16 @@
       <w:szCs w:val="24"/>
     </w:rPr>
   </w:style>
+  <w:style w:type="character" w:customStyle="1" w:styleId="username-1a8oiy">
+    <w:name w:val="username-1a8oiy"/>
+    <w:basedOn w:val="Fontepargpadro"/>
+    <w:rsid w:val="00604029"/>
+  </w:style>
+  <w:style w:type="character" w:customStyle="1" w:styleId="timestamp-3zcmnb">
+    <w:name w:val="timestamp-3zcmnb"/>
+    <w:basedOn w:val="Fontepargpadro"/>
+    <w:rsid w:val="00604029"/>
+  </w:style>
 </w:styles>
 </file>
 

</xml_diff>

<commit_message>
Alterações no docmento a pedido do Prof. Mineda
</commit_message>
<xml_diff>
--- a/doc/technical_report_.docx
+++ b/doc/technical_report_.docx
@@ -1665,19 +1665,19 @@
     </w:p>
     <w:p>
       <w:r>
-        <w:t>Esse trabalho aborda o problema de gerenciamento e execução de casos de teste a partir de um sistema web que evita que casos de teste sejam especificados</w:t>
-      </w:r>
-      <w:r>
-        <w:t xml:space="preserve"> e executados</w:t>
-      </w:r>
-      <w:r>
-        <w:t xml:space="preserve"> a partir de </w:t>
-      </w:r>
-      <w:r>
-        <w:t>interação direta com</w:t>
-      </w:r>
-      <w:r>
-        <w:t xml:space="preserve"> código-fonte de teste. Dessa maneira, casos de teste podem ser facilmente gerenciados e reutilizados</w:t>
+        <w:t xml:space="preserve">Esse trabalho aborda o problema de gerenciamento e execução de casos de teste a partir de um sistema web que </w:t>
+      </w:r>
+      <w:r>
+        <w:t>facilita</w:t>
+      </w:r>
+      <w:r>
+        <w:t xml:space="preserve"> </w:t>
+      </w:r>
+      <w:r>
+        <w:t>a execução, podendo ser feito por pessoas que não possui conhecimento técnico em linguagens de programação</w:t>
+      </w:r>
+      <w:r>
+        <w:t>. Dessa maneira, casos de teste podem ser facilmente gerenciados e reutilizados</w:t>
       </w:r>
       <w:r>
         <w:t>,</w:t>
@@ -1689,7 +1689,24 @@
         <w:t>em sistemas web similares</w:t>
       </w:r>
       <w:r>
-        <w:t>, sem interação com código para teste.</w:t>
+        <w:t>.</w:t>
+      </w:r>
+    </w:p>
+    <w:p>
+      <w:r>
+        <w:t xml:space="preserve">O trabalho foi realizado para obtenção de créditos na disciplina de Laboratório de Engenharia de Software sob a supervisão do </w:t>
+      </w:r>
+      <w:r>
+        <w:t>Dr.</w:t>
+      </w:r>
+      <w:r>
+        <w:t xml:space="preserve"> </w:t>
+      </w:r>
+      <w:r>
+        <w:t>Fabrício Galende Marques de Carvalho</w:t>
+      </w:r>
+      <w:r>
+        <w:t xml:space="preserve">. </w:t>
       </w:r>
     </w:p>
     <w:p>
@@ -1707,7 +1724,11 @@
         <w:t xml:space="preserve">O objetivo deste projeto </w:t>
       </w:r>
       <w:r>
-        <w:t>é desenvolver um sistema web que interaja com um conjunto de ferramentas de teste, tais como o Selenium Web Driver e o JUnit 5, de modo a automatizar a execução de testes em sistemas web</w:t>
+        <w:t xml:space="preserve">é desenvolver um sistema web que interaja com um conjunto de ferramentas de teste, tais como o Selenium Web Driver e o JUnit 5, de modo a automatizar </w:t>
+      </w:r>
+      <w:r>
+        <w:lastRenderedPageBreak/>
+        <w:t>a execução de testes em sistemas web</w:t>
       </w:r>
       <w:r>
         <w:t xml:space="preserve">, </w:t>
@@ -1718,7 +1739,6 @@
     </w:p>
     <w:p>
       <w:r>
-        <w:lastRenderedPageBreak/>
         <w:t>Além disso, o sistema a ser desenvolvido deverá ser capaz de gerenciar os casos de teste de modo a permitir sua reutilização em sistemas similares.</w:t>
       </w:r>
     </w:p>
@@ -1893,6 +1913,9 @@
       <w:r>
         <w:t>HTML 5</w:t>
       </w:r>
+      <w:r>
+        <w:t>;</w:t>
+      </w:r>
     </w:p>
     <w:p>
       <w:pPr>
@@ -1905,6 +1928,9 @@
       <w:r>
         <w:t>CSS 3</w:t>
       </w:r>
+      <w:r>
+        <w:t>;</w:t>
+      </w:r>
     </w:p>
     <w:p>
       <w:pPr>
@@ -1917,6 +1943,9 @@
       <w:r>
         <w:t>JavaScript (ECMAScript 6)</w:t>
       </w:r>
+      <w:r>
+        <w:t>;</w:t>
+      </w:r>
     </w:p>
     <w:p>
       <w:pPr>
@@ -1927,7 +1956,10 @@
         </w:numPr>
       </w:pPr>
       <w:r>
-        <w:t xml:space="preserve">Angular 7 </w:t>
+        <w:t>Angular 7</w:t>
+      </w:r>
+      <w:r>
+        <w:t>;</w:t>
       </w:r>
     </w:p>
     <w:p>
@@ -1941,6 +1973,9 @@
       <w:r>
         <w:t>Spring Boot</w:t>
       </w:r>
+      <w:r>
+        <w:t>;</w:t>
+      </w:r>
     </w:p>
     <w:p>
       <w:pPr>
@@ -1952,6 +1987,9 @@
       </w:pPr>
       <w:r>
         <w:t>MySQL</w:t>
+      </w:r>
+      <w:r>
+        <w:t>.</w:t>
       </w:r>
     </w:p>
     <w:p>
@@ -2003,7 +2041,10 @@
         <w:t>Usuário</w:t>
       </w:r>
       <w:r>
-        <w:t xml:space="preserve"> – Responsável por cadastrar, gerenciar e executar os casos de teste cadastrados no sistema. </w:t>
+        <w:t xml:space="preserve"> – Responsável por cadastrar, gerenciar e executar os casos de teste cadastrados no sistema</w:t>
+      </w:r>
+      <w:r>
+        <w:t>;</w:t>
       </w:r>
     </w:p>
     <w:p>
@@ -2022,7 +2063,10 @@
         <w:t xml:space="preserve">FrontEnd </w:t>
       </w:r>
       <w:r>
-        <w:t xml:space="preserve">– Responsável pela interface com usuário. </w:t>
+        <w:t>– Responsável pela interface com usuári</w:t>
+      </w:r>
+      <w:r>
+        <w:t>o;</w:t>
       </w:r>
     </w:p>
     <w:p>
@@ -2291,7 +2335,10 @@
         <w:t>Caso_teste</w:t>
       </w:r>
       <w:r>
-        <w:t xml:space="preserve"> – Armazena os dados do caso de teste cadastrado pelo usuário;</w:t>
+        <w:t xml:space="preserve"> – Armazena os dados do caso de teste cadastrado pelo usuário</w:t>
+      </w:r>
+      <w:r>
+        <w:t>.</w:t>
       </w:r>
     </w:p>
     <w:p/>
@@ -3691,7 +3738,10 @@
         </w:numPr>
       </w:pPr>
       <w:r>
-        <w:t xml:space="preserve">Define o tamanho da janela do navegador, maximizando. </w:t>
+        <w:t>Define o tamanho da janela do navegador, maximizando</w:t>
+      </w:r>
+      <w:r>
+        <w:t>;</w:t>
       </w:r>
     </w:p>
     <w:p>
@@ -3812,10 +3862,10 @@
           <w:noProof/>
         </w:rPr>
         <w:drawing>
-          <wp:inline distT="0" distB="0" distL="0" distR="0" wp14:anchorId="0D9F7465" wp14:editId="64DAAACF">
-            <wp:extent cx="5760720" cy="1849120"/>
-            <wp:effectExtent l="0" t="0" r="0" b="0"/>
-            <wp:docPr id="12" name="Imagem 12" descr="Texto&#10;&#10;Descrição gerada automaticamente"/>
+          <wp:inline distT="0" distB="0" distL="0" distR="0" wp14:anchorId="7D36B10D" wp14:editId="5A402C9D">
+            <wp:extent cx="5981700" cy="1993900"/>
+            <wp:effectExtent l="0" t="0" r="0" b="6350"/>
+            <wp:docPr id="19" name="Imagem 19" descr="Interface gráfica do usuário, Texto&#10;&#10;Descrição gerada automaticamente"/>
             <wp:cNvGraphicFramePr>
               <a:graphicFrameLocks xmlns:a="http://schemas.openxmlformats.org/drawingml/2006/main" noChangeAspect="1"/>
             </wp:cNvGraphicFramePr>
@@ -3823,7 +3873,7 @@
               <a:graphicData uri="http://schemas.openxmlformats.org/drawingml/2006/picture">
                 <pic:pic xmlns:pic="http://schemas.openxmlformats.org/drawingml/2006/picture">
                   <pic:nvPicPr>
-                    <pic:cNvPr id="12" name="Imagem 12" descr="Texto&#10;&#10;Descrição gerada automaticamente"/>
+                    <pic:cNvPr id="19" name="Imagem 19" descr="Interface gráfica do usuário, Texto&#10;&#10;Descrição gerada automaticamente"/>
                     <pic:cNvPicPr/>
                   </pic:nvPicPr>
                   <pic:blipFill>
@@ -3841,7 +3891,7 @@
                   <pic:spPr>
                     <a:xfrm>
                       <a:off x="0" y="0"/>
-                      <a:ext cx="5760720" cy="1849120"/>
+                      <a:ext cx="5981700" cy="1993900"/>
                     </a:xfrm>
                     <a:prstGeom prst="rect">
                       <a:avLst/>
@@ -3882,8 +3932,11 @@
         <w:t>O autor</w:t>
       </w:r>
     </w:p>
-    <w:p/>
-    <w:p/>
+    <w:p>
+      <w:pPr>
+        <w:ind w:firstLine="0"/>
+      </w:pPr>
+    </w:p>
     <w:p>
       <w:r>
         <w:lastRenderedPageBreak/>
@@ -3911,19 +3964,7 @@
         </w:numPr>
       </w:pPr>
       <w:r>
-        <w:t>P</w:t>
-      </w:r>
-      <w:r>
-        <w:t>assa por todos os testes do caso de teste recebido pela API</w:t>
-      </w:r>
-      <w:r>
-        <w:t xml:space="preserve"> e c</w:t>
-      </w:r>
-      <w:r>
-        <w:t>hama o método de execução de acordo com o tipo do teste</w:t>
-      </w:r>
-      <w:r>
-        <w:t>;</w:t>
+        <w:t>Passa por todos os testes do caso de teste recebido pela API e chama o método de execução de acordo com o tipo do teste;</w:t>
       </w:r>
     </w:p>
     <w:p>
@@ -3935,7 +3976,10 @@
         </w:numPr>
       </w:pPr>
       <w:r>
-        <w:t xml:space="preserve">Retorna a mensagem de sucesso. </w:t>
+        <w:t>Retorna a mensagem de sucesso</w:t>
+      </w:r>
+      <w:r>
+        <w:t>;</w:t>
       </w:r>
     </w:p>
     <w:p>
@@ -4028,10 +4072,10 @@
           <w:noProof/>
         </w:rPr>
         <w:drawing>
-          <wp:inline distT="0" distB="0" distL="0" distR="0" wp14:anchorId="397ECB32" wp14:editId="3FC165BE">
-            <wp:extent cx="5443870" cy="6289974"/>
-            <wp:effectExtent l="0" t="0" r="4445" b="0"/>
-            <wp:docPr id="20" name="Imagem 20" descr="Uma imagem contendo Texto&#10;&#10;Descrição gerada automaticamente"/>
+          <wp:inline distT="0" distB="0" distL="0" distR="0" wp14:anchorId="741DA935" wp14:editId="327DA7E7">
+            <wp:extent cx="5760720" cy="6292850"/>
+            <wp:effectExtent l="0" t="0" r="0" b="0"/>
+            <wp:docPr id="21" name="Imagem 21" descr="Texto&#10;&#10;Descrição gerada automaticamente"/>
             <wp:cNvGraphicFramePr>
               <a:graphicFrameLocks xmlns:a="http://schemas.openxmlformats.org/drawingml/2006/main" noChangeAspect="1"/>
             </wp:cNvGraphicFramePr>
@@ -4039,7 +4083,7 @@
               <a:graphicData uri="http://schemas.openxmlformats.org/drawingml/2006/picture">
                 <pic:pic xmlns:pic="http://schemas.openxmlformats.org/drawingml/2006/picture">
                   <pic:nvPicPr>
-                    <pic:cNvPr id="20" name="Imagem 20" descr="Uma imagem contendo Texto&#10;&#10;Descrição gerada automaticamente"/>
+                    <pic:cNvPr id="21" name="Imagem 21" descr="Texto&#10;&#10;Descrição gerada automaticamente"/>
                     <pic:cNvPicPr/>
                   </pic:nvPicPr>
                   <pic:blipFill>
@@ -4057,7 +4101,7 @@
                   <pic:spPr>
                     <a:xfrm>
                       <a:off x="0" y="0"/>
-                      <a:ext cx="5446068" cy="6292513"/>
+                      <a:ext cx="5760720" cy="6292850"/>
                     </a:xfrm>
                     <a:prstGeom prst="rect">
                       <a:avLst/>
@@ -4101,16 +4145,7 @@
     <w:p>
       <w:r>
         <w:lastRenderedPageBreak/>
-        <w:t>A Figura 1</w:t>
-      </w:r>
-      <w:r>
-        <w:t>1</w:t>
-      </w:r>
-      <w:r>
-        <w:t xml:space="preserve"> apresenta o método responsável por </w:t>
-      </w:r>
-      <w:r>
-        <w:t xml:space="preserve">retornar o by de acordo com o que foi definido para o teste recebido como parâmetro. </w:t>
+        <w:t xml:space="preserve">A Figura 11 apresenta o método responsável por retornar o by de acordo com o que foi definido para o teste recebido como parâmetro. </w:t>
       </w:r>
     </w:p>
     <w:p>
@@ -4191,10 +4226,10 @@
           <w:noProof/>
         </w:rPr>
         <w:drawing>
-          <wp:inline distT="0" distB="0" distL="0" distR="0" wp14:anchorId="74E0257E" wp14:editId="6F66A498">
-            <wp:extent cx="4772691" cy="3315163"/>
-            <wp:effectExtent l="0" t="0" r="0" b="0"/>
-            <wp:docPr id="22" name="Imagem 22" descr="Uma imagem contendo pessoa&#10;&#10;Descrição gerada automaticamente"/>
+          <wp:inline distT="0" distB="0" distL="0" distR="0" wp14:anchorId="0A6D4CDD" wp14:editId="25982B5F">
+            <wp:extent cx="5760720" cy="2753360"/>
+            <wp:effectExtent l="0" t="0" r="0" b="8890"/>
+            <wp:docPr id="23" name="Imagem 23"/>
             <wp:cNvGraphicFramePr>
               <a:graphicFrameLocks xmlns:a="http://schemas.openxmlformats.org/drawingml/2006/main" noChangeAspect="1"/>
             </wp:cNvGraphicFramePr>
@@ -4202,17 +4237,11 @@
               <a:graphicData uri="http://schemas.openxmlformats.org/drawingml/2006/picture">
                 <pic:pic xmlns:pic="http://schemas.openxmlformats.org/drawingml/2006/picture">
                   <pic:nvPicPr>
-                    <pic:cNvPr id="22" name="Imagem 22" descr="Uma imagem contendo pessoa&#10;&#10;Descrição gerada automaticamente"/>
+                    <pic:cNvPr id="1" name=""/>
                     <pic:cNvPicPr/>
                   </pic:nvPicPr>
                   <pic:blipFill>
-                    <a:blip r:embed="rId19">
-                      <a:extLst>
-                        <a:ext uri="{28A0092B-C50C-407E-A947-70E740481C1C}">
-                          <a14:useLocalDpi xmlns:a14="http://schemas.microsoft.com/office/drawing/2010/main" val="0"/>
-                        </a:ext>
-                      </a:extLst>
-                    </a:blip>
+                    <a:blip r:embed="rId19"/>
                     <a:stretch>
                       <a:fillRect/>
                     </a:stretch>
@@ -4220,7 +4249,7 @@
                   <pic:spPr>
                     <a:xfrm>
                       <a:off x="0" y="0"/>
-                      <a:ext cx="4772691" cy="3315163"/>
+                      <a:ext cx="5760720" cy="2753360"/>
                     </a:xfrm>
                     <a:prstGeom prst="rect">
                       <a:avLst/>
@@ -4271,20 +4300,257 @@
         <w:spacing w:line="240" w:lineRule="auto"/>
         <w:jc w:val="left"/>
       </w:pPr>
-      <w:r>
-        <w:t>A</w:t>
-      </w:r>
-      <w:r>
-        <w:t xml:space="preserve">s figuras abaixo </w:t>
-      </w:r>
-      <w:r>
-        <w:t>apresenta</w:t>
-      </w:r>
-      <w:r>
-        <w:t xml:space="preserve">m alguns dos métodos referentes as ações do selenium. </w:t>
-      </w:r>
-      <w:r>
-        <w:t xml:space="preserve"> </w:t>
+    </w:p>
+    <w:p>
+      <w:pPr>
+        <w:spacing w:line="240" w:lineRule="auto"/>
+        <w:jc w:val="left"/>
+      </w:pPr>
+    </w:p>
+    <w:p>
+      <w:pPr>
+        <w:spacing w:line="240" w:lineRule="auto"/>
+        <w:jc w:val="left"/>
+      </w:pPr>
+    </w:p>
+    <w:p>
+      <w:pPr>
+        <w:spacing w:line="240" w:lineRule="auto"/>
+        <w:jc w:val="left"/>
+      </w:pPr>
+    </w:p>
+    <w:p>
+      <w:pPr>
+        <w:spacing w:line="240" w:lineRule="auto"/>
+        <w:jc w:val="left"/>
+      </w:pPr>
+    </w:p>
+    <w:p>
+      <w:pPr>
+        <w:spacing w:line="240" w:lineRule="auto"/>
+        <w:jc w:val="left"/>
+      </w:pPr>
+    </w:p>
+    <w:p>
+      <w:pPr>
+        <w:spacing w:line="240" w:lineRule="auto"/>
+        <w:jc w:val="left"/>
+      </w:pPr>
+    </w:p>
+    <w:p>
+      <w:pPr>
+        <w:spacing w:line="240" w:lineRule="auto"/>
+        <w:jc w:val="left"/>
+      </w:pPr>
+    </w:p>
+    <w:p>
+      <w:pPr>
+        <w:spacing w:line="240" w:lineRule="auto"/>
+        <w:jc w:val="left"/>
+      </w:pPr>
+    </w:p>
+    <w:p>
+      <w:pPr>
+        <w:spacing w:line="240" w:lineRule="auto"/>
+        <w:jc w:val="left"/>
+      </w:pPr>
+    </w:p>
+    <w:p>
+      <w:pPr>
+        <w:spacing w:line="240" w:lineRule="auto"/>
+        <w:jc w:val="left"/>
+      </w:pPr>
+    </w:p>
+    <w:p>
+      <w:pPr>
+        <w:spacing w:line="240" w:lineRule="auto"/>
+        <w:jc w:val="left"/>
+      </w:pPr>
+    </w:p>
+    <w:p>
+      <w:pPr>
+        <w:spacing w:line="240" w:lineRule="auto"/>
+        <w:jc w:val="left"/>
+      </w:pPr>
+    </w:p>
+    <w:p>
+      <w:pPr>
+        <w:spacing w:line="240" w:lineRule="auto"/>
+        <w:jc w:val="left"/>
+      </w:pPr>
+    </w:p>
+    <w:p>
+      <w:pPr>
+        <w:spacing w:line="240" w:lineRule="auto"/>
+        <w:jc w:val="left"/>
+      </w:pPr>
+    </w:p>
+    <w:p>
+      <w:pPr>
+        <w:spacing w:line="240" w:lineRule="auto"/>
+        <w:jc w:val="left"/>
+      </w:pPr>
+    </w:p>
+    <w:p>
+      <w:pPr>
+        <w:spacing w:line="240" w:lineRule="auto"/>
+        <w:jc w:val="left"/>
+      </w:pPr>
+    </w:p>
+    <w:p>
+      <w:pPr>
+        <w:spacing w:line="240" w:lineRule="auto"/>
+        <w:jc w:val="left"/>
+      </w:pPr>
+    </w:p>
+    <w:p>
+      <w:pPr>
+        <w:spacing w:line="240" w:lineRule="auto"/>
+        <w:jc w:val="left"/>
+      </w:pPr>
+    </w:p>
+    <w:p>
+      <w:pPr>
+        <w:spacing w:line="240" w:lineRule="auto"/>
+        <w:jc w:val="left"/>
+      </w:pPr>
+    </w:p>
+    <w:p>
+      <w:pPr>
+        <w:spacing w:line="240" w:lineRule="auto"/>
+        <w:jc w:val="left"/>
+      </w:pPr>
+    </w:p>
+    <w:p>
+      <w:pPr>
+        <w:spacing w:line="240" w:lineRule="auto"/>
+        <w:jc w:val="left"/>
+      </w:pPr>
+    </w:p>
+    <w:p>
+      <w:pPr>
+        <w:spacing w:line="240" w:lineRule="auto"/>
+        <w:jc w:val="left"/>
+      </w:pPr>
+    </w:p>
+    <w:p>
+      <w:pPr>
+        <w:spacing w:line="240" w:lineRule="auto"/>
+        <w:jc w:val="left"/>
+      </w:pPr>
+    </w:p>
+    <w:p>
+      <w:pPr>
+        <w:spacing w:line="240" w:lineRule="auto"/>
+        <w:jc w:val="left"/>
+      </w:pPr>
+    </w:p>
+    <w:p>
+      <w:pPr>
+        <w:spacing w:line="240" w:lineRule="auto"/>
+        <w:jc w:val="left"/>
+      </w:pPr>
+      <w:r>
+        <w:lastRenderedPageBreak/>
+        <w:t>A Figura 12 apresenta uma parte dos métodos referente as ações do Selenium. Os pontos numerados correspondem a:</w:t>
+      </w:r>
+    </w:p>
+    <w:p>
+      <w:pPr>
+        <w:pStyle w:val="PargrafodaLista"/>
+        <w:numPr>
+          <w:ilvl w:val="0"/>
+          <w:numId w:val="26"/>
+        </w:numPr>
+        <w:spacing w:line="240" w:lineRule="auto"/>
+        <w:jc w:val="left"/>
+      </w:pPr>
+      <w:r>
+        <w:t>Abre o navegador com a URL inserida pelo usuário;</w:t>
+      </w:r>
+    </w:p>
+    <w:p>
+      <w:pPr>
+        <w:pStyle w:val="PargrafodaLista"/>
+        <w:numPr>
+          <w:ilvl w:val="0"/>
+          <w:numId w:val="26"/>
+        </w:numPr>
+        <w:spacing w:line="240" w:lineRule="auto"/>
+        <w:jc w:val="left"/>
+      </w:pPr>
+      <w:r>
+        <w:t>Localiza e clica no elemento;</w:t>
+      </w:r>
+    </w:p>
+    <w:p>
+      <w:pPr>
+        <w:pStyle w:val="PargrafodaLista"/>
+        <w:numPr>
+          <w:ilvl w:val="0"/>
+          <w:numId w:val="26"/>
+        </w:numPr>
+        <w:spacing w:line="240" w:lineRule="auto"/>
+        <w:jc w:val="left"/>
+      </w:pPr>
+      <w:r>
+        <w:t>Localiza e escreve no elemento;</w:t>
+      </w:r>
+    </w:p>
+    <w:p>
+      <w:pPr>
+        <w:pStyle w:val="PargrafodaLista"/>
+        <w:numPr>
+          <w:ilvl w:val="0"/>
+          <w:numId w:val="26"/>
+        </w:numPr>
+        <w:spacing w:line="240" w:lineRule="auto"/>
+        <w:jc w:val="left"/>
+      </w:pPr>
+      <w:r>
+        <w:t xml:space="preserve">Compara a saída esperada pelo usuário com o texto do elemento; </w:t>
+      </w:r>
+    </w:p>
+    <w:p>
+      <w:pPr>
+        <w:pStyle w:val="PargrafodaLista"/>
+        <w:numPr>
+          <w:ilvl w:val="0"/>
+          <w:numId w:val="26"/>
+        </w:numPr>
+        <w:spacing w:line="240" w:lineRule="auto"/>
+        <w:jc w:val="left"/>
+      </w:pPr>
+      <w:r>
+        <w:t>Aceita o alerta;</w:t>
+      </w:r>
+    </w:p>
+    <w:p>
+      <w:pPr>
+        <w:pStyle w:val="PargrafodaLista"/>
+        <w:numPr>
+          <w:ilvl w:val="0"/>
+          <w:numId w:val="26"/>
+        </w:numPr>
+        <w:spacing w:line="240" w:lineRule="auto"/>
+        <w:jc w:val="left"/>
+      </w:pPr>
+      <w:r>
+        <w:t>Nega o alerta;</w:t>
+      </w:r>
+    </w:p>
+    <w:p>
+      <w:pPr>
+        <w:pStyle w:val="PargrafodaLista"/>
+        <w:numPr>
+          <w:ilvl w:val="0"/>
+          <w:numId w:val="26"/>
+        </w:numPr>
+        <w:spacing w:line="240" w:lineRule="auto"/>
+        <w:jc w:val="left"/>
+      </w:pPr>
+      <w:r>
+        <w:t>Compara a saída esperada pelo usuário com o texto do alerta.</w:t>
       </w:r>
     </w:p>
     <w:p>
@@ -4365,10 +4631,10 @@
           <w:noProof/>
         </w:rPr>
         <w:drawing>
-          <wp:inline distT="0" distB="0" distL="0" distR="0" wp14:anchorId="2428815D" wp14:editId="0E263BF0">
-            <wp:extent cx="2811780" cy="2801963"/>
-            <wp:effectExtent l="0" t="0" r="7620" b="0"/>
-            <wp:docPr id="24" name="Imagem 24" descr="Texto&#10;&#10;Descrição gerada automaticamente"/>
+          <wp:inline distT="0" distB="0" distL="0" distR="0" wp14:anchorId="38014572" wp14:editId="08EEE235">
+            <wp:extent cx="3600450" cy="4398874"/>
+            <wp:effectExtent l="0" t="0" r="0" b="1905"/>
+            <wp:docPr id="29" name="Imagem 29"/>
             <wp:cNvGraphicFramePr>
               <a:graphicFrameLocks xmlns:a="http://schemas.openxmlformats.org/drawingml/2006/main" noChangeAspect="1"/>
             </wp:cNvGraphicFramePr>
@@ -4376,7 +4642,7 @@
               <a:graphicData uri="http://schemas.openxmlformats.org/drawingml/2006/picture">
                 <pic:pic xmlns:pic="http://schemas.openxmlformats.org/drawingml/2006/picture">
                   <pic:nvPicPr>
-                    <pic:cNvPr id="24" name="Imagem 24" descr="Texto&#10;&#10;Descrição gerada automaticamente"/>
+                    <pic:cNvPr id="29" name="Imagem 29"/>
                     <pic:cNvPicPr/>
                   </pic:nvPicPr>
                   <pic:blipFill>
@@ -4394,7 +4660,7 @@
                   <pic:spPr>
                     <a:xfrm>
                       <a:off x="0" y="0"/>
-                      <a:ext cx="2817135" cy="2807300"/>
+                      <a:ext cx="3623972" cy="4427612"/>
                     </a:xfrm>
                     <a:prstGeom prst="rect">
                       <a:avLst/>
@@ -4435,7 +4701,63 @@
         <w:t>O autor</w:t>
       </w:r>
     </w:p>
-    <w:p/>
+    <w:p>
+      <w:pPr>
+        <w:pStyle w:val="Legenda"/>
+        <w:jc w:val="both"/>
+        <w:rPr>
+          <w:sz w:val="24"/>
+          <w:szCs w:val="24"/>
+        </w:rPr>
+      </w:pPr>
+    </w:p>
+    <w:p>
+      <w:r>
+        <w:t>A Figura 13 apresenta os métodos escrever em TextField e TextArea</w:t>
+      </w:r>
+      <w:r>
+        <w:t xml:space="preserve"> e obterValorCampo</w:t>
+      </w:r>
+      <w:r>
+        <w:t>. Os pontos numerados correspondem a:</w:t>
+      </w:r>
+    </w:p>
+    <w:p>
+      <w:pPr>
+        <w:pStyle w:val="PargrafodaLista"/>
+        <w:numPr>
+          <w:ilvl w:val="0"/>
+          <w:numId w:val="27"/>
+        </w:numPr>
+      </w:pPr>
+      <w:r>
+        <w:t>O método escrever com o By by por parâmetro (podendo pegar o elemento de várias maneiras. Exemplo: by.xpath, by.className, by.value, etc;</w:t>
+      </w:r>
+    </w:p>
+    <w:p>
+      <w:pPr>
+        <w:pStyle w:val="PargrafodaLista"/>
+        <w:numPr>
+          <w:ilvl w:val="0"/>
+          <w:numId w:val="27"/>
+        </w:numPr>
+      </w:pPr>
+      <w:r>
+        <w:t>O método escrever com o by.id como parâmetro;</w:t>
+      </w:r>
+    </w:p>
+    <w:p>
+      <w:pPr>
+        <w:pStyle w:val="PargrafodaLista"/>
+        <w:numPr>
+          <w:ilvl w:val="0"/>
+          <w:numId w:val="27"/>
+        </w:numPr>
+      </w:pPr>
+      <w:r>
+        <w:t>O método obterValorCampo, onde pega o valor pelo atributo “value”.</w:t>
+      </w:r>
+    </w:p>
     <w:p>
       <w:pPr>
         <w:pStyle w:val="Legenda"/>
@@ -4502,7 +4824,16 @@
           <w:sz w:val="24"/>
           <w:szCs w:val="24"/>
         </w:rPr>
-        <w:t>MetodosTeste()</w:t>
+        <w:t>TextField e TextArea</w:t>
+      </w:r>
+      <w:r>
+        <w:rPr>
+          <w:b w:val="0"/>
+          <w:bCs w:val="0"/>
+          <w:sz w:val="24"/>
+          <w:szCs w:val="24"/>
+        </w:rPr>
+        <w:t>()</w:t>
       </w:r>
     </w:p>
     <w:p>
@@ -4515,10 +4846,10 @@
           <w:noProof/>
         </w:rPr>
         <w:drawing>
-          <wp:inline distT="0" distB="0" distL="0" distR="0" wp14:anchorId="3793CAA8" wp14:editId="3494D589">
-            <wp:extent cx="3965944" cy="3606596"/>
+          <wp:inline distT="0" distB="0" distL="0" distR="0" wp14:anchorId="29253AE1" wp14:editId="72307280">
+            <wp:extent cx="5334744" cy="2381582"/>
             <wp:effectExtent l="0" t="0" r="0" b="0"/>
-            <wp:docPr id="25" name="Imagem 25" descr="Interface gráfica do usuário, Texto&#10;&#10;Descrição gerada automaticamente"/>
+            <wp:docPr id="31" name="Imagem 31" descr="Texto, Carta&#10;&#10;Descrição gerada automaticamente"/>
             <wp:cNvGraphicFramePr>
               <a:graphicFrameLocks xmlns:a="http://schemas.openxmlformats.org/drawingml/2006/main" noChangeAspect="1"/>
             </wp:cNvGraphicFramePr>
@@ -4526,7 +4857,7 @@
               <a:graphicData uri="http://schemas.openxmlformats.org/drawingml/2006/picture">
                 <pic:pic xmlns:pic="http://schemas.openxmlformats.org/drawingml/2006/picture">
                   <pic:nvPicPr>
-                    <pic:cNvPr id="25" name="Imagem 25" descr="Interface gráfica do usuário, Texto&#10;&#10;Descrição gerada automaticamente"/>
+                    <pic:cNvPr id="31" name="Imagem 31" descr="Texto, Carta&#10;&#10;Descrição gerada automaticamente"/>
                     <pic:cNvPicPr/>
                   </pic:nvPicPr>
                   <pic:blipFill>
@@ -4544,7 +4875,7 @@
                   <pic:spPr>
                     <a:xfrm>
                       <a:off x="0" y="0"/>
-                      <a:ext cx="3972092" cy="3612187"/>
+                      <a:ext cx="5334744" cy="2381582"/>
                     </a:xfrm>
                     <a:prstGeom prst="rect">
                       <a:avLst/>
@@ -4592,6 +4923,20 @@
     </w:p>
     <w:p>
       <w:pPr>
+        <w:ind w:firstLine="0"/>
+      </w:pPr>
+      <w:r>
+        <w:tab/>
+        <w:t xml:space="preserve">A Figura 14 apresenta os métodos de clique em radios button e checkBox e a Figura 15 apresenta os métodos relacionados ao ComboBox, </w:t>
+      </w:r>
+    </w:p>
+    <w:p>
+      <w:pPr>
+        <w:ind w:firstLine="0"/>
+      </w:pPr>
+    </w:p>
+    <w:p>
+      <w:pPr>
         <w:pStyle w:val="Legenda"/>
         <w:rPr>
           <w:sz w:val="24"/>
@@ -4646,7 +4991,21 @@
           <w:sz w:val="24"/>
           <w:szCs w:val="24"/>
         </w:rPr>
-        <w:t xml:space="preserve"> - </w:t>
+        <w:t xml:space="preserve"> </w:t>
+      </w:r>
+      <w:r>
+        <w:rPr>
+          <w:sz w:val="24"/>
+          <w:szCs w:val="24"/>
+        </w:rPr>
+        <w:t>–</w:t>
+      </w:r>
+      <w:r>
+        <w:rPr>
+          <w:sz w:val="24"/>
+          <w:szCs w:val="24"/>
+        </w:rPr>
+        <w:t xml:space="preserve"> </w:t>
       </w:r>
       <w:r>
         <w:rPr>
@@ -4655,7 +5014,16 @@
           <w:sz w:val="24"/>
           <w:szCs w:val="24"/>
         </w:rPr>
-        <w:t>MetodosTeste()</w:t>
+        <w:t>radiosButton e checkBox</w:t>
+      </w:r>
+      <w:r>
+        <w:rPr>
+          <w:b w:val="0"/>
+          <w:bCs w:val="0"/>
+          <w:sz w:val="24"/>
+          <w:szCs w:val="24"/>
+        </w:rPr>
+        <w:t>()</w:t>
       </w:r>
     </w:p>
     <w:p>
@@ -4668,10 +5036,10 @@
           <w:noProof/>
         </w:rPr>
         <w:drawing>
-          <wp:inline distT="0" distB="0" distL="0" distR="0" wp14:anchorId="7AF79C07" wp14:editId="38FD988F">
-            <wp:extent cx="4029739" cy="3173331"/>
-            <wp:effectExtent l="0" t="0" r="8890" b="8255"/>
-            <wp:docPr id="26" name="Imagem 26" descr="Texto&#10;&#10;Descrição gerada automaticamente"/>
+          <wp:inline distT="0" distB="0" distL="0" distR="0" wp14:anchorId="676245E2" wp14:editId="401FEE08">
+            <wp:extent cx="4171950" cy="3067050"/>
+            <wp:effectExtent l="0" t="0" r="0" b="0"/>
+            <wp:docPr id="32" name="Imagem 32"/>
             <wp:cNvGraphicFramePr>
               <a:graphicFrameLocks xmlns:a="http://schemas.openxmlformats.org/drawingml/2006/main" noChangeAspect="1"/>
             </wp:cNvGraphicFramePr>
@@ -4679,17 +5047,11 @@
               <a:graphicData uri="http://schemas.openxmlformats.org/drawingml/2006/picture">
                 <pic:pic xmlns:pic="http://schemas.openxmlformats.org/drawingml/2006/picture">
                   <pic:nvPicPr>
-                    <pic:cNvPr id="26" name="Imagem 26" descr="Texto&#10;&#10;Descrição gerada automaticamente"/>
+                    <pic:cNvPr id="1" name=""/>
                     <pic:cNvPicPr/>
                   </pic:nvPicPr>
                   <pic:blipFill>
-                    <a:blip r:embed="rId22">
-                      <a:extLst>
-                        <a:ext uri="{28A0092B-C50C-407E-A947-70E740481C1C}">
-                          <a14:useLocalDpi xmlns:a14="http://schemas.microsoft.com/office/drawing/2010/main" val="0"/>
-                        </a:ext>
-                      </a:extLst>
-                    </a:blip>
+                    <a:blip r:embed="rId22"/>
                     <a:stretch>
                       <a:fillRect/>
                     </a:stretch>
@@ -4697,7 +5059,7 @@
                   <pic:spPr>
                     <a:xfrm>
                       <a:off x="0" y="0"/>
-                      <a:ext cx="4033329" cy="3176158"/>
+                      <a:ext cx="4171950" cy="3067050"/>
                     </a:xfrm>
                     <a:prstGeom prst="rect">
                       <a:avLst/>
@@ -4747,6 +5109,15 @@
           <w:szCs w:val="24"/>
         </w:rPr>
       </w:pPr>
+    </w:p>
+    <w:p>
+      <w:pPr>
+        <w:pStyle w:val="Legenda"/>
+        <w:rPr>
+          <w:sz w:val="24"/>
+          <w:szCs w:val="24"/>
+        </w:rPr>
+      </w:pPr>
       <w:r>
         <w:rPr>
           <w:sz w:val="24"/>
@@ -4805,19 +5176,31 @@
           <w:sz w:val="24"/>
           <w:szCs w:val="24"/>
         </w:rPr>
-        <w:t>MetodosTeste()</w:t>
-      </w:r>
-    </w:p>
-    <w:p>
+        <w:t>comboBox</w:t>
+      </w:r>
+      <w:r>
+        <w:rPr>
+          <w:b w:val="0"/>
+          <w:bCs w:val="0"/>
+          <w:sz w:val="24"/>
+          <w:szCs w:val="24"/>
+        </w:rPr>
+        <w:t>()</w:t>
+      </w:r>
+    </w:p>
+    <w:p>
+      <w:pPr>
+        <w:jc w:val="center"/>
+      </w:pPr>
       <w:r>
         <w:rPr>
           <w:noProof/>
         </w:rPr>
         <w:drawing>
-          <wp:inline distT="0" distB="0" distL="0" distR="0" wp14:anchorId="429779B3" wp14:editId="256EE454">
-            <wp:extent cx="5125165" cy="3505689"/>
+          <wp:inline distT="0" distB="0" distL="0" distR="0" wp14:anchorId="5CC65D88" wp14:editId="73542B2F">
+            <wp:extent cx="4153711" cy="3951261"/>
             <wp:effectExtent l="0" t="0" r="0" b="0"/>
-            <wp:docPr id="27" name="Imagem 27" descr="Texto&#10;&#10;Descrição gerada automaticamente"/>
+            <wp:docPr id="33" name="Imagem 33"/>
             <wp:cNvGraphicFramePr>
               <a:graphicFrameLocks xmlns:a="http://schemas.openxmlformats.org/drawingml/2006/main" noChangeAspect="1"/>
             </wp:cNvGraphicFramePr>
@@ -4825,17 +5208,11 @@
               <a:graphicData uri="http://schemas.openxmlformats.org/drawingml/2006/picture">
                 <pic:pic xmlns:pic="http://schemas.openxmlformats.org/drawingml/2006/picture">
                   <pic:nvPicPr>
-                    <pic:cNvPr id="27" name="Imagem 27" descr="Texto&#10;&#10;Descrição gerada automaticamente"/>
+                    <pic:cNvPr id="1" name=""/>
                     <pic:cNvPicPr/>
                   </pic:nvPicPr>
                   <pic:blipFill>
-                    <a:blip r:embed="rId23">
-                      <a:extLst>
-                        <a:ext uri="{28A0092B-C50C-407E-A947-70E740481C1C}">
-                          <a14:useLocalDpi xmlns:a14="http://schemas.microsoft.com/office/drawing/2010/main" val="0"/>
-                        </a:ext>
-                      </a:extLst>
-                    </a:blip>
+                    <a:blip r:embed="rId23"/>
                     <a:stretch>
                       <a:fillRect/>
                     </a:stretch>
@@ -4843,7 +5220,7 @@
                   <pic:spPr>
                     <a:xfrm>
                       <a:off x="0" y="0"/>
-                      <a:ext cx="5125165" cy="3505689"/>
+                      <a:ext cx="4163308" cy="3960391"/>
                     </a:xfrm>
                     <a:prstGeom prst="rect">
                       <a:avLst/>
@@ -4886,6 +5263,11 @@
     </w:p>
     <w:p/>
     <w:p>
+      <w:r>
+        <w:t>A Figura 16 apresenta os métodos relacionados a troca de frames e janelas e as ações por JavaScript.</w:t>
+      </w:r>
+    </w:p>
+    <w:p>
       <w:pPr>
         <w:pStyle w:val="Legenda"/>
         <w:rPr>
@@ -4963,10 +5345,10 @@
           <w:noProof/>
         </w:rPr>
         <w:drawing>
-          <wp:inline distT="0" distB="0" distL="0" distR="0" wp14:anchorId="14BF2FA7" wp14:editId="46F632C4">
-            <wp:extent cx="5760720" cy="2250440"/>
+          <wp:inline distT="0" distB="0" distL="0" distR="0" wp14:anchorId="00F0DAC4" wp14:editId="43C73BE4">
+            <wp:extent cx="3528864" cy="2519464"/>
             <wp:effectExtent l="0" t="0" r="0" b="0"/>
-            <wp:docPr id="28" name="Imagem 28" descr="Texto&#10;&#10;Descrição gerada automaticamente"/>
+            <wp:docPr id="34" name="Imagem 34"/>
             <wp:cNvGraphicFramePr>
               <a:graphicFrameLocks xmlns:a="http://schemas.openxmlformats.org/drawingml/2006/main" noChangeAspect="1"/>
             </wp:cNvGraphicFramePr>
@@ -4974,17 +5356,11 @@
               <a:graphicData uri="http://schemas.openxmlformats.org/drawingml/2006/picture">
                 <pic:pic xmlns:pic="http://schemas.openxmlformats.org/drawingml/2006/picture">
                   <pic:nvPicPr>
-                    <pic:cNvPr id="28" name="Imagem 28" descr="Texto&#10;&#10;Descrição gerada automaticamente"/>
+                    <pic:cNvPr id="1" name=""/>
                     <pic:cNvPicPr/>
                   </pic:nvPicPr>
                   <pic:blipFill>
-                    <a:blip r:embed="rId24">
-                      <a:extLst>
-                        <a:ext uri="{28A0092B-C50C-407E-A947-70E740481C1C}">
-                          <a14:useLocalDpi xmlns:a14="http://schemas.microsoft.com/office/drawing/2010/main" val="0"/>
-                        </a:ext>
-                      </a:extLst>
-                    </a:blip>
+                    <a:blip r:embed="rId24"/>
                     <a:stretch>
                       <a:fillRect/>
                     </a:stretch>
@@ -4992,7 +5368,7 @@
                   <pic:spPr>
                     <a:xfrm>
                       <a:off x="0" y="0"/>
-                      <a:ext cx="5760720" cy="2250440"/>
+                      <a:ext cx="3582359" cy="2557657"/>
                     </a:xfrm>
                     <a:prstGeom prst="rect">
                       <a:avLst/>
@@ -5033,11 +5409,6 @@
         <w:t>O autor</w:t>
       </w:r>
     </w:p>
-    <w:p/>
-    <w:p/>
-    <w:p/>
-    <w:p/>
-    <w:p/>
     <w:p>
       <w:pPr>
         <w:pStyle w:val="Ttulo3"/>
@@ -5289,66 +5660,7 @@
     </w:p>
     <w:p>
       <w:pPr>
-        <w:ind w:firstLine="0"/>
-      </w:pPr>
-    </w:p>
-    <w:p>
-      <w:pPr>
-        <w:ind w:firstLine="0"/>
-      </w:pPr>
-    </w:p>
-    <w:p>
-      <w:pPr>
-        <w:ind w:firstLine="0"/>
-      </w:pPr>
-    </w:p>
-    <w:p>
-      <w:pPr>
-        <w:ind w:firstLine="0"/>
-      </w:pPr>
-    </w:p>
-    <w:p>
-      <w:pPr>
-        <w:ind w:firstLine="0"/>
-      </w:pPr>
-    </w:p>
-    <w:p>
-      <w:pPr>
-        <w:ind w:firstLine="0"/>
-      </w:pPr>
-    </w:p>
-    <w:p>
-      <w:pPr>
-        <w:ind w:firstLine="0"/>
-      </w:pPr>
-    </w:p>
-    <w:p>
-      <w:pPr>
-        <w:ind w:firstLine="0"/>
-      </w:pPr>
-    </w:p>
-    <w:p>
-      <w:pPr>
-        <w:ind w:firstLine="0"/>
-      </w:pPr>
-    </w:p>
-    <w:p>
-      <w:pPr>
-        <w:ind w:firstLine="0"/>
-      </w:pPr>
-    </w:p>
-    <w:p>
-      <w:pPr>
-        <w:ind w:firstLine="0"/>
-      </w:pPr>
-    </w:p>
-    <w:p>
-      <w:pPr>
         <w:pStyle w:val="Legenda"/>
-        <w:rPr>
-          <w:sz w:val="24"/>
-          <w:szCs w:val="24"/>
-        </w:rPr>
       </w:pPr>
       <w:r>
         <w:rPr>
@@ -5424,11 +5736,6 @@
         </w:rPr>
         <w:t>Tela Inicial com Dados</w:t>
       </w:r>
-    </w:p>
-    <w:p>
-      <w:pPr>
-        <w:ind w:firstLine="0"/>
-      </w:pPr>
       <w:r>
         <w:rPr>
           <w:noProof/>
@@ -6750,10 +7057,310 @@
         <w:t>.</w:t>
       </w:r>
     </w:p>
+    <w:p>
+      <w:r>
+        <w:t xml:space="preserve">O trabalho foi realizado com o cumprimento das diretrizes da disciplina Lab. Engenharia de Software, sendo desenvolvido um sistema web complementar, utilizado afins de teste do sistema gerenciador. O sistema web complementar foi um crud </w:t>
+      </w:r>
+      <w:r>
+        <w:t>de cadastro</w:t>
+      </w:r>
+      <w:r>
+        <w:t xml:space="preserve"> de usuário onde foi utilizado as seguintes tecnologias: Gradle, Java 8, JPA Hibernate, JSP, CSS, JavaScript, Banco de Dados MySql e padrão MVC. </w:t>
+      </w:r>
+    </w:p>
+    <w:p>
+      <w:r>
+        <w:t xml:space="preserve">A Figura 26 e 27 apresenta </w:t>
+      </w:r>
+      <w:r>
+        <w:t>o sistema web de cadastro de usuário</w:t>
+      </w:r>
+      <w:r>
+        <w:t xml:space="preserve">. </w:t>
+      </w:r>
+    </w:p>
     <w:p/>
+    <w:p/>
+    <w:p/>
+    <w:p/>
+    <w:p/>
+    <w:p>
+      <w:pPr>
+        <w:pStyle w:val="Legenda"/>
+        <w:rPr>
+          <w:sz w:val="24"/>
+          <w:szCs w:val="24"/>
+        </w:rPr>
+      </w:pPr>
+      <w:r>
+        <w:rPr>
+          <w:sz w:val="24"/>
+          <w:szCs w:val="24"/>
+        </w:rPr>
+        <w:lastRenderedPageBreak/>
+        <w:t>F</w:t>
+      </w:r>
+      <w:r>
+        <w:rPr>
+          <w:sz w:val="24"/>
+          <w:szCs w:val="24"/>
+        </w:rPr>
+        <w:t xml:space="preserve">igura </w:t>
+      </w:r>
+      <w:r>
+        <w:rPr>
+          <w:sz w:val="24"/>
+          <w:szCs w:val="24"/>
+        </w:rPr>
+        <w:t>26 –</w:t>
+      </w:r>
+      <w:r>
+        <w:rPr>
+          <w:sz w:val="24"/>
+          <w:szCs w:val="24"/>
+        </w:rPr>
+        <w:t xml:space="preserve"> </w:t>
+      </w:r>
+      <w:r>
+        <w:rPr>
+          <w:b w:val="0"/>
+          <w:bCs w:val="0"/>
+          <w:sz w:val="24"/>
+          <w:szCs w:val="24"/>
+        </w:rPr>
+        <w:t>Tela de listagem</w:t>
+      </w:r>
+    </w:p>
+    <w:p>
+      <w:pPr>
+        <w:ind w:firstLine="0"/>
+      </w:pPr>
+      <w:r>
+        <w:rPr>
+          <w:noProof/>
+        </w:rPr>
+        <w:drawing>
+          <wp:inline distT="0" distB="0" distL="0" distR="0" wp14:anchorId="67626789" wp14:editId="737C1B15">
+            <wp:extent cx="5760720" cy="1515745"/>
+            <wp:effectExtent l="0" t="0" r="0" b="8255"/>
+            <wp:docPr id="35" name="Imagem 35"/>
+            <wp:cNvGraphicFramePr>
+              <a:graphicFrameLocks xmlns:a="http://schemas.openxmlformats.org/drawingml/2006/main" noChangeAspect="1"/>
+            </wp:cNvGraphicFramePr>
+            <a:graphic xmlns:a="http://schemas.openxmlformats.org/drawingml/2006/main">
+              <a:graphicData uri="http://schemas.openxmlformats.org/drawingml/2006/picture">
+                <pic:pic xmlns:pic="http://schemas.openxmlformats.org/drawingml/2006/picture">
+                  <pic:nvPicPr>
+                    <pic:cNvPr id="1" name=""/>
+                    <pic:cNvPicPr/>
+                  </pic:nvPicPr>
+                  <pic:blipFill>
+                    <a:blip r:embed="rId34"/>
+                    <a:stretch>
+                      <a:fillRect/>
+                    </a:stretch>
+                  </pic:blipFill>
+                  <pic:spPr>
+                    <a:xfrm>
+                      <a:off x="0" y="0"/>
+                      <a:ext cx="5760720" cy="1515745"/>
+                    </a:xfrm>
+                    <a:prstGeom prst="rect">
+                      <a:avLst/>
+                    </a:prstGeom>
+                  </pic:spPr>
+                </pic:pic>
+              </a:graphicData>
+            </a:graphic>
+          </wp:inline>
+        </w:drawing>
+      </w:r>
+    </w:p>
+    <w:p>
+      <w:pPr>
+        <w:pStyle w:val="Legenda"/>
+        <w:spacing w:before="0" w:after="0" w:line="240" w:lineRule="auto"/>
+        <w:rPr>
+          <w:b w:val="0"/>
+          <w:bCs w:val="0"/>
+          <w:sz w:val="24"/>
+          <w:szCs w:val="24"/>
+        </w:rPr>
+      </w:pPr>
+      <w:r>
+        <w:rPr>
+          <w:sz w:val="24"/>
+          <w:szCs w:val="24"/>
+        </w:rPr>
+        <w:t xml:space="preserve">Fonte: </w:t>
+      </w:r>
+      <w:r>
+        <w:rPr>
+          <w:b w:val="0"/>
+          <w:bCs w:val="0"/>
+          <w:sz w:val="24"/>
+          <w:szCs w:val="24"/>
+        </w:rPr>
+        <w:t>O autor</w:t>
+      </w:r>
+    </w:p>
+    <w:p>
+      <w:pPr>
+        <w:ind w:firstLine="0"/>
+      </w:pPr>
+    </w:p>
+    <w:p>
+      <w:pPr>
+        <w:pStyle w:val="Legenda"/>
+        <w:rPr>
+          <w:sz w:val="24"/>
+          <w:szCs w:val="24"/>
+        </w:rPr>
+      </w:pPr>
+      <w:r>
+        <w:rPr>
+          <w:sz w:val="24"/>
+          <w:szCs w:val="24"/>
+        </w:rPr>
+        <w:t>F</w:t>
+      </w:r>
+      <w:r>
+        <w:rPr>
+          <w:sz w:val="24"/>
+          <w:szCs w:val="24"/>
+        </w:rPr>
+        <w:t xml:space="preserve">igura </w:t>
+      </w:r>
+      <w:r>
+        <w:rPr>
+          <w:sz w:val="24"/>
+          <w:szCs w:val="24"/>
+        </w:rPr>
+        <w:t>2</w:t>
+      </w:r>
+      <w:r>
+        <w:rPr>
+          <w:sz w:val="24"/>
+          <w:szCs w:val="24"/>
+        </w:rPr>
+        <w:t>7</w:t>
+      </w:r>
+      <w:r>
+        <w:rPr>
+          <w:sz w:val="24"/>
+          <w:szCs w:val="24"/>
+        </w:rPr>
+        <w:t xml:space="preserve"> –</w:t>
+      </w:r>
+      <w:r>
+        <w:rPr>
+          <w:sz w:val="24"/>
+          <w:szCs w:val="24"/>
+        </w:rPr>
+        <w:t xml:space="preserve"> </w:t>
+      </w:r>
+      <w:r>
+        <w:rPr>
+          <w:b w:val="0"/>
+          <w:bCs w:val="0"/>
+          <w:sz w:val="24"/>
+          <w:szCs w:val="24"/>
+        </w:rPr>
+        <w:t xml:space="preserve">Tela de </w:t>
+      </w:r>
+      <w:r>
+        <w:rPr>
+          <w:b w:val="0"/>
+          <w:bCs w:val="0"/>
+          <w:sz w:val="24"/>
+          <w:szCs w:val="24"/>
+        </w:rPr>
+        <w:t>cadastro</w:t>
+      </w:r>
+    </w:p>
+    <w:p>
+      <w:pPr>
+        <w:ind w:firstLine="0"/>
+        <w:jc w:val="center"/>
+      </w:pPr>
+      <w:r>
+        <w:rPr>
+          <w:noProof/>
+        </w:rPr>
+        <w:drawing>
+          <wp:inline distT="0" distB="0" distL="0" distR="0" wp14:anchorId="43968E2E" wp14:editId="01D95F32">
+            <wp:extent cx="4057650" cy="3162300"/>
+            <wp:effectExtent l="0" t="0" r="0" b="0"/>
+            <wp:docPr id="36" name="Imagem 36"/>
+            <wp:cNvGraphicFramePr>
+              <a:graphicFrameLocks xmlns:a="http://schemas.openxmlformats.org/drawingml/2006/main" noChangeAspect="1"/>
+            </wp:cNvGraphicFramePr>
+            <a:graphic xmlns:a="http://schemas.openxmlformats.org/drawingml/2006/main">
+              <a:graphicData uri="http://schemas.openxmlformats.org/drawingml/2006/picture">
+                <pic:pic xmlns:pic="http://schemas.openxmlformats.org/drawingml/2006/picture">
+                  <pic:nvPicPr>
+                    <pic:cNvPr id="1" name=""/>
+                    <pic:cNvPicPr/>
+                  </pic:nvPicPr>
+                  <pic:blipFill>
+                    <a:blip r:embed="rId35"/>
+                    <a:stretch>
+                      <a:fillRect/>
+                    </a:stretch>
+                  </pic:blipFill>
+                  <pic:spPr>
+                    <a:xfrm>
+                      <a:off x="0" y="0"/>
+                      <a:ext cx="4057650" cy="3162300"/>
+                    </a:xfrm>
+                    <a:prstGeom prst="rect">
+                      <a:avLst/>
+                    </a:prstGeom>
+                  </pic:spPr>
+                </pic:pic>
+              </a:graphicData>
+            </a:graphic>
+          </wp:inline>
+        </w:drawing>
+      </w:r>
+    </w:p>
+    <w:p>
+      <w:pPr>
+        <w:pStyle w:val="Legenda"/>
+        <w:spacing w:before="0" w:after="0" w:line="240" w:lineRule="auto"/>
+        <w:rPr>
+          <w:b w:val="0"/>
+          <w:bCs w:val="0"/>
+          <w:sz w:val="24"/>
+          <w:szCs w:val="24"/>
+        </w:rPr>
+      </w:pPr>
+      <w:r>
+        <w:rPr>
+          <w:sz w:val="24"/>
+          <w:szCs w:val="24"/>
+        </w:rPr>
+        <w:t xml:space="preserve">Fonte: </w:t>
+      </w:r>
+      <w:r>
+        <w:rPr>
+          <w:b w:val="0"/>
+          <w:bCs w:val="0"/>
+          <w:sz w:val="24"/>
+          <w:szCs w:val="24"/>
+        </w:rPr>
+        <w:t>O autor</w:t>
+      </w:r>
+    </w:p>
+    <w:p>
+      <w:pPr>
+        <w:ind w:firstLine="0"/>
+        <w:jc w:val="center"/>
+      </w:pPr>
+    </w:p>
     <w:sectPr>
-      <w:headerReference w:type="default" r:id="rId34"/>
-      <w:footerReference w:type="default" r:id="rId35"/>
+      <w:headerReference w:type="default" r:id="rId36"/>
+      <w:footerReference w:type="default" r:id="rId37"/>
       <w:pgSz w:w="11907" w:h="16840" w:code="9"/>
       <w:pgMar w:top="1701" w:right="1134" w:bottom="1134" w:left="1701" w:header="1134" w:footer="1134" w:gutter="0"/>
       <w:cols w:space="720"/>
@@ -6891,17 +7498,17 @@
         <v:path o:extrusionok="f" gradientshapeok="t" o:connecttype="rect"/>
         <o:lock v:ext="edit" aspectratio="t"/>
       </v:shapetype>
-      <v:shape id="_x0000_i1281" type="#_x0000_t75" style="width:3in;height:3in" o:bullet="t"/>
+      <v:shape id="_x0000_i1125" type="#_x0000_t75" style="width:3in;height:3in" o:bullet="t"/>
     </w:pict>
   </w:numPicBullet>
   <w:numPicBullet w:numPicBulletId="1">
     <w:pict>
-      <v:shape id="_x0000_i1282" type="#_x0000_t75" style="width:3in;height:3in" o:bullet="t"/>
+      <v:shape id="_x0000_i1126" type="#_x0000_t75" style="width:3in;height:3in" o:bullet="t"/>
     </w:pict>
   </w:numPicBullet>
   <w:numPicBullet w:numPicBulletId="2">
     <w:pict>
-      <v:shape id="_x0000_i1283" type="#_x0000_t75" style="width:3in;height:3in" o:bullet="t"/>
+      <v:shape id="_x0000_i1127" type="#_x0000_t75" style="width:3in;height:3in" o:bullet="t"/>
     </w:pict>
   </w:numPicBullet>
   <w:abstractNum w:abstractNumId="0" w15:restartNumberingAfterBreak="0">
@@ -9063,6 +9670,95 @@
     </w:lvl>
   </w:abstractNum>
   <w:abstractNum w:abstractNumId="20" w15:restartNumberingAfterBreak="0">
+    <w:nsid w:val="5ADF77C8"/>
+    <w:multiLevelType w:val="hybridMultilevel"/>
+    <w:tmpl w:val="9E84C72A"/>
+    <w:lvl w:ilvl="0" w:tplc="634846C6">
+      <w:start w:val="1"/>
+      <w:numFmt w:val="decimal"/>
+      <w:lvlText w:val="%1)"/>
+      <w:lvlJc w:val="left"/>
+      <w:pPr>
+        <w:ind w:left="1069" w:hanging="360"/>
+      </w:pPr>
+      <w:rPr>
+        <w:rFonts w:hint="default"/>
+      </w:rPr>
+    </w:lvl>
+    <w:lvl w:ilvl="1" w:tplc="04160019" w:tentative="1">
+      <w:start w:val="1"/>
+      <w:numFmt w:val="lowerLetter"/>
+      <w:lvlText w:val="%2."/>
+      <w:lvlJc w:val="left"/>
+      <w:pPr>
+        <w:ind w:left="1789" w:hanging="360"/>
+      </w:pPr>
+    </w:lvl>
+    <w:lvl w:ilvl="2" w:tplc="0416001B" w:tentative="1">
+      <w:start w:val="1"/>
+      <w:numFmt w:val="lowerRoman"/>
+      <w:lvlText w:val="%3."/>
+      <w:lvlJc w:val="right"/>
+      <w:pPr>
+        <w:ind w:left="2509" w:hanging="180"/>
+      </w:pPr>
+    </w:lvl>
+    <w:lvl w:ilvl="3" w:tplc="0416000F" w:tentative="1">
+      <w:start w:val="1"/>
+      <w:numFmt w:val="decimal"/>
+      <w:lvlText w:val="%4."/>
+      <w:lvlJc w:val="left"/>
+      <w:pPr>
+        <w:ind w:left="3229" w:hanging="360"/>
+      </w:pPr>
+    </w:lvl>
+    <w:lvl w:ilvl="4" w:tplc="04160019" w:tentative="1">
+      <w:start w:val="1"/>
+      <w:numFmt w:val="lowerLetter"/>
+      <w:lvlText w:val="%5."/>
+      <w:lvlJc w:val="left"/>
+      <w:pPr>
+        <w:ind w:left="3949" w:hanging="360"/>
+      </w:pPr>
+    </w:lvl>
+    <w:lvl w:ilvl="5" w:tplc="0416001B" w:tentative="1">
+      <w:start w:val="1"/>
+      <w:numFmt w:val="lowerRoman"/>
+      <w:lvlText w:val="%6."/>
+      <w:lvlJc w:val="right"/>
+      <w:pPr>
+        <w:ind w:left="4669" w:hanging="180"/>
+      </w:pPr>
+    </w:lvl>
+    <w:lvl w:ilvl="6" w:tplc="0416000F" w:tentative="1">
+      <w:start w:val="1"/>
+      <w:numFmt w:val="decimal"/>
+      <w:lvlText w:val="%7."/>
+      <w:lvlJc w:val="left"/>
+      <w:pPr>
+        <w:ind w:left="5389" w:hanging="360"/>
+      </w:pPr>
+    </w:lvl>
+    <w:lvl w:ilvl="7" w:tplc="04160019" w:tentative="1">
+      <w:start w:val="1"/>
+      <w:numFmt w:val="lowerLetter"/>
+      <w:lvlText w:val="%8."/>
+      <w:lvlJc w:val="left"/>
+      <w:pPr>
+        <w:ind w:left="6109" w:hanging="360"/>
+      </w:pPr>
+    </w:lvl>
+    <w:lvl w:ilvl="8" w:tplc="0416001B" w:tentative="1">
+      <w:start w:val="1"/>
+      <w:numFmt w:val="lowerRoman"/>
+      <w:lvlText w:val="%9."/>
+      <w:lvlJc w:val="right"/>
+      <w:pPr>
+        <w:ind w:left="6829" w:hanging="180"/>
+      </w:pPr>
+    </w:lvl>
+  </w:abstractNum>
+  <w:abstractNum w:abstractNumId="21" w15:restartNumberingAfterBreak="0">
     <w:nsid w:val="5FA87471"/>
     <w:multiLevelType w:val="hybridMultilevel"/>
     <w:tmpl w:val="AB402598"/>
@@ -9175,7 +9871,96 @@
       </w:rPr>
     </w:lvl>
   </w:abstractNum>
-  <w:abstractNum w:abstractNumId="21" w15:restartNumberingAfterBreak="0">
+  <w:abstractNum w:abstractNumId="22" w15:restartNumberingAfterBreak="0">
+    <w:nsid w:val="60B53BFF"/>
+    <w:multiLevelType w:val="hybridMultilevel"/>
+    <w:tmpl w:val="07A25080"/>
+    <w:lvl w:ilvl="0" w:tplc="24423A5A">
+      <w:start w:val="1"/>
+      <w:numFmt w:val="decimal"/>
+      <w:lvlText w:val="%1)"/>
+      <w:lvlJc w:val="left"/>
+      <w:pPr>
+        <w:ind w:left="1069" w:hanging="360"/>
+      </w:pPr>
+      <w:rPr>
+        <w:rFonts w:hint="default"/>
+      </w:rPr>
+    </w:lvl>
+    <w:lvl w:ilvl="1" w:tplc="04160019" w:tentative="1">
+      <w:start w:val="1"/>
+      <w:numFmt w:val="lowerLetter"/>
+      <w:lvlText w:val="%2."/>
+      <w:lvlJc w:val="left"/>
+      <w:pPr>
+        <w:ind w:left="1789" w:hanging="360"/>
+      </w:pPr>
+    </w:lvl>
+    <w:lvl w:ilvl="2" w:tplc="0416001B" w:tentative="1">
+      <w:start w:val="1"/>
+      <w:numFmt w:val="lowerRoman"/>
+      <w:lvlText w:val="%3."/>
+      <w:lvlJc w:val="right"/>
+      <w:pPr>
+        <w:ind w:left="2509" w:hanging="180"/>
+      </w:pPr>
+    </w:lvl>
+    <w:lvl w:ilvl="3" w:tplc="0416000F" w:tentative="1">
+      <w:start w:val="1"/>
+      <w:numFmt w:val="decimal"/>
+      <w:lvlText w:val="%4."/>
+      <w:lvlJc w:val="left"/>
+      <w:pPr>
+        <w:ind w:left="3229" w:hanging="360"/>
+      </w:pPr>
+    </w:lvl>
+    <w:lvl w:ilvl="4" w:tplc="04160019" w:tentative="1">
+      <w:start w:val="1"/>
+      <w:numFmt w:val="lowerLetter"/>
+      <w:lvlText w:val="%5."/>
+      <w:lvlJc w:val="left"/>
+      <w:pPr>
+        <w:ind w:left="3949" w:hanging="360"/>
+      </w:pPr>
+    </w:lvl>
+    <w:lvl w:ilvl="5" w:tplc="0416001B" w:tentative="1">
+      <w:start w:val="1"/>
+      <w:numFmt w:val="lowerRoman"/>
+      <w:lvlText w:val="%6."/>
+      <w:lvlJc w:val="right"/>
+      <w:pPr>
+        <w:ind w:left="4669" w:hanging="180"/>
+      </w:pPr>
+    </w:lvl>
+    <w:lvl w:ilvl="6" w:tplc="0416000F" w:tentative="1">
+      <w:start w:val="1"/>
+      <w:numFmt w:val="decimal"/>
+      <w:lvlText w:val="%7."/>
+      <w:lvlJc w:val="left"/>
+      <w:pPr>
+        <w:ind w:left="5389" w:hanging="360"/>
+      </w:pPr>
+    </w:lvl>
+    <w:lvl w:ilvl="7" w:tplc="04160019" w:tentative="1">
+      <w:start w:val="1"/>
+      <w:numFmt w:val="lowerLetter"/>
+      <w:lvlText w:val="%8."/>
+      <w:lvlJc w:val="left"/>
+      <w:pPr>
+        <w:ind w:left="6109" w:hanging="360"/>
+      </w:pPr>
+    </w:lvl>
+    <w:lvl w:ilvl="8" w:tplc="0416001B" w:tentative="1">
+      <w:start w:val="1"/>
+      <w:numFmt w:val="lowerRoman"/>
+      <w:lvlText w:val="%9."/>
+      <w:lvlJc w:val="right"/>
+      <w:pPr>
+        <w:ind w:left="6829" w:hanging="180"/>
+      </w:pPr>
+    </w:lvl>
+  </w:abstractNum>
+  <w:abstractNum w:abstractNumId="23" w15:restartNumberingAfterBreak="0">
     <w:nsid w:val="686B1BCE"/>
     <w:multiLevelType w:val="hybridMultilevel"/>
     <w:tmpl w:val="AAE81FDE"/>
@@ -9288,7 +10073,7 @@
       </w:rPr>
     </w:lvl>
   </w:abstractNum>
-  <w:abstractNum w:abstractNumId="22" w15:restartNumberingAfterBreak="0">
+  <w:abstractNum w:abstractNumId="24" w15:restartNumberingAfterBreak="0">
     <w:nsid w:val="69F0690B"/>
     <w:multiLevelType w:val="hybridMultilevel"/>
     <w:tmpl w:val="25FECC7C"/>
@@ -9438,7 +10223,7 @@
     <w:abstractNumId w:val="9"/>
   </w:num>
   <w:num w:numId="13">
-    <w:abstractNumId w:val="21"/>
+    <w:abstractNumId w:val="23"/>
   </w:num>
   <w:num w:numId="14">
     <w:abstractNumId w:val="14"/>
@@ -9450,10 +10235,10 @@
     <w:abstractNumId w:val="10"/>
   </w:num>
   <w:num w:numId="17">
-    <w:abstractNumId w:val="20"/>
+    <w:abstractNumId w:val="21"/>
   </w:num>
   <w:num w:numId="18">
-    <w:abstractNumId w:val="22"/>
+    <w:abstractNumId w:val="24"/>
   </w:num>
   <w:num w:numId="19">
     <w:abstractNumId w:val="2"/>
@@ -9475,6 +10260,12 @@
   </w:num>
   <w:num w:numId="25">
     <w:abstractNumId w:val="6"/>
+  </w:num>
+  <w:num w:numId="26">
+    <w:abstractNumId w:val="20"/>
+  </w:num>
+  <w:num w:numId="27">
+    <w:abstractNumId w:val="22"/>
   </w:num>
   <w:numIdMacAtCleanup w:val="7"/>
 </w:numbering>

</xml_diff>

<commit_message>
Revisão antes da defesa do documento do TG
</commit_message>
<xml_diff>
--- a/doc/technical_report_.docx
+++ b/doc/technical_report_.docx
@@ -279,7 +279,21 @@
         <w:rPr>
           <w:szCs w:val="24"/>
         </w:rPr>
-        <w:t>Fabrício Galende Marques de Carvalho</w:t>
+        <w:t xml:space="preserve">Fabrício </w:t>
+      </w:r>
+      <w:proofErr w:type="spellStart"/>
+      <w:r>
+        <w:rPr>
+          <w:szCs w:val="24"/>
+        </w:rPr>
+        <w:t>Galende</w:t>
+      </w:r>
+      <w:proofErr w:type="spellEnd"/>
+      <w:r>
+        <w:rPr>
+          <w:szCs w:val="24"/>
+        </w:rPr>
+        <w:t xml:space="preserve"> Marques de Carvalho</w:t>
       </w:r>
     </w:p>
     <w:p>
@@ -440,7 +454,7 @@
         </w:rPr>
         <w:fldChar w:fldCharType="separate"/>
       </w:r>
-      <w:hyperlink w:anchor="_Toc56182739" w:history="1">
+      <w:hyperlink w:anchor="_Toc58626632" w:history="1">
         <w:r>
           <w:rPr>
             <w:rStyle w:val="Hyperlink"/>
@@ -483,7 +497,7 @@
             <w:noProof/>
             <w:webHidden/>
           </w:rPr>
-          <w:instrText xml:space="preserve"> PAGEREF _Toc56182739 \h </w:instrText>
+          <w:instrText xml:space="preserve"> PAGEREF _Toc58626632 \h </w:instrText>
         </w:r>
         <w:r>
           <w:rPr>
@@ -528,7 +542,7 @@
           <w:szCs w:val="22"/>
         </w:rPr>
       </w:pPr>
-      <w:hyperlink w:anchor="_Toc56182740" w:history="1">
+      <w:hyperlink w:anchor="_Toc58626633" w:history="1">
         <w:r>
           <w:rPr>
             <w:rStyle w:val="Hyperlink"/>
@@ -571,7 +585,7 @@
             <w:noProof/>
             <w:webHidden/>
           </w:rPr>
-          <w:instrText xml:space="preserve"> PAGEREF _Toc56182740 \h </w:instrText>
+          <w:instrText xml:space="preserve"> PAGEREF _Toc58626633 \h </w:instrText>
         </w:r>
         <w:r>
           <w:rPr>
@@ -616,7 +630,7 @@
           <w:szCs w:val="22"/>
         </w:rPr>
       </w:pPr>
-      <w:hyperlink w:anchor="_Toc56182741" w:history="1">
+      <w:hyperlink w:anchor="_Toc58626634" w:history="1">
         <w:r>
           <w:rPr>
             <w:rStyle w:val="Hyperlink"/>
@@ -659,7 +673,7 @@
             <w:noProof/>
             <w:webHidden/>
           </w:rPr>
-          <w:instrText xml:space="preserve"> PAGEREF _Toc56182741 \h </w:instrText>
+          <w:instrText xml:space="preserve"> PAGEREF _Toc58626634 \h </w:instrText>
         </w:r>
         <w:r>
           <w:rPr>
@@ -679,7 +693,7 @@
             <w:noProof/>
             <w:webHidden/>
           </w:rPr>
-          <w:t>3</w:t>
+          <w:t>4</w:t>
         </w:r>
         <w:r>
           <w:rPr>
@@ -704,7 +718,7 @@
           <w:szCs w:val="22"/>
         </w:rPr>
       </w:pPr>
-      <w:hyperlink w:anchor="_Toc56182742" w:history="1">
+      <w:hyperlink w:anchor="_Toc58626635" w:history="1">
         <w:r>
           <w:rPr>
             <w:rStyle w:val="Hyperlink"/>
@@ -747,7 +761,7 @@
             <w:noProof/>
             <w:webHidden/>
           </w:rPr>
-          <w:instrText xml:space="preserve"> PAGEREF _Toc56182742 \h </w:instrText>
+          <w:instrText xml:space="preserve"> PAGEREF _Toc58626635 \h </w:instrText>
         </w:r>
         <w:r>
           <w:rPr>
@@ -792,7 +806,7 @@
           <w:szCs w:val="22"/>
         </w:rPr>
       </w:pPr>
-      <w:hyperlink w:anchor="_Toc56182743" w:history="1">
+      <w:hyperlink w:anchor="_Toc58626636" w:history="1">
         <w:r>
           <w:rPr>
             <w:rStyle w:val="Hyperlink"/>
@@ -835,7 +849,7 @@
             <w:noProof/>
             <w:webHidden/>
           </w:rPr>
-          <w:instrText xml:space="preserve"> PAGEREF _Toc56182743 \h </w:instrText>
+          <w:instrText xml:space="preserve"> PAGEREF _Toc58626636 \h </w:instrText>
         </w:r>
         <w:r>
           <w:rPr>
@@ -876,7 +890,7 @@
           <w:szCs w:val="22"/>
         </w:rPr>
       </w:pPr>
-      <w:hyperlink w:anchor="_Toc56182744" w:history="1">
+      <w:hyperlink w:anchor="_Toc58626637" w:history="1">
         <w:r>
           <w:rPr>
             <w:rStyle w:val="Hyperlink"/>
@@ -919,7 +933,7 @@
             <w:noProof/>
             <w:webHidden/>
           </w:rPr>
-          <w:instrText xml:space="preserve"> PAGEREF _Toc56182744 \h </w:instrText>
+          <w:instrText xml:space="preserve"> PAGEREF _Toc58626637 \h </w:instrText>
         </w:r>
         <w:r>
           <w:rPr>
@@ -939,7 +953,7 @@
             <w:noProof/>
             <w:webHidden/>
           </w:rPr>
-          <w:t>4</w:t>
+          <w:t>5</w:t>
         </w:r>
         <w:r>
           <w:rPr>
@@ -964,7 +978,7 @@
           <w:szCs w:val="22"/>
         </w:rPr>
       </w:pPr>
-      <w:hyperlink w:anchor="_Toc56182745" w:history="1">
+      <w:hyperlink w:anchor="_Toc58626638" w:history="1">
         <w:r>
           <w:rPr>
             <w:rStyle w:val="Hyperlink"/>
@@ -1007,7 +1021,7 @@
             <w:noProof/>
             <w:webHidden/>
           </w:rPr>
-          <w:instrText xml:space="preserve"> PAGEREF _Toc56182745 \h </w:instrText>
+          <w:instrText xml:space="preserve"> PAGEREF _Toc58626638 \h </w:instrText>
         </w:r>
         <w:r>
           <w:rPr>
@@ -1052,7 +1066,7 @@
           <w:szCs w:val="22"/>
         </w:rPr>
       </w:pPr>
-      <w:hyperlink w:anchor="_Toc56182746" w:history="1">
+      <w:hyperlink w:anchor="_Toc58626639" w:history="1">
         <w:r>
           <w:rPr>
             <w:rStyle w:val="Hyperlink"/>
@@ -1095,7 +1109,7 @@
             <w:noProof/>
             <w:webHidden/>
           </w:rPr>
-          <w:instrText xml:space="preserve"> PAGEREF _Toc56182746 \h </w:instrText>
+          <w:instrText xml:space="preserve"> PAGEREF _Toc58626639 \h </w:instrText>
         </w:r>
         <w:r>
           <w:rPr>
@@ -1140,7 +1154,7 @@
           <w:szCs w:val="22"/>
         </w:rPr>
       </w:pPr>
-      <w:hyperlink w:anchor="_Toc56182747" w:history="1">
+      <w:hyperlink w:anchor="_Toc58626640" w:history="1">
         <w:r>
           <w:rPr>
             <w:rStyle w:val="Hyperlink"/>
@@ -1183,7 +1197,7 @@
             <w:noProof/>
             <w:webHidden/>
           </w:rPr>
-          <w:instrText xml:space="preserve"> PAGEREF _Toc56182747 \h </w:instrText>
+          <w:instrText xml:space="preserve"> PAGEREF _Toc58626640 \h </w:instrText>
         </w:r>
         <w:r>
           <w:rPr>
@@ -1228,7 +1242,7 @@
           <w:szCs w:val="22"/>
         </w:rPr>
       </w:pPr>
-      <w:hyperlink w:anchor="_Toc56182748" w:history="1">
+      <w:hyperlink w:anchor="_Toc58626641" w:history="1">
         <w:r>
           <w:rPr>
             <w:rStyle w:val="Hyperlink"/>
@@ -1271,7 +1285,7 @@
             <w:noProof/>
             <w:webHidden/>
           </w:rPr>
-          <w:instrText xml:space="preserve"> PAGEREF _Toc56182748 \h </w:instrText>
+          <w:instrText xml:space="preserve"> PAGEREF _Toc58626641 \h </w:instrText>
         </w:r>
         <w:r>
           <w:rPr>
@@ -1316,7 +1330,7 @@
           <w:szCs w:val="22"/>
         </w:rPr>
       </w:pPr>
-      <w:hyperlink w:anchor="_Toc56182749" w:history="1">
+      <w:hyperlink w:anchor="_Toc58626642" w:history="1">
         <w:r>
           <w:rPr>
             <w:rStyle w:val="Hyperlink"/>
@@ -1359,7 +1373,7 @@
             <w:noProof/>
             <w:webHidden/>
           </w:rPr>
-          <w:instrText xml:space="preserve"> PAGEREF _Toc56182749 \h </w:instrText>
+          <w:instrText xml:space="preserve"> PAGEREF _Toc58626642 \h </w:instrText>
         </w:r>
         <w:r>
           <w:rPr>
@@ -1392,7 +1406,11 @@
     </w:p>
     <w:p>
       <w:pPr>
-        <w:pStyle w:val="Sumrio1"/>
+        <w:pStyle w:val="Sumrio3"/>
+        <w:tabs>
+          <w:tab w:val="left" w:pos="1200"/>
+          <w:tab w:val="right" w:pos="9062"/>
+        </w:tabs>
         <w:rPr>
           <w:rFonts w:asciiTheme="minorHAnsi" w:eastAsiaTheme="minorEastAsia" w:hAnsiTheme="minorHAnsi" w:cstheme="minorBidi"/>
           <w:noProof/>
@@ -1400,7 +1418,91 @@
           <w:szCs w:val="22"/>
         </w:rPr>
       </w:pPr>
-      <w:hyperlink w:anchor="_Toc56182750" w:history="1">
+      <w:hyperlink w:anchor="_Toc58626643" w:history="1">
+        <w:r>
+          <w:rPr>
+            <w:rStyle w:val="Hyperlink"/>
+            <w:noProof/>
+          </w:rPr>
+          <w:t>2.3.3</w:t>
+        </w:r>
+        <w:r>
+          <w:rPr>
+            <w:rFonts w:asciiTheme="minorHAnsi" w:eastAsiaTheme="minorEastAsia" w:hAnsiTheme="minorHAnsi" w:cstheme="minorBidi"/>
+            <w:noProof/>
+            <w:sz w:val="22"/>
+            <w:szCs w:val="22"/>
+          </w:rPr>
+          <w:tab/>
+        </w:r>
+        <w:r>
+          <w:rPr>
+            <w:rStyle w:val="Hyperlink"/>
+            <w:noProof/>
+          </w:rPr>
+          <w:t>O sistema</w:t>
+        </w:r>
+        <w:r>
+          <w:rPr>
+            <w:noProof/>
+            <w:webHidden/>
+          </w:rPr>
+          <w:tab/>
+        </w:r>
+        <w:r>
+          <w:rPr>
+            <w:noProof/>
+            <w:webHidden/>
+          </w:rPr>
+          <w:fldChar w:fldCharType="begin"/>
+        </w:r>
+        <w:r>
+          <w:rPr>
+            <w:noProof/>
+            <w:webHidden/>
+          </w:rPr>
+          <w:instrText xml:space="preserve"> PAGEREF _Toc58626643 \h </w:instrText>
+        </w:r>
+        <w:r>
+          <w:rPr>
+            <w:noProof/>
+            <w:webHidden/>
+          </w:rPr>
+        </w:r>
+        <w:r>
+          <w:rPr>
+            <w:noProof/>
+            <w:webHidden/>
+          </w:rPr>
+          <w:fldChar w:fldCharType="separate"/>
+        </w:r>
+        <w:r>
+          <w:rPr>
+            <w:noProof/>
+            <w:webHidden/>
+          </w:rPr>
+          <w:t>16</w:t>
+        </w:r>
+        <w:r>
+          <w:rPr>
+            <w:noProof/>
+            <w:webHidden/>
+          </w:rPr>
+          <w:fldChar w:fldCharType="end"/>
+        </w:r>
+      </w:hyperlink>
+    </w:p>
+    <w:p>
+      <w:pPr>
+        <w:pStyle w:val="Sumrio1"/>
+        <w:rPr>
+          <w:rFonts w:asciiTheme="minorHAnsi" w:eastAsiaTheme="minorEastAsia" w:hAnsiTheme="minorHAnsi" w:cstheme="minorBidi"/>
+          <w:noProof/>
+          <w:sz w:val="22"/>
+          <w:szCs w:val="22"/>
+        </w:rPr>
+      </w:pPr>
+      <w:hyperlink w:anchor="_Toc58626644" w:history="1">
         <w:r>
           <w:rPr>
             <w:rStyle w:val="Hyperlink"/>
@@ -1443,7 +1545,7 @@
             <w:noProof/>
             <w:webHidden/>
           </w:rPr>
-          <w:instrText xml:space="preserve"> PAGEREF _Toc56182750 \h </w:instrText>
+          <w:instrText xml:space="preserve"> PAGEREF _Toc58626644 \h </w:instrText>
         </w:r>
         <w:r>
           <w:rPr>
@@ -1463,7 +1565,7 @@
             <w:noProof/>
             <w:webHidden/>
           </w:rPr>
-          <w:t>18</w:t>
+          <w:t>20</w:t>
         </w:r>
         <w:r>
           <w:rPr>
@@ -1518,7 +1620,7 @@
       <w:pPr>
         <w:pStyle w:val="Ttulo1"/>
       </w:pPr>
-      <w:bookmarkStart w:id="3" w:name="_Toc56182739"/>
+      <w:bookmarkStart w:id="3" w:name="_Toc58626632"/>
       <w:r>
         <w:lastRenderedPageBreak/>
         <w:t>Introdução</w:t>
@@ -1527,14 +1629,26 @@
     </w:p>
     <w:p>
       <w:r>
-        <w:t xml:space="preserve">Este capítulo apresenta o problema a ser resolvido e o objetivo deste trabalho. </w:t>
+        <w:t>Este capítulo apresenta o problema a ser resolvido</w:t>
+      </w:r>
+      <w:r>
+        <w:t xml:space="preserve">, </w:t>
+      </w:r>
+      <w:r>
+        <w:rPr>
+          <w:highlight w:val="yellow"/>
+        </w:rPr>
+        <w:t>os objetivos a serem atingidos com esse trabalho, o escopo do sistema e o ferramental tecnológico utilizado.</w:t>
+      </w:r>
+      <w:r>
+        <w:t xml:space="preserve"> </w:t>
       </w:r>
     </w:p>
     <w:p>
       <w:pPr>
         <w:pStyle w:val="Ttulo2"/>
       </w:pPr>
-      <w:bookmarkStart w:id="4" w:name="_Toc56182740"/>
+      <w:bookmarkStart w:id="4" w:name="_Toc58626633"/>
       <w:r>
         <w:t>Definição do problema</w:t>
       </w:r>
@@ -1640,7 +1754,15 @@
         <w:t xml:space="preserve">, é inquestionável. Portanto, </w:t>
       </w:r>
       <w:r>
-        <w:t>o desenvolvimento de soluções cujo intuito é testar e garantir a qualidade de tais sistemas é oportuno e altamente relevante. Apesar disso, testar sistemas web não é tarefa fácil e requer, frequentemente, a automação de tarefas executadas ora por usuários humanos (e.g: interação com formulários e navegação entre páginas) e ora por outros sistemas computacionais (e.g.: testes de APIs de serviços web).</w:t>
+        <w:t>o desenvolvimento de soluções cujo intuito é testar e garantir a qualidade de tais sistemas é oportuno e altamente relevante. Apesar disso, testar sistemas web não é tarefa fácil e requer, frequentemente, a automação de tarefas executadas ora por usuários humanos (</w:t>
+      </w:r>
+      <w:proofErr w:type="spellStart"/>
+      <w:r>
+        <w:t>e.g</w:t>
+      </w:r>
+      <w:proofErr w:type="spellEnd"/>
+      <w:r>
+        <w:t>: interação com formulários e navegação entre páginas) e ora por outros sistemas computacionais (e.g.: testes de APIs de serviços web).</w:t>
       </w:r>
     </w:p>
     <w:p>
@@ -1674,19 +1796,70 @@
         <w:t xml:space="preserve"> </w:t>
       </w:r>
       <w:r>
-        <w:t>a execução, podendo ser feito por pessoas que não possui conhecimento técnico em linguagens de programação</w:t>
-      </w:r>
-      <w:r>
-        <w:t>. Dessa maneira, casos de teste podem ser facilmente gerenciados e reutilizados</w:t>
-      </w:r>
-      <w:r>
-        <w:t>,</w:t>
+        <w:t>a execução</w:t>
+      </w:r>
+      <w:r>
+        <w:t xml:space="preserve">. </w:t>
+      </w:r>
+      <w:r>
+        <w:rPr>
+          <w:highlight w:val="yellow"/>
+        </w:rPr>
+        <w:t>Esse gerenciamento pode ser</w:t>
+      </w:r>
+      <w:r>
+        <w:t xml:space="preserve"> feito por pessoas que não </w:t>
+      </w:r>
+      <w:r>
+        <w:rPr>
+          <w:highlight w:val="yellow"/>
+        </w:rPr>
+        <w:t>possu</w:t>
+      </w:r>
+      <w:r>
+        <w:rPr>
+          <w:highlight w:val="yellow"/>
+        </w:rPr>
+        <w:t>em</w:t>
+      </w:r>
+      <w:r>
+        <w:t xml:space="preserve"> conhecimento </w:t>
+      </w:r>
+      <w:r>
+        <w:rPr>
+          <w:highlight w:val="yellow"/>
+        </w:rPr>
+        <w:t xml:space="preserve">técnico </w:t>
+      </w:r>
+      <w:r>
+        <w:rPr>
+          <w:highlight w:val="yellow"/>
+        </w:rPr>
+        <w:t>detalhado</w:t>
       </w:r>
       <w:r>
         <w:t xml:space="preserve"> </w:t>
       </w:r>
       <w:r>
-        <w:t>em sistemas web similares</w:t>
+        <w:t>em linguagens de programação</w:t>
+      </w:r>
+      <w:r>
+        <w:t>. Dessa maneira, casos de teste podem ser facilmente gerenciados e reutilizado</w:t>
+      </w:r>
+      <w:r>
+        <w:rPr>
+          <w:highlight w:val="yellow"/>
+        </w:rPr>
+        <w:t xml:space="preserve">s </w:t>
+      </w:r>
+      <w:r>
+        <w:rPr>
+          <w:highlight w:val="yellow"/>
+        </w:rPr>
+        <w:t>em</w:t>
+      </w:r>
+      <w:r>
+        <w:t xml:space="preserve"> sistemas web similares</w:t>
       </w:r>
       <w:r>
         <w:t>.</w:t>
@@ -1697,24 +1870,33 @@
         <w:t xml:space="preserve">O trabalho foi realizado para obtenção de créditos na disciplina de Laboratório de Engenharia de Software sob a supervisão do </w:t>
       </w:r>
       <w:r>
-        <w:t>Dr.</w:t>
+        <w:rPr>
+          <w:highlight w:val="yellow"/>
+        </w:rPr>
+        <w:t>professor</w:t>
       </w:r>
       <w:r>
         <w:t xml:space="preserve"> </w:t>
       </w:r>
       <w:r>
-        <w:t>Fabrício Galende Marques de Carvalho</w:t>
-      </w:r>
-      <w:r>
-        <w:t xml:space="preserve">. </w:t>
+        <w:t xml:space="preserve">Fabrício </w:t>
+      </w:r>
+      <w:proofErr w:type="spellStart"/>
+      <w:r>
+        <w:t>Galende</w:t>
+      </w:r>
+      <w:proofErr w:type="spellEnd"/>
+      <w:r>
+        <w:t xml:space="preserve"> Marques de Carvalho. </w:t>
       </w:r>
     </w:p>
     <w:p>
       <w:pPr>
         <w:pStyle w:val="Ttulo2"/>
       </w:pPr>
-      <w:bookmarkStart w:id="5" w:name="_Toc56182741"/>
-      <w:r>
+      <w:bookmarkStart w:id="5" w:name="_Toc58626634"/>
+      <w:r>
+        <w:lastRenderedPageBreak/>
         <w:t>Objetivo</w:t>
       </w:r>
       <w:bookmarkEnd w:id="5"/>
@@ -1724,11 +1906,23 @@
         <w:t xml:space="preserve">O objetivo deste projeto </w:t>
       </w:r>
       <w:r>
-        <w:t xml:space="preserve">é desenvolver um sistema web que interaja com um conjunto de ferramentas de teste, tais como o Selenium Web Driver e o JUnit 5, de modo a automatizar </w:t>
-      </w:r>
-      <w:r>
-        <w:lastRenderedPageBreak/>
-        <w:t>a execução de testes em sistemas web</w:t>
+        <w:t xml:space="preserve">é desenvolver um sistema web que interaja com um conjunto de ferramentas de teste, tais como o </w:t>
+      </w:r>
+      <w:proofErr w:type="spellStart"/>
+      <w:r>
+        <w:t>Selenium</w:t>
+      </w:r>
+      <w:proofErr w:type="spellEnd"/>
+      <w:r>
+        <w:t xml:space="preserve"> Web Driver e o </w:t>
+      </w:r>
+      <w:proofErr w:type="spellStart"/>
+      <w:r>
+        <w:t>JUnit</w:t>
+      </w:r>
+      <w:proofErr w:type="spellEnd"/>
+      <w:r>
+        <w:t xml:space="preserve"> 5, de modo a automatizar a execução de testes em sistemas web</w:t>
       </w:r>
       <w:r>
         <w:t xml:space="preserve">, </w:t>
@@ -1747,7 +1941,7 @@
       <w:pPr>
         <w:pStyle w:val="Ttulo2"/>
       </w:pPr>
-      <w:bookmarkStart w:id="6" w:name="_Toc56182742"/>
+      <w:bookmarkStart w:id="6" w:name="_Toc58626635"/>
       <w:r>
         <w:t>Escopo</w:t>
       </w:r>
@@ -1790,6 +1984,7 @@
           <w:numId w:val="17"/>
         </w:numPr>
       </w:pPr>
+      <w:commentRangeStart w:id="7"/>
       <w:r>
         <w:t>Execução de testes funcionais;</w:t>
       </w:r>
@@ -1829,16 +2024,23 @@
       <w:r>
         <w:t>Execução de testes de segurança.</w:t>
       </w:r>
+      <w:commentRangeEnd w:id="7"/>
+      <w:r>
+        <w:rPr>
+          <w:rStyle w:val="Refdecomentrio"/>
+        </w:rPr>
+        <w:commentReference w:id="7"/>
+      </w:r>
     </w:p>
     <w:p>
       <w:pPr>
         <w:pStyle w:val="Ttulo2"/>
       </w:pPr>
-      <w:bookmarkStart w:id="7" w:name="_Toc56182743"/>
+      <w:bookmarkStart w:id="8" w:name="_Toc58626636"/>
       <w:r>
         <w:t>Tecnologias utilizadas</w:t>
       </w:r>
-      <w:bookmarkEnd w:id="7"/>
+      <w:bookmarkEnd w:id="8"/>
     </w:p>
     <w:p>
       <w:r>
@@ -1855,9 +2057,62 @@
           <w:ilvl w:val="0"/>
           <w:numId w:val="19"/>
         </w:numPr>
-      </w:pPr>
-      <w:r>
-        <w:t>Java EE 8;</w:t>
+        <w:rPr>
+          <w:highlight w:val="yellow"/>
+        </w:rPr>
+      </w:pPr>
+      <w:commentRangeStart w:id="9"/>
+      <w:r>
+        <w:rPr>
+          <w:highlight w:val="yellow"/>
+        </w:rPr>
+        <w:t>Java EE 8</w:t>
+      </w:r>
+      <w:r>
+        <w:rPr>
+          <w:highlight w:val="yellow"/>
+        </w:rPr>
+        <w:t xml:space="preserve">: Utilizada no </w:t>
+      </w:r>
+      <w:proofErr w:type="spellStart"/>
+      <w:r>
+        <w:rPr>
+          <w:highlight w:val="yellow"/>
+        </w:rPr>
+        <w:t>back</w:t>
+      </w:r>
+      <w:proofErr w:type="spellEnd"/>
+      <w:r>
+        <w:rPr>
+          <w:highlight w:val="yellow"/>
+        </w:rPr>
+        <w:t xml:space="preserve"> </w:t>
+      </w:r>
+      <w:proofErr w:type="spellStart"/>
+      <w:r>
+        <w:rPr>
+          <w:highlight w:val="yellow"/>
+        </w:rPr>
+        <w:t>end</w:t>
+      </w:r>
+      <w:proofErr w:type="spellEnd"/>
+      <w:r>
+        <w:rPr>
+          <w:highlight w:val="yellow"/>
+        </w:rPr>
+        <w:t xml:space="preserve"> d</w:t>
+      </w:r>
+      <w:r>
+        <w:rPr>
+          <w:highlight w:val="yellow"/>
+        </w:rPr>
+        <w:t>o modelo e gerenciador de testes</w:t>
+      </w:r>
+      <w:r>
+        <w:rPr>
+          <w:highlight w:val="yellow"/>
+        </w:rPr>
+        <w:t>;</w:t>
       </w:r>
     </w:p>
     <w:p>
@@ -1868,8 +2123,24 @@
           <w:numId w:val="19"/>
         </w:numPr>
       </w:pPr>
-      <w:r>
-        <w:t>Gradle Version 6.6.1</w:t>
+      <w:proofErr w:type="spellStart"/>
+      <w:r>
+        <w:t>Gradle</w:t>
+      </w:r>
+      <w:proofErr w:type="spellEnd"/>
+      <w:r>
+        <w:t xml:space="preserve"> </w:t>
+      </w:r>
+      <w:proofErr w:type="spellStart"/>
+      <w:r>
+        <w:t>Version</w:t>
+      </w:r>
+      <w:proofErr w:type="spellEnd"/>
+      <w:r>
+        <w:t xml:space="preserve"> 6.6.1</w:t>
+      </w:r>
+      <w:r>
+        <w:t>: Gerenciamento de dependências em linguagem Java</w:t>
       </w:r>
       <w:r>
         <w:t>;</w:t>
@@ -1883,9 +2154,19 @@
           <w:numId w:val="19"/>
         </w:numPr>
       </w:pPr>
-      <w:r>
-        <w:t>Selenium Webdriver</w:t>
-      </w:r>
+      <w:proofErr w:type="spellStart"/>
+      <w:r>
+        <w:t>Selenium</w:t>
+      </w:r>
+      <w:proofErr w:type="spellEnd"/>
+      <w:r>
+        <w:t xml:space="preserve"> </w:t>
+      </w:r>
+      <w:proofErr w:type="spellStart"/>
+      <w:r>
+        <w:t>Webdriver</w:t>
+      </w:r>
+      <w:proofErr w:type="spellEnd"/>
       <w:r>
         <w:t>;</w:t>
       </w:r>
@@ -1898,8 +2179,13 @@
           <w:numId w:val="19"/>
         </w:numPr>
       </w:pPr>
-      <w:r>
-        <w:t>JUnit 5;</w:t>
+      <w:proofErr w:type="spellStart"/>
+      <w:r>
+        <w:t>JUnit</w:t>
+      </w:r>
+      <w:proofErr w:type="spellEnd"/>
+      <w:r>
+        <w:t xml:space="preserve"> 5;</w:t>
       </w:r>
     </w:p>
     <w:p>
@@ -1940,8 +2226,21 @@
           <w:numId w:val="19"/>
         </w:numPr>
       </w:pPr>
-      <w:r>
-        <w:t>JavaScript (ECMAScript 6)</w:t>
+      <w:proofErr w:type="spellStart"/>
+      <w:r>
+        <w:t>JavaScript</w:t>
+      </w:r>
+      <w:proofErr w:type="spellEnd"/>
+      <w:r>
+        <w:t xml:space="preserve"> (</w:t>
+      </w:r>
+      <w:proofErr w:type="spellStart"/>
+      <w:r>
+        <w:t>ECMAScript</w:t>
+      </w:r>
+      <w:proofErr w:type="spellEnd"/>
+      <w:r>
+        <w:t xml:space="preserve"> 6)</w:t>
       </w:r>
       <w:r>
         <w:t>;</w:t>
@@ -1991,16 +2290,24 @@
       <w:r>
         <w:t>.</w:t>
       </w:r>
+      <w:commentRangeEnd w:id="9"/>
+      <w:r>
+        <w:rPr>
+          <w:rStyle w:val="Refdecomentrio"/>
+        </w:rPr>
+        <w:commentReference w:id="9"/>
+      </w:r>
     </w:p>
     <w:p>
       <w:pPr>
         <w:pStyle w:val="Ttulo1"/>
       </w:pPr>
-      <w:bookmarkStart w:id="8" w:name="_Toc56182744"/>
-      <w:r>
+      <w:bookmarkStart w:id="10" w:name="_Toc58626637"/>
+      <w:r>
+        <w:lastRenderedPageBreak/>
         <w:t>Desenvolvimento</w:t>
       </w:r>
-      <w:bookmarkEnd w:id="8"/>
+      <w:bookmarkEnd w:id="10"/>
     </w:p>
     <w:p>
       <w:r>
@@ -2011,14 +2318,13 @@
       <w:pPr>
         <w:pStyle w:val="Ttulo2"/>
       </w:pPr>
-      <w:bookmarkStart w:id="9" w:name="_Toc438245121"/>
-      <w:bookmarkStart w:id="10" w:name="_Toc56182745"/>
-      <w:r>
-        <w:lastRenderedPageBreak/>
+      <w:bookmarkStart w:id="11" w:name="_Toc438245121"/>
+      <w:bookmarkStart w:id="12" w:name="_Toc58626638"/>
+      <w:r>
         <w:t>Arquitetura</w:t>
       </w:r>
-      <w:bookmarkEnd w:id="9"/>
-      <w:bookmarkEnd w:id="10"/>
+      <w:bookmarkEnd w:id="11"/>
+      <w:bookmarkEnd w:id="12"/>
     </w:p>
     <w:p>
       <w:r>
@@ -2056,11 +2362,19 @@
         </w:numPr>
         <w:ind w:left="993" w:hanging="284"/>
       </w:pPr>
+      <w:proofErr w:type="spellStart"/>
       <w:r>
         <w:rPr>
           <w:b/>
         </w:rPr>
-        <w:t xml:space="preserve">FrontEnd </w:t>
+        <w:t>FrontEnd</w:t>
+      </w:r>
+      <w:proofErr w:type="spellEnd"/>
+      <w:r>
+        <w:rPr>
+          <w:b/>
+        </w:rPr>
+        <w:t xml:space="preserve"> </w:t>
       </w:r>
       <w:r>
         <w:t>– Responsável pela interface com usuári</w:t>
@@ -2078,12 +2392,14 @@
         </w:numPr>
         <w:ind w:left="993" w:hanging="284"/>
       </w:pPr>
+      <w:proofErr w:type="spellStart"/>
       <w:r>
         <w:rPr>
           <w:b/>
         </w:rPr>
         <w:t>BackEnd</w:t>
       </w:r>
+      <w:proofErr w:type="spellEnd"/>
       <w:r>
         <w:t xml:space="preserve"> -</w:t>
       </w:r>
@@ -2210,7 +2526,7 @@
                     <pic:cNvPicPr/>
                   </pic:nvPicPr>
                   <pic:blipFill>
-                    <a:blip r:embed="rId9">
+                    <a:blip r:embed="rId13">
                       <a:extLst>
                         <a:ext uri="{28A0092B-C50C-407E-A947-70E740481C1C}">
                           <a14:useLocalDpi xmlns:a14="http://schemas.microsoft.com/office/drawing/2010/main" val="0"/>
@@ -2285,14 +2601,14 @@
       <w:pPr>
         <w:pStyle w:val="Ttulo2"/>
       </w:pPr>
-      <w:bookmarkStart w:id="11" w:name="_Toc56182746"/>
-      <w:r>
-        <w:lastRenderedPageBreak/>
+      <w:bookmarkStart w:id="13" w:name="_Toc58626639"/>
+      <w:r>
         <w:t>Modelo de Dados</w:t>
       </w:r>
-      <w:bookmarkEnd w:id="11"/>
-    </w:p>
-    <w:p>
+      <w:bookmarkEnd w:id="13"/>
+    </w:p>
+    <w:p>
+      <w:commentRangeStart w:id="14"/>
       <w:r>
         <w:t>A Figura 2 apresenta o modelo de dados do sistema, com as seguintes tabelas:</w:t>
       </w:r>
@@ -2328,17 +2644,26 @@
         </w:numPr>
         <w:ind w:left="993" w:hanging="284"/>
       </w:pPr>
+      <w:proofErr w:type="spellStart"/>
       <w:r>
         <w:rPr>
           <w:b/>
         </w:rPr>
         <w:t>Caso_teste</w:t>
       </w:r>
+      <w:proofErr w:type="spellEnd"/>
       <w:r>
         <w:t xml:space="preserve"> – Armazena os dados do caso de teste cadastrado pelo usuário</w:t>
       </w:r>
       <w:r>
         <w:t>.</w:t>
+      </w:r>
+      <w:commentRangeEnd w:id="14"/>
+      <w:r>
+        <w:rPr>
+          <w:rStyle w:val="Refdecomentrio"/>
+        </w:rPr>
+        <w:commentReference w:id="14"/>
       </w:r>
     </w:p>
     <w:p/>
@@ -2447,7 +2772,7 @@
                     <pic:cNvPicPr/>
                   </pic:nvPicPr>
                   <pic:blipFill>
-                    <a:blip r:embed="rId10">
+                    <a:blip r:embed="rId14">
                       <a:extLst>
                         <a:ext uri="{28A0092B-C50C-407E-A947-70E740481C1C}">
                           <a14:useLocalDpi xmlns:a14="http://schemas.microsoft.com/office/drawing/2010/main" val="0"/>
@@ -2511,21 +2836,46 @@
       <w:pPr>
         <w:pStyle w:val="Ttulo2"/>
       </w:pPr>
-      <w:bookmarkStart w:id="12" w:name="_Toc56182747"/>
+      <w:bookmarkStart w:id="15" w:name="_Toc58626640"/>
       <w:r>
         <w:t>Detalhes</w:t>
       </w:r>
       <w:r>
         <w:t xml:space="preserve"> de desenvolvimento</w:t>
       </w:r>
-      <w:bookmarkEnd w:id="12"/>
+      <w:bookmarkEnd w:id="15"/>
       <w:r>
         <w:t xml:space="preserve"> </w:t>
       </w:r>
     </w:p>
     <w:p>
-      <w:r>
-        <w:t xml:space="preserve">O sistema web, desenvolvido utilizando a IDE Eclipse e Visual Studio Code foi dividido em três partes, sendo elas o FrontEnd, BackEnd (API) e Banco de Dados. </w:t>
+      <w:commentRangeStart w:id="16"/>
+      <w:r>
+        <w:t xml:space="preserve">O sistema web, desenvolvido utilizando a IDE Eclipse e Visual Studio </w:t>
+      </w:r>
+      <w:proofErr w:type="spellStart"/>
+      <w:r>
+        <w:t>Code</w:t>
+      </w:r>
+      <w:proofErr w:type="spellEnd"/>
+      <w:r>
+        <w:t xml:space="preserve"> foi dividido em três partes, sendo elas o </w:t>
+      </w:r>
+      <w:proofErr w:type="spellStart"/>
+      <w:r>
+        <w:t>FrontEnd</w:t>
+      </w:r>
+      <w:proofErr w:type="spellEnd"/>
+      <w:r>
+        <w:t xml:space="preserve">, </w:t>
+      </w:r>
+      <w:proofErr w:type="spellStart"/>
+      <w:r>
+        <w:t>BackEnd</w:t>
+      </w:r>
+      <w:proofErr w:type="spellEnd"/>
+      <w:r>
+        <w:t xml:space="preserve"> (API) e Banco de Dados. </w:t>
       </w:r>
       <w:r>
         <w:t xml:space="preserve">Abaixo, segue uma breve explicação </w:t>
@@ -2533,26 +2883,63 @@
       <w:r>
         <w:t xml:space="preserve">de cada uma das partes. </w:t>
       </w:r>
+      <w:commentRangeEnd w:id="16"/>
+      <w:r>
+        <w:rPr>
+          <w:rStyle w:val="Refdecomentrio"/>
+        </w:rPr>
+        <w:commentReference w:id="16"/>
+      </w:r>
     </w:p>
     <w:p>
       <w:pPr>
         <w:pStyle w:val="Ttulo3"/>
       </w:pPr>
-      <w:bookmarkStart w:id="13" w:name="_Toc56182748"/>
+      <w:bookmarkStart w:id="17" w:name="_Toc58626641"/>
+      <w:proofErr w:type="spellStart"/>
       <w:r>
         <w:t>FrontEnd</w:t>
       </w:r>
-      <w:bookmarkEnd w:id="13"/>
-    </w:p>
-    <w:p>
-      <w:r>
-        <w:t>Para o desenvolvimento do FrontEnd, responsável pela interface com usuário, foi utilizado o framework Angu</w:t>
-      </w:r>
-      <w:r>
-        <w:t>lar 7 e para os componentes visuais foi utilizado o primeng. A Figura 3 apresenta o código que exibe a tabela com os casos de teste cadastrados pelo usu</w:t>
-      </w:r>
-      <w:r>
-        <w:t xml:space="preserve">ário e </w:t>
+      <w:bookmarkEnd w:id="17"/>
+      <w:proofErr w:type="spellEnd"/>
+    </w:p>
+    <w:p>
+      <w:r>
+        <w:t xml:space="preserve">Para o desenvolvimento do </w:t>
+      </w:r>
+      <w:proofErr w:type="spellStart"/>
+      <w:r>
+        <w:t>FrontEnd</w:t>
+      </w:r>
+      <w:proofErr w:type="spellEnd"/>
+      <w:r>
+        <w:t>, responsável pela interface com usuário, foi utilizado o framework Angu</w:t>
+      </w:r>
+      <w:r>
+        <w:t xml:space="preserve">lar 7 e para os componentes visuais foi utilizado o </w:t>
+      </w:r>
+      <w:commentRangeStart w:id="18"/>
+      <w:proofErr w:type="spellStart"/>
+      <w:r>
+        <w:t>primeng</w:t>
+      </w:r>
+      <w:commentRangeEnd w:id="18"/>
+      <w:proofErr w:type="spellEnd"/>
+      <w:r>
+        <w:rPr>
+          <w:rStyle w:val="Refdecomentrio"/>
+        </w:rPr>
+        <w:commentReference w:id="18"/>
+      </w:r>
+      <w:r>
+        <w:t>. A Figura 3 apresenta o código que exibe a tabela com os casos de teste cadastrados pelo usu</w:t>
+      </w:r>
+      <w:r>
+        <w:t xml:space="preserve">ário </w:t>
+      </w:r>
+      <w:r>
+        <w:lastRenderedPageBreak/>
+        <w:t xml:space="preserve">e </w:t>
       </w:r>
       <w:r>
         <w:t>n</w:t>
@@ -2563,15 +2950,32 @@
       <w:r>
         <w:t xml:space="preserve"> o método </w:t>
       </w:r>
+      <w:proofErr w:type="spellStart"/>
       <w:r>
         <w:rPr>
           <w:b/>
           <w:u w:val="single"/>
         </w:rPr>
-        <w:t>buscarTodosCasosDeTeste()</w:t>
-      </w:r>
-      <w:r>
-        <w:t xml:space="preserve"> da service é instanciado no momento que a página é carregada</w:t>
+        <w:t>buscarTodosCasosDeTeste</w:t>
+      </w:r>
+      <w:proofErr w:type="spellEnd"/>
+      <w:r>
+        <w:rPr>
+          <w:b/>
+          <w:u w:val="single"/>
+        </w:rPr>
+        <w:t>()</w:t>
+      </w:r>
+      <w:r>
+        <w:t xml:space="preserve"> da </w:t>
+      </w:r>
+      <w:proofErr w:type="spellStart"/>
+      <w:r>
+        <w:t>service</w:t>
+      </w:r>
+      <w:proofErr w:type="spellEnd"/>
+      <w:r>
+        <w:t xml:space="preserve"> é instanciado no momento que a página é carregada</w:t>
       </w:r>
       <w:r>
         <w:t xml:space="preserve"> </w:t>
@@ -2589,7 +2993,6 @@
           <w:sz w:val="24"/>
           <w:szCs w:val="24"/>
         </w:rPr>
-        <w:lastRenderedPageBreak/>
         <w:t xml:space="preserve">Figura </w:t>
       </w:r>
       <w:r>
@@ -2682,7 +3085,7 @@
                     <pic:cNvPicPr/>
                   </pic:nvPicPr>
                   <pic:blipFill>
-                    <a:blip r:embed="rId11">
+                    <a:blip r:embed="rId15">
                       <a:extLst>
                         <a:ext uri="{28A0092B-C50C-407E-A947-70E740481C1C}">
                           <a14:useLocalDpi xmlns:a14="http://schemas.microsoft.com/office/drawing/2010/main" val="0"/>
@@ -2794,6 +3197,7 @@
         </w:rPr>
         <w:t xml:space="preserve"> – </w:t>
       </w:r>
+      <w:proofErr w:type="spellStart"/>
       <w:r>
         <w:rPr>
           <w:b w:val="0"/>
@@ -2802,6 +3206,7 @@
         </w:rPr>
         <w:t>home.component.ts</w:t>
       </w:r>
+      <w:proofErr w:type="spellEnd"/>
     </w:p>
     <w:p>
       <w:pPr>
@@ -2815,6 +3220,7 @@
         <w:rPr>
           <w:noProof/>
         </w:rPr>
+        <w:lastRenderedPageBreak/>
         <w:drawing>
           <wp:inline distT="0" distB="0" distL="0" distR="0" wp14:anchorId="428864A1" wp14:editId="02A9D5B4">
             <wp:extent cx="3749040" cy="3852354"/>
@@ -2831,7 +3237,7 @@
                     <pic:cNvPicPr/>
                   </pic:nvPicPr>
                   <pic:blipFill>
-                    <a:blip r:embed="rId12">
+                    <a:blip r:embed="rId16">
                       <a:extLst>
                         <a:ext uri="{28A0092B-C50C-407E-A947-70E740481C1C}">
                           <a14:useLocalDpi xmlns:a14="http://schemas.microsoft.com/office/drawing/2010/main" val="0"/>
@@ -2894,7 +3300,6 @@
         <w:jc w:val="left"/>
       </w:pPr>
       <w:r>
-        <w:lastRenderedPageBreak/>
         <w:t>A Figura 5 apresenta o trec</w:t>
       </w:r>
       <w:r>
@@ -2903,12 +3308,14 @@
       <w:r>
         <w:t xml:space="preserve">o de código da classe </w:t>
       </w:r>
+      <w:proofErr w:type="spellStart"/>
       <w:r>
         <w:rPr>
           <w:b/>
         </w:rPr>
         <w:t>TestadorService.ts</w:t>
       </w:r>
+      <w:proofErr w:type="spellEnd"/>
       <w:r>
         <w:rPr>
           <w:b/>
@@ -2918,6 +3325,7 @@
       <w:r>
         <w:t xml:space="preserve">em que o método </w:t>
       </w:r>
+      <w:proofErr w:type="spellStart"/>
       <w:r>
         <w:rPr>
           <w:b/>
@@ -2925,6 +3333,7 @@
         </w:rPr>
         <w:t>buscarTodosCasosDeTeste</w:t>
       </w:r>
+      <w:proofErr w:type="spellEnd"/>
       <w:r>
         <w:rPr>
           <w:b/>
@@ -2933,7 +3342,15 @@
         <w:t>()</w:t>
       </w:r>
       <w:r>
-        <w:t xml:space="preserve"> é responsável por fazer a requisição http para a API do backend, retornando assim os casos de teste.  </w:t>
+        <w:t xml:space="preserve"> é responsável por fazer a requisição http para a API do </w:t>
+      </w:r>
+      <w:proofErr w:type="spellStart"/>
+      <w:r>
+        <w:t>backend</w:t>
+      </w:r>
+      <w:proofErr w:type="spellEnd"/>
+      <w:r>
+        <w:t xml:space="preserve">, retornando assim os casos de teste.  </w:t>
       </w:r>
     </w:p>
     <w:p>
@@ -3000,7 +3417,25 @@
           <w:sz w:val="24"/>
           <w:szCs w:val="24"/>
         </w:rPr>
-        <w:t>método buscarTodosCasosDeTeste()</w:t>
+        <w:t xml:space="preserve">método </w:t>
+      </w:r>
+      <w:proofErr w:type="spellStart"/>
+      <w:r>
+        <w:rPr>
+          <w:b w:val="0"/>
+          <w:sz w:val="24"/>
+          <w:szCs w:val="24"/>
+        </w:rPr>
+        <w:t>buscarTodosCasosDeTeste</w:t>
+      </w:r>
+      <w:proofErr w:type="spellEnd"/>
+      <w:r>
+        <w:rPr>
+          <w:b w:val="0"/>
+          <w:sz w:val="24"/>
+          <w:szCs w:val="24"/>
+        </w:rPr>
+        <w:t>()</w:t>
       </w:r>
       <w:r>
         <w:rPr>
@@ -3038,7 +3473,7 @@
                     <pic:cNvPicPr/>
                   </pic:nvPicPr>
                   <pic:blipFill>
-                    <a:blip r:embed="rId13">
+                    <a:blip r:embed="rId17">
                       <a:extLst>
                         <a:ext uri="{28A0092B-C50C-407E-A947-70E740481C1C}">
                           <a14:useLocalDpi xmlns:a14="http://schemas.microsoft.com/office/drawing/2010/main" val="0"/>
@@ -3100,11 +3535,16 @@
       <w:r>
         <w:t xml:space="preserve"> </w:t>
       </w:r>
-      <w:bookmarkStart w:id="14" w:name="_Toc56182749"/>
-      <w:r>
-        <w:t>BackEnd (API)</w:t>
-      </w:r>
-      <w:bookmarkEnd w:id="14"/>
+      <w:bookmarkStart w:id="19" w:name="_Toc58626642"/>
+      <w:proofErr w:type="spellStart"/>
+      <w:r>
+        <w:t>BackEnd</w:t>
+      </w:r>
+      <w:proofErr w:type="spellEnd"/>
+      <w:r>
+        <w:t xml:space="preserve"> (API)</w:t>
+      </w:r>
+      <w:bookmarkEnd w:id="19"/>
     </w:p>
     <w:p>
       <w:pPr>
@@ -3113,7 +3553,15 @@
         </w:rPr>
       </w:pPr>
       <w:r>
-        <w:t>Para o desenvolvimento do BackEnd, responsável pelas regras de negócio e pela conexão com o banco de dados MySQL, foi utilizado</w:t>
+        <w:t xml:space="preserve">Para o desenvolvimento do </w:t>
+      </w:r>
+      <w:proofErr w:type="spellStart"/>
+      <w:r>
+        <w:t>BackEnd</w:t>
+      </w:r>
+      <w:proofErr w:type="spellEnd"/>
+      <w:r>
+        <w:t>, responsável pelas regras de negócio e pela conexão com o banco de dados MySQL, foi utilizado</w:t>
       </w:r>
       <w:r>
         <w:t xml:space="preserve"> o</w:t>
@@ -3121,8 +3569,13 @@
       <w:r>
         <w:t xml:space="preserve"> </w:t>
       </w:r>
-      <w:r>
-        <w:t>Gradle e o framework</w:t>
+      <w:proofErr w:type="spellStart"/>
+      <w:r>
+        <w:t>Gradle</w:t>
+      </w:r>
+      <w:proofErr w:type="spellEnd"/>
+      <w:r>
+        <w:t xml:space="preserve"> e o framework</w:t>
       </w:r>
       <w:r>
         <w:t xml:space="preserve"> Spring Boot</w:t>
@@ -3130,6 +3583,7 @@
       <w:r>
         <w:t xml:space="preserve">. A Figura 6 apresenta o método </w:t>
       </w:r>
+      <w:proofErr w:type="spellStart"/>
       <w:r>
         <w:rPr>
           <w:b/>
@@ -3144,6 +3598,7 @@
         </w:rPr>
         <w:t>uscarTodosCasosDeTeste</w:t>
       </w:r>
+      <w:proofErr w:type="spellEnd"/>
       <w:r>
         <w:rPr>
           <w:b/>
@@ -3182,16 +3637,26 @@
         </w:rPr>
         <w:t xml:space="preserve"> </w:t>
       </w:r>
+      <w:proofErr w:type="spellStart"/>
       <w:r>
         <w:rPr>
           <w:b/>
           <w:u w:val="single"/>
         </w:rPr>
-        <w:t>buscarTodosCasosDeTeste()</w:t>
-      </w:r>
+        <w:lastRenderedPageBreak/>
+        <w:t>buscarTodosCasosDeTeste</w:t>
+      </w:r>
+      <w:proofErr w:type="spellEnd"/>
       <w:r>
         <w:rPr>
           <w:b/>
+          <w:u w:val="single"/>
+        </w:rPr>
+        <w:t>()</w:t>
+      </w:r>
+      <w:r>
+        <w:rPr>
+          <w:b/>
         </w:rPr>
         <w:t xml:space="preserve"> </w:t>
       </w:r>
@@ -3217,7 +3682,15 @@
         <w:t xml:space="preserve">, </w:t>
       </w:r>
       <w:r>
-        <w:t>exibida na Figura 7, onde tem possíveis regras de negócio e realiza a comunicação com o repository.</w:t>
+        <w:t xml:space="preserve">exibida na Figura 7, onde tem possíveis regras de negócio e realiza a comunicação com o </w:t>
+      </w:r>
+      <w:proofErr w:type="spellStart"/>
+      <w:r>
+        <w:t>repository</w:t>
+      </w:r>
+      <w:proofErr w:type="spellEnd"/>
+      <w:r>
+        <w:t>.</w:t>
       </w:r>
       <w:r>
         <w:rPr>
@@ -3317,7 +3790,7 @@
                     <pic:cNvPicPr/>
                   </pic:nvPicPr>
                   <pic:blipFill>
-                    <a:blip r:embed="rId14">
+                    <a:blip r:embed="rId18">
                       <a:extLst>
                         <a:ext uri="{28A0092B-C50C-407E-A947-70E740481C1C}">
                           <a14:useLocalDpi xmlns:a14="http://schemas.microsoft.com/office/drawing/2010/main" val="0"/>
@@ -3469,7 +3942,7 @@
                     <pic:cNvPicPr/>
                   </pic:nvPicPr>
                   <pic:blipFill>
-                    <a:blip r:embed="rId15">
+                    <a:blip r:embed="rId19">
                       <a:extLst>
                         <a:ext uri="{28A0092B-C50C-407E-A947-70E740481C1C}">
                           <a14:useLocalDpi xmlns:a14="http://schemas.microsoft.com/office/drawing/2010/main" val="0"/>
@@ -3527,11 +4000,15 @@
     <w:p/>
     <w:p>
       <w:r>
-        <w:lastRenderedPageBreak/>
         <w:t xml:space="preserve">O </w:t>
       </w:r>
-      <w:r>
-        <w:t>repository por sua vez</w:t>
+      <w:proofErr w:type="spellStart"/>
+      <w:r>
+        <w:t>repository</w:t>
+      </w:r>
+      <w:proofErr w:type="spellEnd"/>
+      <w:r>
+        <w:t xml:space="preserve"> por sua vez</w:t>
       </w:r>
       <w:r>
         <w:t xml:space="preserve"> realiza a comunicação com o banco de dados através das queries nele contidas. A Figura 8 apresenta a classe </w:t>
@@ -3644,7 +4121,7 @@
                     <pic:cNvPicPr/>
                   </pic:nvPicPr>
                   <pic:blipFill>
-                    <a:blip r:embed="rId16">
+                    <a:blip r:embed="rId20">
                       <a:extLst>
                         <a:ext uri="{28A0092B-C50C-407E-A947-70E740481C1C}">
                           <a14:useLocalDpi xmlns:a14="http://schemas.microsoft.com/office/drawing/2010/main" val="0"/>
@@ -3738,6 +4215,7 @@
         </w:numPr>
       </w:pPr>
       <w:r>
+        <w:lastRenderedPageBreak/>
         <w:t>Define o tamanho da janela do navegador, maximizando</w:t>
       </w:r>
       <w:r>
@@ -3759,6 +4237,7 @@
       <w:r>
         <w:t xml:space="preserve">Define o tempo para o </w:t>
       </w:r>
+      <w:commentRangeStart w:id="20"/>
       <w:r>
         <w:rPr>
           <w:i/>
@@ -3773,6 +4252,13 @@
         </w:rPr>
         <w:t>.</w:t>
       </w:r>
+      <w:commentRangeEnd w:id="20"/>
+      <w:r>
+        <w:rPr>
+          <w:rStyle w:val="Refdecomentrio"/>
+        </w:rPr>
+        <w:commentReference w:id="20"/>
+      </w:r>
     </w:p>
     <w:p>
       <w:pPr>
@@ -3842,6 +4328,7 @@
         </w:rPr>
         <w:t xml:space="preserve"> – </w:t>
       </w:r>
+      <w:proofErr w:type="spellStart"/>
       <w:r>
         <w:rPr>
           <w:b w:val="0"/>
@@ -3849,7 +4336,17 @@
           <w:sz w:val="24"/>
           <w:szCs w:val="24"/>
         </w:rPr>
-        <w:t>setUpChromeDriver()</w:t>
+        <w:t>setUpChromeDriver</w:t>
+      </w:r>
+      <w:proofErr w:type="spellEnd"/>
+      <w:r>
+        <w:rPr>
+          <w:b w:val="0"/>
+          <w:bCs w:val="0"/>
+          <w:sz w:val="24"/>
+          <w:szCs w:val="24"/>
+        </w:rPr>
+        <w:t>()</w:t>
       </w:r>
     </w:p>
     <w:p>
@@ -3877,7 +4374,7 @@
                     <pic:cNvPicPr/>
                   </pic:nvPicPr>
                   <pic:blipFill>
-                    <a:blip r:embed="rId17">
+                    <a:blip r:embed="rId21">
                       <a:extLst>
                         <a:ext uri="{28A0092B-C50C-407E-A947-70E740481C1C}">
                           <a14:useLocalDpi xmlns:a14="http://schemas.microsoft.com/office/drawing/2010/main" val="0"/>
@@ -3939,7 +4436,6 @@
     </w:p>
     <w:p>
       <w:r>
-        <w:lastRenderedPageBreak/>
         <w:t xml:space="preserve">A Figura </w:t>
       </w:r>
       <w:r>
@@ -4052,6 +4548,7 @@
         </w:rPr>
         <w:t xml:space="preserve"> – </w:t>
       </w:r>
+      <w:proofErr w:type="spellStart"/>
       <w:r>
         <w:rPr>
           <w:b w:val="0"/>
@@ -4059,7 +4556,17 @@
           <w:sz w:val="24"/>
           <w:szCs w:val="24"/>
         </w:rPr>
-        <w:t>executarTestes()</w:t>
+        <w:t>executarTestes</w:t>
+      </w:r>
+      <w:proofErr w:type="spellEnd"/>
+      <w:r>
+        <w:rPr>
+          <w:b w:val="0"/>
+          <w:bCs w:val="0"/>
+          <w:sz w:val="24"/>
+          <w:szCs w:val="24"/>
+        </w:rPr>
+        <w:t>()</w:t>
       </w:r>
     </w:p>
     <w:p>
@@ -4071,6 +4578,7 @@
         <w:rPr>
           <w:noProof/>
         </w:rPr>
+        <w:lastRenderedPageBreak/>
         <w:drawing>
           <wp:inline distT="0" distB="0" distL="0" distR="0" wp14:anchorId="741DA935" wp14:editId="327DA7E7">
             <wp:extent cx="5760720" cy="6292850"/>
@@ -4087,7 +4595,7 @@
                     <pic:cNvPicPr/>
                   </pic:nvPicPr>
                   <pic:blipFill>
-                    <a:blip r:embed="rId18">
+                    <a:blip r:embed="rId22">
                       <a:extLst>
                         <a:ext uri="{28A0092B-C50C-407E-A947-70E740481C1C}">
                           <a14:useLocalDpi xmlns:a14="http://schemas.microsoft.com/office/drawing/2010/main" val="0"/>
@@ -4144,8 +4652,15 @@
     </w:p>
     <w:p>
       <w:r>
-        <w:lastRenderedPageBreak/>
-        <w:t xml:space="preserve">A Figura 11 apresenta o método responsável por retornar o by de acordo com o que foi definido para o teste recebido como parâmetro. </w:t>
+        <w:t xml:space="preserve">A Figura 11 apresenta o método responsável por retornar o </w:t>
+      </w:r>
+      <w:proofErr w:type="spellStart"/>
+      <w:r>
+        <w:t>by</w:t>
+      </w:r>
+      <w:proofErr w:type="spellEnd"/>
+      <w:r>
+        <w:t xml:space="preserve"> de acordo com o que foi definido para o teste recebido como parâmetro. </w:t>
       </w:r>
     </w:p>
     <w:p>
@@ -4206,6 +4721,7 @@
         </w:rPr>
         <w:t xml:space="preserve"> – </w:t>
       </w:r>
+      <w:proofErr w:type="spellStart"/>
       <w:r>
         <w:rPr>
           <w:b w:val="0"/>
@@ -4213,7 +4729,17 @@
           <w:sz w:val="24"/>
           <w:szCs w:val="24"/>
         </w:rPr>
-        <w:t>retornarElemento()</w:t>
+        <w:t>retornarElemento</w:t>
+      </w:r>
+      <w:proofErr w:type="spellEnd"/>
+      <w:r>
+        <w:rPr>
+          <w:b w:val="0"/>
+          <w:bCs w:val="0"/>
+          <w:sz w:val="24"/>
+          <w:szCs w:val="24"/>
+        </w:rPr>
+        <w:t>()</w:t>
       </w:r>
     </w:p>
     <w:p>
@@ -4225,6 +4751,7 @@
         <w:rPr>
           <w:noProof/>
         </w:rPr>
+        <w:lastRenderedPageBreak/>
         <w:drawing>
           <wp:inline distT="0" distB="0" distL="0" distR="0" wp14:anchorId="0A6D4CDD" wp14:editId="25982B5F">
             <wp:extent cx="5760720" cy="2753360"/>
@@ -4241,7 +4768,7 @@
                     <pic:cNvPicPr/>
                   </pic:nvPicPr>
                   <pic:blipFill>
-                    <a:blip r:embed="rId19"/>
+                    <a:blip r:embed="rId23"/>
                     <a:stretch>
                       <a:fillRect/>
                     </a:stretch>
@@ -4451,8 +4978,15 @@
         <w:jc w:val="left"/>
       </w:pPr>
       <w:r>
-        <w:lastRenderedPageBreak/>
-        <w:t>A Figura 12 apresenta uma parte dos métodos referente as ações do Selenium. Os pontos numerados correspondem a:</w:t>
+        <w:t xml:space="preserve">A Figura 12 apresenta uma parte dos métodos referente as ações do </w:t>
+      </w:r>
+      <w:proofErr w:type="spellStart"/>
+      <w:r>
+        <w:t>Selenium</w:t>
+      </w:r>
+      <w:proofErr w:type="spellEnd"/>
+      <w:r>
+        <w:t>. Os pontos numerados correspondem a:</w:t>
       </w:r>
     </w:p>
     <w:p>
@@ -4508,6 +5042,7 @@
         <w:jc w:val="left"/>
       </w:pPr>
       <w:r>
+        <w:lastRenderedPageBreak/>
         <w:t xml:space="preserve">Compara a saída esperada pelo usuário com o texto do elemento; </w:t>
       </w:r>
     </w:p>
@@ -4611,6 +5146,7 @@
         </w:rPr>
         <w:t xml:space="preserve"> – </w:t>
       </w:r>
+      <w:proofErr w:type="spellStart"/>
       <w:r>
         <w:rPr>
           <w:b w:val="0"/>
@@ -4618,7 +5154,17 @@
           <w:sz w:val="24"/>
           <w:szCs w:val="24"/>
         </w:rPr>
-        <w:t>MetodosTeste()</w:t>
+        <w:t>MetodosTeste</w:t>
+      </w:r>
+      <w:proofErr w:type="spellEnd"/>
+      <w:r>
+        <w:rPr>
+          <w:b w:val="0"/>
+          <w:bCs w:val="0"/>
+          <w:sz w:val="24"/>
+          <w:szCs w:val="24"/>
+        </w:rPr>
+        <w:t>()</w:t>
       </w:r>
     </w:p>
     <w:p>
@@ -4646,7 +5192,7 @@
                     <pic:cNvPicPr/>
                   </pic:nvPicPr>
                   <pic:blipFill>
-                    <a:blip r:embed="rId20">
+                    <a:blip r:embed="rId24">
                       <a:extLst>
                         <a:ext uri="{28A0092B-C50C-407E-A947-70E740481C1C}">
                           <a14:useLocalDpi xmlns:a14="http://schemas.microsoft.com/office/drawing/2010/main" val="0"/>
@@ -4713,11 +5259,29 @@
     </w:p>
     <w:p>
       <w:r>
-        <w:t>A Figura 13 apresenta os métodos escrever em TextField e TextArea</w:t>
-      </w:r>
-      <w:r>
-        <w:t xml:space="preserve"> e obterValorCampo</w:t>
-      </w:r>
+        <w:t xml:space="preserve">A Figura 13 apresenta os métodos escrever em </w:t>
+      </w:r>
+      <w:proofErr w:type="spellStart"/>
+      <w:r>
+        <w:t>TextField</w:t>
+      </w:r>
+      <w:proofErr w:type="spellEnd"/>
+      <w:r>
+        <w:t xml:space="preserve"> e </w:t>
+      </w:r>
+      <w:proofErr w:type="spellStart"/>
+      <w:r>
+        <w:t>TextArea</w:t>
+      </w:r>
+      <w:proofErr w:type="spellEnd"/>
+      <w:r>
+        <w:t xml:space="preserve"> e </w:t>
+      </w:r>
+      <w:proofErr w:type="spellStart"/>
+      <w:r>
+        <w:t>obterValorCampo</w:t>
+      </w:r>
+      <w:proofErr w:type="spellEnd"/>
       <w:r>
         <w:t>. Os pontos numerados correspondem a:</w:t>
       </w:r>
@@ -4731,7 +5295,55 @@
         </w:numPr>
       </w:pPr>
       <w:r>
-        <w:t>O método escrever com o By by por parâmetro (podendo pegar o elemento de várias maneiras. Exemplo: by.xpath, by.className, by.value, etc;</w:t>
+        <w:t xml:space="preserve">O método escrever com o </w:t>
+      </w:r>
+      <w:proofErr w:type="spellStart"/>
+      <w:r>
+        <w:t>By</w:t>
+      </w:r>
+      <w:proofErr w:type="spellEnd"/>
+      <w:r>
+        <w:t xml:space="preserve"> </w:t>
+      </w:r>
+      <w:proofErr w:type="spellStart"/>
+      <w:r>
+        <w:t>by</w:t>
+      </w:r>
+      <w:proofErr w:type="spellEnd"/>
+      <w:r>
+        <w:t xml:space="preserve"> por parâmetro (podendo pegar o elemento de várias maneiras. Exemplo: </w:t>
+      </w:r>
+      <w:proofErr w:type="spellStart"/>
+      <w:r>
+        <w:t>by.xpath</w:t>
+      </w:r>
+      <w:proofErr w:type="spellEnd"/>
+      <w:r>
+        <w:t xml:space="preserve">, </w:t>
+      </w:r>
+      <w:proofErr w:type="spellStart"/>
+      <w:r>
+        <w:t>by.className</w:t>
+      </w:r>
+      <w:proofErr w:type="spellEnd"/>
+      <w:r>
+        <w:t xml:space="preserve">, </w:t>
+      </w:r>
+      <w:proofErr w:type="spellStart"/>
+      <w:r>
+        <w:t>by.value</w:t>
+      </w:r>
+      <w:proofErr w:type="spellEnd"/>
+      <w:r>
+        <w:t xml:space="preserve">, </w:t>
+      </w:r>
+      <w:proofErr w:type="spellStart"/>
+      <w:r>
+        <w:t>etc</w:t>
+      </w:r>
+      <w:proofErr w:type="spellEnd"/>
+      <w:r>
+        <w:t>;</w:t>
       </w:r>
     </w:p>
     <w:p>
@@ -4755,7 +5367,23 @@
         </w:numPr>
       </w:pPr>
       <w:r>
-        <w:t>O método obterValorCampo, onde pega o valor pelo atributo “value”.</w:t>
+        <w:t xml:space="preserve">O método </w:t>
+      </w:r>
+      <w:proofErr w:type="spellStart"/>
+      <w:r>
+        <w:t>obterValorCampo</w:t>
+      </w:r>
+      <w:proofErr w:type="spellEnd"/>
+      <w:r>
+        <w:t>, onde pega o valor pelo atributo “</w:t>
+      </w:r>
+      <w:proofErr w:type="spellStart"/>
+      <w:r>
+        <w:t>value</w:t>
+      </w:r>
+      <w:proofErr w:type="spellEnd"/>
+      <w:r>
+        <w:t>”.</w:t>
       </w:r>
     </w:p>
     <w:p>
@@ -4771,7 +5399,6 @@
           <w:sz w:val="24"/>
           <w:szCs w:val="24"/>
         </w:rPr>
-        <w:lastRenderedPageBreak/>
         <w:t xml:space="preserve">Figura </w:t>
       </w:r>
       <w:r>
@@ -4817,6 +5444,7 @@
         </w:rPr>
         <w:t xml:space="preserve"> – </w:t>
       </w:r>
+      <w:proofErr w:type="spellStart"/>
       <w:r>
         <w:rPr>
           <w:b w:val="0"/>
@@ -4824,8 +5452,9 @@
           <w:sz w:val="24"/>
           <w:szCs w:val="24"/>
         </w:rPr>
-        <w:t>TextField e TextArea</w:t>
-      </w:r>
+        <w:t>TextField</w:t>
+      </w:r>
+      <w:proofErr w:type="spellEnd"/>
       <w:r>
         <w:rPr>
           <w:b w:val="0"/>
@@ -4833,6 +5462,26 @@
           <w:sz w:val="24"/>
           <w:szCs w:val="24"/>
         </w:rPr>
+        <w:t xml:space="preserve"> e </w:t>
+      </w:r>
+      <w:proofErr w:type="spellStart"/>
+      <w:r>
+        <w:rPr>
+          <w:b w:val="0"/>
+          <w:bCs w:val="0"/>
+          <w:sz w:val="24"/>
+          <w:szCs w:val="24"/>
+        </w:rPr>
+        <w:t>TextArea</w:t>
+      </w:r>
+      <w:proofErr w:type="spellEnd"/>
+      <w:r>
+        <w:rPr>
+          <w:b w:val="0"/>
+          <w:bCs w:val="0"/>
+          <w:sz w:val="24"/>
+          <w:szCs w:val="24"/>
+        </w:rPr>
         <w:t>()</w:t>
       </w:r>
     </w:p>
@@ -4845,6 +5494,7 @@
         <w:rPr>
           <w:noProof/>
         </w:rPr>
+        <w:lastRenderedPageBreak/>
         <w:drawing>
           <wp:inline distT="0" distB="0" distL="0" distR="0" wp14:anchorId="29253AE1" wp14:editId="72307280">
             <wp:extent cx="5334744" cy="2381582"/>
@@ -4861,7 +5511,7 @@
                     <pic:cNvPicPr/>
                   </pic:nvPicPr>
                   <pic:blipFill>
-                    <a:blip r:embed="rId21">
+                    <a:blip r:embed="rId25">
                       <a:extLst>
                         <a:ext uri="{28A0092B-C50C-407E-A947-70E740481C1C}">
                           <a14:useLocalDpi xmlns:a14="http://schemas.microsoft.com/office/drawing/2010/main" val="0"/>
@@ -4927,7 +5577,39 @@
       </w:pPr>
       <w:r>
         <w:tab/>
-        <w:t xml:space="preserve">A Figura 14 apresenta os métodos de clique em radios button e checkBox e a Figura 15 apresenta os métodos relacionados ao ComboBox, </w:t>
+        <w:t xml:space="preserve">A Figura 14 apresenta os métodos de clique em </w:t>
+      </w:r>
+      <w:proofErr w:type="spellStart"/>
+      <w:r>
+        <w:t>radios</w:t>
+      </w:r>
+      <w:proofErr w:type="spellEnd"/>
+      <w:r>
+        <w:t xml:space="preserve"> </w:t>
+      </w:r>
+      <w:proofErr w:type="spellStart"/>
+      <w:r>
+        <w:t>button</w:t>
+      </w:r>
+      <w:proofErr w:type="spellEnd"/>
+      <w:r>
+        <w:t xml:space="preserve"> e </w:t>
+      </w:r>
+      <w:proofErr w:type="spellStart"/>
+      <w:r>
+        <w:t>checkBox</w:t>
+      </w:r>
+      <w:proofErr w:type="spellEnd"/>
+      <w:r>
+        <w:t xml:space="preserve"> e a Figura 15 apresenta os métodos relacionados ao </w:t>
+      </w:r>
+      <w:proofErr w:type="spellStart"/>
+      <w:r>
+        <w:t>ComboBox</w:t>
+      </w:r>
+      <w:proofErr w:type="spellEnd"/>
+      <w:r>
+        <w:t xml:space="preserve">, </w:t>
       </w:r>
     </w:p>
     <w:p>
@@ -5007,6 +5689,7 @@
         </w:rPr>
         <w:t xml:space="preserve"> </w:t>
       </w:r>
+      <w:proofErr w:type="spellStart"/>
       <w:r>
         <w:rPr>
           <w:b w:val="0"/>
@@ -5014,8 +5697,29 @@
           <w:sz w:val="24"/>
           <w:szCs w:val="24"/>
         </w:rPr>
-        <w:t>radiosButton e checkBox</w:t>
-      </w:r>
+        <w:t>radiosButton</w:t>
+      </w:r>
+      <w:proofErr w:type="spellEnd"/>
+      <w:r>
+        <w:rPr>
+          <w:b w:val="0"/>
+          <w:bCs w:val="0"/>
+          <w:sz w:val="24"/>
+          <w:szCs w:val="24"/>
+        </w:rPr>
+        <w:t xml:space="preserve"> e </w:t>
+      </w:r>
+      <w:proofErr w:type="spellStart"/>
+      <w:r>
+        <w:rPr>
+          <w:b w:val="0"/>
+          <w:bCs w:val="0"/>
+          <w:sz w:val="24"/>
+          <w:szCs w:val="24"/>
+        </w:rPr>
+        <w:t>checkBox</w:t>
+      </w:r>
+      <w:proofErr w:type="spellEnd"/>
       <w:r>
         <w:rPr>
           <w:b w:val="0"/>
@@ -5051,7 +5755,7 @@
                     <pic:cNvPicPr/>
                   </pic:nvPicPr>
                   <pic:blipFill>
-                    <a:blip r:embed="rId22"/>
+                    <a:blip r:embed="rId26"/>
                     <a:stretch>
                       <a:fillRect/>
                     </a:stretch>
@@ -5123,7 +5827,6 @@
           <w:sz w:val="24"/>
           <w:szCs w:val="24"/>
         </w:rPr>
-        <w:lastRenderedPageBreak/>
         <w:t xml:space="preserve">Figura </w:t>
       </w:r>
       <w:r>
@@ -5169,6 +5872,7 @@
         </w:rPr>
         <w:t xml:space="preserve"> - </w:t>
       </w:r>
+      <w:proofErr w:type="spellStart"/>
       <w:r>
         <w:rPr>
           <w:b w:val="0"/>
@@ -5178,6 +5882,7 @@
         </w:rPr>
         <w:t>comboBox</w:t>
       </w:r>
+      <w:proofErr w:type="spellEnd"/>
       <w:r>
         <w:rPr>
           <w:b w:val="0"/>
@@ -5196,6 +5901,7 @@
         <w:rPr>
           <w:noProof/>
         </w:rPr>
+        <w:lastRenderedPageBreak/>
         <w:drawing>
           <wp:inline distT="0" distB="0" distL="0" distR="0" wp14:anchorId="5CC65D88" wp14:editId="73542B2F">
             <wp:extent cx="4153711" cy="3951261"/>
@@ -5212,7 +5918,7 @@
                     <pic:cNvPicPr/>
                   </pic:nvPicPr>
                   <pic:blipFill>
-                    <a:blip r:embed="rId23"/>
+                    <a:blip r:embed="rId27"/>
                     <a:stretch>
                       <a:fillRect/>
                     </a:stretch>
@@ -5264,7 +5970,15 @@
     <w:p/>
     <w:p>
       <w:r>
-        <w:t>A Figura 16 apresenta os métodos relacionados a troca de frames e janelas e as ações por JavaScript.</w:t>
+        <w:t xml:space="preserve">A Figura 16 apresenta os métodos relacionados a troca de frames e janelas e as ações por </w:t>
+      </w:r>
+      <w:proofErr w:type="spellStart"/>
+      <w:r>
+        <w:t>JavaScript</w:t>
+      </w:r>
+      <w:proofErr w:type="spellEnd"/>
+      <w:r>
+        <w:t>.</w:t>
       </w:r>
     </w:p>
     <w:p>
@@ -5325,6 +6039,7 @@
         </w:rPr>
         <w:t xml:space="preserve"> - </w:t>
       </w:r>
+      <w:proofErr w:type="spellStart"/>
       <w:r>
         <w:rPr>
           <w:b w:val="0"/>
@@ -5332,7 +6047,17 @@
           <w:sz w:val="24"/>
           <w:szCs w:val="24"/>
         </w:rPr>
-        <w:t>MetodosTeste()</w:t>
+        <w:t>MetodosTeste</w:t>
+      </w:r>
+      <w:proofErr w:type="spellEnd"/>
+      <w:r>
+        <w:rPr>
+          <w:b w:val="0"/>
+          <w:bCs w:val="0"/>
+          <w:sz w:val="24"/>
+          <w:szCs w:val="24"/>
+        </w:rPr>
+        <w:t>()</w:t>
       </w:r>
     </w:p>
     <w:p>
@@ -5360,7 +6085,7 @@
                     <pic:cNvPicPr/>
                   </pic:nvPicPr>
                   <pic:blipFill>
-                    <a:blip r:embed="rId24"/>
+                    <a:blip r:embed="rId28"/>
                     <a:stretch>
                       <a:fillRect/>
                     </a:stretch>
@@ -5413,9 +6138,43 @@
       <w:pPr>
         <w:pStyle w:val="Ttulo3"/>
       </w:pPr>
+      <w:bookmarkStart w:id="21" w:name="_Toc58626643"/>
       <w:r>
         <w:lastRenderedPageBreak/>
-        <w:t xml:space="preserve">O sistema </w:t>
+        <w:t>O sistema</w:t>
+      </w:r>
+      <w:bookmarkEnd w:id="21"/>
+      <w:r>
+        <w:t xml:space="preserve"> </w:t>
+      </w:r>
+    </w:p>
+    <w:p>
+      <w:pPr>
+        <w:rPr>
+          <w:color w:val="FFFFFF" w:themeColor="background1"/>
+          <w:highlight w:val="red"/>
+        </w:rPr>
+      </w:pPr>
+      <w:r>
+        <w:rPr>
+          <w:color w:val="FFFFFF" w:themeColor="background1"/>
+          <w:highlight w:val="red"/>
+        </w:rPr>
+        <w:t xml:space="preserve">MOVER TODA A SEÇÃO 2.3.3 PARA A PARTE DE RESULTADOS E DISCUSSÕES. RECOMENDO TAMBÉM QUE, AO INVÉS DE UM PARÁGRAFO GRANDE, VOCÊ USE PARÁGRAFOS CURTOS, IMEDIATAMENTE ANTES DE CADA FIGURA. DO JEITO QUE ESTÁ O FLUXO DA LEITURA FICA MUITO CONFUSO. FAÇA ASSIM: </w:t>
+      </w:r>
+    </w:p>
+    <w:p>
+      <w:pPr>
+        <w:rPr>
+          <w:color w:val="FFFFFF" w:themeColor="background1"/>
+        </w:rPr>
+      </w:pPr>
+      <w:r>
+        <w:rPr>
+          <w:color w:val="FFFFFF" w:themeColor="background1"/>
+          <w:highlight w:val="red"/>
+        </w:rPr>
+        <w:t>A figura tal apresenta tal coisa. Com tais entradas e tais saídas, que servem para tal coisa...</w:t>
       </w:r>
     </w:p>
     <w:p>
@@ -5465,7 +6224,15 @@
         <w:t>23</w:t>
       </w:r>
       <w:r>
-        <w:t xml:space="preserve"> apresenta o load na tela, aguardando o resultado da execução. Finalmente, as Figuras </w:t>
+        <w:t xml:space="preserve"> apresenta o </w:t>
+      </w:r>
+      <w:proofErr w:type="spellStart"/>
+      <w:r>
+        <w:t>load</w:t>
+      </w:r>
+      <w:proofErr w:type="spellEnd"/>
+      <w:r>
+        <w:t xml:space="preserve"> na tela, aguardando o resultado da execução. Finalmente, as Figuras </w:t>
       </w:r>
       <w:r>
         <w:t>24</w:t>
@@ -5598,7 +6365,7 @@
                     <pic:cNvPicPr/>
                   </pic:nvPicPr>
                   <pic:blipFill>
-                    <a:blip r:embed="rId25">
+                    <a:blip r:embed="rId29">
                       <a:extLst>
                         <a:ext uri="{28A0092B-C50C-407E-A947-70E740481C1C}">
                           <a14:useLocalDpi xmlns:a14="http://schemas.microsoft.com/office/drawing/2010/main" val="0"/>
@@ -5756,7 +6523,7 @@
                     <pic:cNvPicPr/>
                   </pic:nvPicPr>
                   <pic:blipFill>
-                    <a:blip r:embed="rId26">
+                    <a:blip r:embed="rId30">
                       <a:extLst>
                         <a:ext uri="{28A0092B-C50C-407E-A947-70E740481C1C}">
                           <a14:useLocalDpi xmlns:a14="http://schemas.microsoft.com/office/drawing/2010/main" val="0"/>
@@ -5926,7 +6693,7 @@
                     <pic:cNvPicPr/>
                   </pic:nvPicPr>
                   <pic:blipFill>
-                    <a:blip r:embed="rId27">
+                    <a:blip r:embed="rId31">
                       <a:extLst>
                         <a:ext uri="{28A0092B-C50C-407E-A947-70E740481C1C}">
                           <a14:useLocalDpi xmlns:a14="http://schemas.microsoft.com/office/drawing/2010/main" val="0"/>
@@ -6109,7 +6876,7 @@
                     <pic:cNvPicPr/>
                   </pic:nvPicPr>
                   <pic:blipFill>
-                    <a:blip r:embed="rId28">
+                    <a:blip r:embed="rId32">
                       <a:extLst>
                         <a:ext uri="{28A0092B-C50C-407E-A947-70E740481C1C}">
                           <a14:useLocalDpi xmlns:a14="http://schemas.microsoft.com/office/drawing/2010/main" val="0"/>
@@ -6261,7 +7028,7 @@
                     <pic:cNvPicPr/>
                   </pic:nvPicPr>
                   <pic:blipFill>
-                    <a:blip r:embed="rId29">
+                    <a:blip r:embed="rId33">
                       <a:extLst>
                         <a:ext uri="{28A0092B-C50C-407E-A947-70E740481C1C}">
                           <a14:useLocalDpi xmlns:a14="http://schemas.microsoft.com/office/drawing/2010/main" val="0"/>
@@ -6379,6 +7146,7 @@
         </w:rPr>
         <w:t xml:space="preserve"> - </w:t>
       </w:r>
+      <w:proofErr w:type="spellStart"/>
       <w:r>
         <w:rPr>
           <w:b w:val="0"/>
@@ -6388,6 +7156,7 @@
         </w:rPr>
         <w:t>Load</w:t>
       </w:r>
+      <w:proofErr w:type="spellEnd"/>
     </w:p>
     <w:p>
       <w:pPr>
@@ -6413,7 +7182,7 @@
                     <pic:cNvPicPr/>
                   </pic:nvPicPr>
                   <pic:blipFill>
-                    <a:blip r:embed="rId30">
+                    <a:blip r:embed="rId34">
                       <a:extLst>
                         <a:ext uri="{28A0092B-C50C-407E-A947-70E740481C1C}">
                           <a14:useLocalDpi xmlns:a14="http://schemas.microsoft.com/office/drawing/2010/main" val="0"/>
@@ -6610,7 +7379,7 @@
                     <pic:cNvPicPr/>
                   </pic:nvPicPr>
                   <pic:blipFill>
-                    <a:blip r:embed="rId31">
+                    <a:blip r:embed="rId35">
                       <a:extLst>
                         <a:ext uri="{28A0092B-C50C-407E-A947-70E740481C1C}">
                           <a14:useLocalDpi xmlns:a14="http://schemas.microsoft.com/office/drawing/2010/main" val="0"/>
@@ -6762,7 +7531,7 @@
                     <pic:cNvPicPr/>
                   </pic:nvPicPr>
                   <pic:blipFill>
-                    <a:blip r:embed="rId32">
+                    <a:blip r:embed="rId36">
                       <a:extLst>
                         <a:ext uri="{28A0092B-C50C-407E-A947-70E740481C1C}">
                           <a14:useLocalDpi xmlns:a14="http://schemas.microsoft.com/office/drawing/2010/main" val="0"/>
@@ -6966,7 +7735,7 @@
                     <pic:cNvPicPr/>
                   </pic:nvPicPr>
                   <pic:blipFill>
-                    <a:blip r:embed="rId33">
+                    <a:blip r:embed="rId37">
                       <a:extLst>
                         <a:ext uri="{28A0092B-C50C-407E-A947-70E740481C1C}">
                           <a14:useLocalDpi xmlns:a14="http://schemas.microsoft.com/office/drawing/2010/main" val="0"/>
@@ -7026,18 +7795,43 @@
       <w:pPr>
         <w:pStyle w:val="Ttulo1"/>
       </w:pPr>
-      <w:bookmarkStart w:id="15" w:name="_Toc56182750"/>
-      <w:r>
-        <w:t>Resultados e Discussão</w:t>
-      </w:r>
-      <w:bookmarkEnd w:id="15"/>
-    </w:p>
+      <w:bookmarkStart w:id="22" w:name="_Toc58626644"/>
+      <w:r>
+        <w:t xml:space="preserve">Resultados </w:t>
+      </w:r>
+      <w:r>
+        <w:t>e discussão</w:t>
+      </w:r>
+    </w:p>
+    <w:p>
+      <w:r>
+        <w:t>(Inserir aqui o conteúdo de 2.3.3 e eliminar a seção 2.3.3)</w:t>
+      </w:r>
+    </w:p>
+    <w:p/>
+    <w:bookmarkEnd w:id="22"/>
     <w:p>
       <w:pPr>
         <w:textAlignment w:val="baseline"/>
       </w:pPr>
       <w:r>
-        <w:t xml:space="preserve">Dentre as tecnologias utilizadas neste sistema, são dignos de nota os seguintes itens: Angular7, JAVA, Spring Boot, API REST, Selenium, Junit. </w:t>
+        <w:t xml:space="preserve">Dentre as tecnologias utilizadas neste sistema, são dignos de nota os seguintes itens: Angular7, JAVA, Spring Boot, API REST, </w:t>
+      </w:r>
+      <w:proofErr w:type="spellStart"/>
+      <w:r>
+        <w:t>Selenium</w:t>
+      </w:r>
+      <w:proofErr w:type="spellEnd"/>
+      <w:r>
+        <w:t xml:space="preserve">, </w:t>
+      </w:r>
+      <w:proofErr w:type="spellStart"/>
+      <w:r>
+        <w:t>Junit</w:t>
+      </w:r>
+      <w:proofErr w:type="spellEnd"/>
+      <w:r>
+        <w:t xml:space="preserve">. </w:t>
       </w:r>
     </w:p>
     <w:p>
@@ -7045,13 +7839,37 @@
         <w:textAlignment w:val="baseline"/>
       </w:pPr>
       <w:r>
-        <w:t xml:space="preserve">A divisão do projeto em FrontEnd e BackEnd facilitou muito o desenvolvimento do sistema e consequentemente sua organização. Outro ponto </w:t>
+        <w:t xml:space="preserve">A divisão do projeto em </w:t>
+      </w:r>
+      <w:proofErr w:type="spellStart"/>
+      <w:r>
+        <w:t>FrontEnd</w:t>
+      </w:r>
+      <w:proofErr w:type="spellEnd"/>
+      <w:r>
+        <w:t xml:space="preserve"> e </w:t>
+      </w:r>
+      <w:proofErr w:type="spellStart"/>
+      <w:r>
+        <w:t>BackEnd</w:t>
+      </w:r>
+      <w:proofErr w:type="spellEnd"/>
+      <w:r>
+        <w:t xml:space="preserve"> facilitou muito o desenvolvimento do sistema e consequentemente sua organização. Outro ponto </w:t>
       </w:r>
       <w:r>
         <w:t>a se destacar</w:t>
       </w:r>
       <w:r>
-        <w:t xml:space="preserve"> é que o backend disponibiliza uma API REST que futuramente poderá ser consumida por outros sistemas, permitindo assim a integração deste projeto com interfaces externas</w:t>
+        <w:t xml:space="preserve"> é que o </w:t>
+      </w:r>
+      <w:proofErr w:type="spellStart"/>
+      <w:r>
+        <w:t>backend</w:t>
+      </w:r>
+      <w:proofErr w:type="spellEnd"/>
+      <w:r>
+        <w:t xml:space="preserve"> disponibiliza uma API REST que futuramente poderá ser consumida por outros sistemas, permitindo assim a integração deste projeto com interfaces externas</w:t>
       </w:r>
       <w:r>
         <w:t>.</w:t>
@@ -7059,31 +7877,199 @@
     </w:p>
     <w:p>
       <w:r>
-        <w:t xml:space="preserve">O trabalho foi realizado com o cumprimento das diretrizes da disciplina Lab. Engenharia de Software, sendo desenvolvido um sistema web complementar, utilizado afins de teste do sistema gerenciador. O sistema web complementar foi um crud </w:t>
-      </w:r>
-      <w:r>
-        <w:t>de cadastro</w:t>
-      </w:r>
-      <w:r>
-        <w:t xml:space="preserve"> de usuário onde foi utilizado as seguintes tecnologias: Gradle, Java 8, JPA Hibernate, JSP, CSS, JavaScript, Banco de Dados MySql e padrão MVC. </w:t>
-      </w:r>
-    </w:p>
-    <w:p>
-      <w:r>
-        <w:t xml:space="preserve">A Figura 26 e 27 apresenta </w:t>
-      </w:r>
-      <w:r>
-        <w:t>o sistema web de cadastro de usuário</w:t>
-      </w:r>
-      <w:r>
-        <w:t xml:space="preserve">. </w:t>
+        <w:t>Ressalte-se também que, ao longo do desenvolvimento do gerenciador de casos de teste, foi desenvolvido</w:t>
+      </w:r>
+      <w:r>
+        <w:t xml:space="preserve"> </w:t>
+      </w:r>
+      <w:r>
+        <w:rPr>
+          <w:highlight w:val="yellow"/>
+        </w:rPr>
+        <w:t>u</w:t>
+      </w:r>
+      <w:r>
+        <w:rPr>
+          <w:highlight w:val="yellow"/>
+        </w:rPr>
+        <w:t>m sistema web simplificado com propósito de servir como sistema para teste do gerenciador</w:t>
+      </w:r>
+      <w:r>
+        <w:rPr>
+          <w:highlight w:val="yellow"/>
+        </w:rPr>
+        <w:t>.</w:t>
+      </w:r>
+      <w:r>
+        <w:t xml:space="preserve"> </w:t>
+      </w:r>
+      <w:r>
+        <w:rPr>
+          <w:highlight w:val="yellow"/>
+        </w:rPr>
+        <w:t>Tal sistema permitiu testar o gerenciador de modo controlado antes de ser aplicado a outros sistemas reais, potencialmente mais complexos.</w:t>
+      </w:r>
+      <w:r>
+        <w:rPr>
+          <w:highlight w:val="yellow"/>
+        </w:rPr>
+        <w:t xml:space="preserve"> </w:t>
+      </w:r>
+      <w:r>
+        <w:rPr>
+          <w:highlight w:val="yellow"/>
+        </w:rPr>
+        <w:t>Esse sistema consistiu em</w:t>
+      </w:r>
+      <w:r>
+        <w:rPr>
+          <w:highlight w:val="yellow"/>
+        </w:rPr>
+        <w:t xml:space="preserve"> um </w:t>
+      </w:r>
+      <w:r>
+        <w:rPr>
+          <w:highlight w:val="yellow"/>
+        </w:rPr>
+        <w:t>cadastro</w:t>
+      </w:r>
+      <w:r>
+        <w:rPr>
+          <w:highlight w:val="yellow"/>
+        </w:rPr>
+        <w:t xml:space="preserve"> simplificado </w:t>
+      </w:r>
+      <w:r>
+        <w:rPr>
+          <w:highlight w:val="yellow"/>
+        </w:rPr>
+        <w:t xml:space="preserve">de usuário </w:t>
+      </w:r>
+      <w:r>
+        <w:rPr>
+          <w:highlight w:val="yellow"/>
+        </w:rPr>
+        <w:t>onde foram utilizadas tecnologias tais como</w:t>
+      </w:r>
+      <w:r>
+        <w:t xml:space="preserve"> </w:t>
+      </w:r>
+      <w:proofErr w:type="spellStart"/>
+      <w:r>
+        <w:t>Gradle</w:t>
+      </w:r>
+      <w:proofErr w:type="spellEnd"/>
+      <w:r>
+        <w:t xml:space="preserve">, Java 8, JPA </w:t>
+      </w:r>
+      <w:proofErr w:type="spellStart"/>
+      <w:r>
+        <w:t>Hibernate</w:t>
+      </w:r>
+      <w:proofErr w:type="spellEnd"/>
+      <w:r>
+        <w:t xml:space="preserve">, JSP, CSS, </w:t>
+      </w:r>
+      <w:proofErr w:type="spellStart"/>
+      <w:r>
+        <w:t>JavaScript</w:t>
+      </w:r>
+      <w:proofErr w:type="spellEnd"/>
+      <w:r>
+        <w:t xml:space="preserve">, Banco de Dados </w:t>
+      </w:r>
+      <w:proofErr w:type="spellStart"/>
+      <w:r>
+        <w:t>MySql</w:t>
+      </w:r>
+      <w:proofErr w:type="spellEnd"/>
+      <w:r>
+        <w:t xml:space="preserve"> e padrão MVC. </w:t>
+      </w:r>
+    </w:p>
+    <w:p>
+      <w:r>
+        <w:rPr>
+          <w:highlight w:val="yellow"/>
+        </w:rPr>
+        <w:t>A interface desse sistema é mostrada nas figuras do Anexo I.</w:t>
+      </w:r>
+    </w:p>
+    <w:p>
+      <w:pPr>
+        <w:ind w:firstLine="0"/>
+      </w:pPr>
+      <w:r>
+        <w:rPr>
+          <w:color w:val="FFFFFF" w:themeColor="background1"/>
+          <w:highlight w:val="red"/>
+        </w:rPr>
+        <w:t>Encerre o trabalh</w:t>
+      </w:r>
+      <w:r>
+        <w:rPr>
+          <w:color w:val="FFFFFF" w:themeColor="background1"/>
+          <w:highlight w:val="red"/>
+        </w:rPr>
+        <w:t>o sugerindo melhorias para trabalhos futuros (que você ou outros que utilizem seu sistema podem fazer</w:t>
+      </w:r>
+      <w:r>
+        <w:rPr>
+          <w:color w:val="FFFFFF" w:themeColor="background1"/>
+          <w:highlight w:val="red"/>
+        </w:rPr>
+        <w:t>). Você sabe das limitações e o que pode ser melhorado</w:t>
+      </w:r>
+      <w:r>
+        <w:rPr>
+          <w:color w:val="FFFFFF" w:themeColor="background1"/>
+          <w:highlight w:val="red"/>
+        </w:rPr>
+        <w:t xml:space="preserve">. Cite pois isso </w:t>
+      </w:r>
+      <w:r>
+        <w:rPr>
+          <w:color w:val="FFFFFF" w:themeColor="background1"/>
+          <w:highlight w:val="red"/>
+        </w:rPr>
+        <w:lastRenderedPageBreak/>
+        <w:t>demonstra que você está perfeitamente consciente do que foi feito e não está ignorando ou tentando omitir. Isso passa uma boa imagem ao leitor (em especial ao professor avaliador)</w:t>
+      </w:r>
+      <w:r>
+        <w:rPr>
+          <w:color w:val="FFFFFF" w:themeColor="background1"/>
+          <w:highlight w:val="red"/>
+        </w:rPr>
+        <w:t>.</w:t>
       </w:r>
     </w:p>
     <w:p/>
     <w:p/>
     <w:p/>
     <w:p/>
-    <w:p/>
+    <w:p>
+      <w:pPr>
+        <w:jc w:val="center"/>
+      </w:pPr>
+      <w:r>
+        <w:rPr>
+          <w:highlight w:val="yellow"/>
+        </w:rPr>
+        <w:t>ANEXO I:</w:t>
+      </w:r>
+      <w:r>
+        <w:rPr>
+          <w:highlight w:val="yellow"/>
+        </w:rPr>
+        <w:t xml:space="preserve"> </w:t>
+      </w:r>
+      <w:r>
+        <w:rPr>
+          <w:highlight w:val="yellow"/>
+        </w:rPr>
+        <w:t xml:space="preserve"> INTERFACES DO SISTEMA UTILIZADO EM TESTES AO LONGO DO DESENVOLVIMENTO DO GERENCIADOR.</w:t>
+      </w:r>
+    </w:p>
     <w:p>
       <w:pPr>
         <w:pStyle w:val="Legenda"/>
@@ -7097,7 +8083,6 @@
           <w:sz w:val="24"/>
           <w:szCs w:val="24"/>
         </w:rPr>
-        <w:lastRenderedPageBreak/>
         <w:t>F</w:t>
       </w:r>
       <w:r>
@@ -7155,7 +8140,7 @@
                     <pic:cNvPicPr/>
                   </pic:nvPicPr>
                   <pic:blipFill>
-                    <a:blip r:embed="rId34"/>
+                    <a:blip r:embed="rId38"/>
                     <a:stretch>
                       <a:fillRect/>
                     </a:stretch>
@@ -7236,21 +8221,7 @@
           <w:sz w:val="24"/>
           <w:szCs w:val="24"/>
         </w:rPr>
-        <w:t>2</w:t>
-      </w:r>
-      <w:r>
-        <w:rPr>
-          <w:sz w:val="24"/>
-          <w:szCs w:val="24"/>
-        </w:rPr>
-        <w:t>7</w:t>
-      </w:r>
-      <w:r>
-        <w:rPr>
-          <w:sz w:val="24"/>
-          <w:szCs w:val="24"/>
-        </w:rPr>
-        <w:t xml:space="preserve"> –</w:t>
+        <w:t>27 –</w:t>
       </w:r>
       <w:r>
         <w:rPr>
@@ -7266,16 +8237,7 @@
           <w:sz w:val="24"/>
           <w:szCs w:val="24"/>
         </w:rPr>
-        <w:t xml:space="preserve">Tela de </w:t>
-      </w:r>
-      <w:r>
-        <w:rPr>
-          <w:b w:val="0"/>
-          <w:bCs w:val="0"/>
-          <w:sz w:val="24"/>
-          <w:szCs w:val="24"/>
-        </w:rPr>
-        <w:t>cadastro</w:t>
+        <w:t>Tela de cadastro</w:t>
       </w:r>
     </w:p>
     <w:p>
@@ -7303,7 +8265,7 @@
                     <pic:cNvPicPr/>
                   </pic:nvPicPr>
                   <pic:blipFill>
-                    <a:blip r:embed="rId35"/>
+                    <a:blip r:embed="rId39"/>
                     <a:stretch>
                       <a:fillRect/>
                     </a:stretch>
@@ -7359,8 +8321,8 @@
       </w:pPr>
     </w:p>
     <w:sectPr>
-      <w:headerReference w:type="default" r:id="rId36"/>
-      <w:footerReference w:type="default" r:id="rId37"/>
+      <w:headerReference w:type="default" r:id="rId40"/>
+      <w:footerReference w:type="default" r:id="rId41"/>
       <w:pgSz w:w="11907" w:h="16840" w:code="9"/>
       <w:pgMar w:top="1701" w:right="1134" w:bottom="1134" w:left="1701" w:header="1134" w:footer="1134" w:gutter="0"/>
       <w:cols w:space="720"/>
@@ -7369,6 +8331,192 @@
     </w:sectPr>
   </w:body>
 </w:document>
+</file>
+
+<file path=word/comments.xml><?xml version="1.0" encoding="utf-8"?>
+<w:comments xmlns:wpc="http://schemas.microsoft.com/office/word/2010/wordprocessingCanvas" xmlns:cx="http://schemas.microsoft.com/office/drawing/2014/chartex" xmlns:cx1="http://schemas.microsoft.com/office/drawing/2015/9/8/chartex" xmlns:cx2="http://schemas.microsoft.com/office/drawing/2015/10/21/chartex" xmlns:cx3="http://schemas.microsoft.com/office/drawing/2016/5/9/chartex" xmlns:cx4="http://schemas.microsoft.com/office/drawing/2016/5/10/chartex" xmlns:cx5="http://schemas.microsoft.com/office/drawing/2016/5/11/chartex" xmlns:cx6="http://schemas.microsoft.com/office/drawing/2016/5/12/chartex" xmlns:cx7="http://schemas.microsoft.com/office/drawing/2016/5/13/chartex" xmlns:cx8="http://schemas.microsoft.com/office/drawing/2016/5/14/chartex" xmlns:mc="http://schemas.openxmlformats.org/markup-compatibility/2006" xmlns:aink="http://schemas.microsoft.com/office/drawing/2016/ink" xmlns:am3d="http://schemas.microsoft.com/office/drawing/2017/model3d" xmlns:o="urn:schemas-microsoft-com:office:office" xmlns:r="http://schemas.openxmlformats.org/officeDocument/2006/relationships" xmlns:m="http://schemas.openxmlformats.org/officeDocument/2006/math" xmlns:v="urn:schemas-microsoft-com:vml" xmlns:wp14="http://schemas.microsoft.com/office/word/2010/wordprocessingDrawing" xmlns:wp="http://schemas.openxmlformats.org/drawingml/2006/wordprocessingDrawing" xmlns:w10="urn:schemas-microsoft-com:office:word" xmlns:w="http://schemas.openxmlformats.org/wordprocessingml/2006/main" xmlns:w14="http://schemas.microsoft.com/office/word/2010/wordml" xmlns:w15="http://schemas.microsoft.com/office/word/2012/wordml" xmlns:w16cex="http://schemas.microsoft.com/office/word/2018/wordml/cex" xmlns:w16cid="http://schemas.microsoft.com/office/word/2016/wordml/cid" xmlns:w16="http://schemas.microsoft.com/office/word/2018/wordml" xmlns:w16se="http://schemas.microsoft.com/office/word/2015/wordml/symex" xmlns:wpg="http://schemas.microsoft.com/office/word/2010/wordprocessingGroup" xmlns:wpi="http://schemas.microsoft.com/office/word/2010/wordprocessingInk" xmlns:wne="http://schemas.microsoft.com/office/word/2006/wordml" xmlns:wps="http://schemas.microsoft.com/office/word/2010/wordprocessingShape" mc:Ignorable="w14 w15 w16se w16cid w16 w16cex wp14">
+  <w:comment w:id="7" w:author="FABRICIO GALENDE MARQUES DE CARVALHO" w:date="2020-12-12T00:34:00Z" w:initials="FGMDC">
+    <w:p>
+      <w:pPr>
+        <w:pStyle w:val="Textodecomentrio"/>
+      </w:pPr>
+      <w:r>
+        <w:rPr>
+          <w:rStyle w:val="Refdecomentrio"/>
+        </w:rPr>
+        <w:annotationRef/>
+      </w:r>
+      <w:r>
+        <w:t>Creio que nem todas essas categorias de testes podem ser executadas no sistema. Aparentemente apenas testes funcionais e de navegação simples. Reveja e deixe somente o que é aplicável.</w:t>
+      </w:r>
+    </w:p>
+  </w:comment>
+  <w:comment w:id="9" w:author="FABRICIO GALENDE MARQUES DE CARVALHO" w:date="2020-12-12T00:38:00Z" w:initials="FGMDC">
+    <w:p>
+      <w:pPr>
+        <w:pStyle w:val="Textodecomentrio"/>
+      </w:pPr>
+      <w:r>
+        <w:rPr>
+          <w:rStyle w:val="Refdecomentrio"/>
+        </w:rPr>
+        <w:annotationRef/>
+      </w:r>
+      <w:r>
+        <w:t>Descrever em poucas palavras para que e onde a tecnologia foi utilizada.</w:t>
+      </w:r>
+    </w:p>
+  </w:comment>
+  <w:comment w:id="14" w:author="FABRICIO GALENDE MARQUES DE CARVALHO" w:date="2020-12-12T00:39:00Z" w:initials="FGMDC">
+    <w:p>
+      <w:pPr>
+        <w:pStyle w:val="Textodecomentrio"/>
+      </w:pPr>
+      <w:r>
+        <w:rPr>
+          <w:rStyle w:val="Refdecomentrio"/>
+        </w:rPr>
+        <w:annotationRef/>
+      </w:r>
+      <w:r>
+        <w:t xml:space="preserve">Apesar de saber que não será alterado na implementação do sistema recomendo mudar o nome do elemento no seu documento -  “Teste” . Tipicamente tem-se: </w:t>
+      </w:r>
+      <w:proofErr w:type="spellStart"/>
+      <w:r>
+        <w:t>Suite</w:t>
+      </w:r>
+      <w:proofErr w:type="spellEnd"/>
+      <w:r>
+        <w:t xml:space="preserve"> de teste (conjunto de casos de teste – </w:t>
+      </w:r>
+      <w:proofErr w:type="spellStart"/>
+      <w:r>
+        <w:t>test</w:t>
+      </w:r>
+      <w:proofErr w:type="spellEnd"/>
+      <w:r>
+        <w:t xml:space="preserve"> </w:t>
+      </w:r>
+      <w:proofErr w:type="spellStart"/>
+      <w:r>
+        <w:t>suit</w:t>
+      </w:r>
+      <w:proofErr w:type="spellEnd"/>
+      <w:r>
+        <w:t xml:space="preserve">), Casos de Teste, Dados de Teste, Eventos, etc..  </w:t>
+      </w:r>
+      <w:proofErr w:type="spellStart"/>
+      <w:r>
+        <w:t>Nâo</w:t>
+      </w:r>
+      <w:proofErr w:type="spellEnd"/>
+      <w:r>
+        <w:t xml:space="preserve"> está clara a utilização da entidade teste (me parece que um dos dois não deveria existir ou está com o termo errado. Rever ou explicar melhor)</w:t>
+      </w:r>
+    </w:p>
+  </w:comment>
+  <w:comment w:id="16" w:author="FABRICIO GALENDE MARQUES DE CARVALHO" w:date="2020-12-12T00:43:00Z" w:initials="FGMDC">
+    <w:p>
+      <w:pPr>
+        <w:pStyle w:val="Textodecomentrio"/>
+      </w:pPr>
+      <w:r>
+        <w:rPr>
+          <w:rStyle w:val="Refdecomentrio"/>
+        </w:rPr>
+        <w:annotationRef/>
+      </w:r>
+      <w:r>
+        <w:t xml:space="preserve">Há ferramentas aqui que não foram listadas nas tecnologias utilizadas. Alterar lá e constar, por exemplo, o Visual Studio </w:t>
+      </w:r>
+      <w:proofErr w:type="spellStart"/>
+      <w:r>
+        <w:t>Code</w:t>
+      </w:r>
+      <w:proofErr w:type="spellEnd"/>
+      <w:r>
+        <w:t>. Além de manter a coerência no seu trabalho ajuda a alguém que estiver lendo a buscar as tecnologias compatíveis e adequadas, segundo seu trabalho.</w:t>
+      </w:r>
+    </w:p>
+  </w:comment>
+  <w:comment w:id="18" w:author="FABRICIO GALENDE MARQUES DE CARVALHO" w:date="2020-12-12T00:45:00Z" w:initials="FGMDC">
+    <w:p>
+      <w:pPr>
+        <w:pStyle w:val="Textodecomentrio"/>
+      </w:pPr>
+      <w:r>
+        <w:rPr>
+          <w:rStyle w:val="Refdecomentrio"/>
+        </w:rPr>
+        <w:annotationRef/>
+      </w:r>
+      <w:r>
+        <w:t xml:space="preserve">Constar o </w:t>
+      </w:r>
+      <w:proofErr w:type="spellStart"/>
+      <w:r>
+        <w:t>Primeng</w:t>
+      </w:r>
+      <w:proofErr w:type="spellEnd"/>
+      <w:r>
+        <w:t xml:space="preserve"> na lista de tecnologias utilizadas. “Venda bem o seu trabalho”.</w:t>
+      </w:r>
+    </w:p>
+  </w:comment>
+  <w:comment w:id="20" w:author="FABRICIO GALENDE MARQUES DE CARVALHO" w:date="2020-12-12T00:47:00Z" w:initials="FGMDC">
+    <w:p>
+      <w:pPr>
+        <w:pStyle w:val="Textodecomentrio"/>
+        <w:ind w:firstLine="0"/>
+      </w:pPr>
+      <w:r>
+        <w:rPr>
+          <w:rStyle w:val="Refdecomentrio"/>
+        </w:rPr>
+        <w:annotationRef/>
+      </w:r>
+      <w:r>
+        <w:t xml:space="preserve">Explicar qual a importância do timeout e por que o valor 20. Mais importante do que descrever o código é dizer os porquês desses elementos e de onde </w:t>
+      </w:r>
+      <w:r>
+        <w:t>vem os “números mágicos”.</w:t>
+      </w:r>
+    </w:p>
+  </w:comment>
+</w:comments>
+</file>
+
+<file path=word/commentsExtended.xml><?xml version="1.0" encoding="utf-8"?>
+<w15:commentsEx xmlns:wpc="http://schemas.microsoft.com/office/word/2010/wordprocessingCanvas" xmlns:cx="http://schemas.microsoft.com/office/drawing/2014/chartex" xmlns:cx1="http://schemas.microsoft.com/office/drawing/2015/9/8/chartex" xmlns:cx2="http://schemas.microsoft.com/office/drawing/2015/10/21/chartex" xmlns:cx3="http://schemas.microsoft.com/office/drawing/2016/5/9/chartex" xmlns:cx4="http://schemas.microsoft.com/office/drawing/2016/5/10/chartex" xmlns:cx5="http://schemas.microsoft.com/office/drawing/2016/5/11/chartex" xmlns:cx6="http://schemas.microsoft.com/office/drawing/2016/5/12/chartex" xmlns:cx7="http://schemas.microsoft.com/office/drawing/2016/5/13/chartex" xmlns:cx8="http://schemas.microsoft.com/office/drawing/2016/5/14/chartex" xmlns:mc="http://schemas.openxmlformats.org/markup-compatibility/2006" xmlns:aink="http://schemas.microsoft.com/office/drawing/2016/ink" xmlns:am3d="http://schemas.microsoft.com/office/drawing/2017/model3d" xmlns:o="urn:schemas-microsoft-com:office:office" xmlns:r="http://schemas.openxmlformats.org/officeDocument/2006/relationships" xmlns:m="http://schemas.openxmlformats.org/officeDocument/2006/math" xmlns:v="urn:schemas-microsoft-com:vml" xmlns:wp14="http://schemas.microsoft.com/office/word/2010/wordprocessingDrawing" xmlns:wp="http://schemas.openxmlformats.org/drawingml/2006/wordprocessingDrawing" xmlns:w10="urn:schemas-microsoft-com:office:word" xmlns:w="http://schemas.openxmlformats.org/wordprocessingml/2006/main" xmlns:w14="http://schemas.microsoft.com/office/word/2010/wordml" xmlns:w15="http://schemas.microsoft.com/office/word/2012/wordml" xmlns:w16cex="http://schemas.microsoft.com/office/word/2018/wordml/cex" xmlns:w16cid="http://schemas.microsoft.com/office/word/2016/wordml/cid" xmlns:w16="http://schemas.microsoft.com/office/word/2018/wordml" xmlns:w16se="http://schemas.microsoft.com/office/word/2015/wordml/symex" xmlns:wpg="http://schemas.microsoft.com/office/word/2010/wordprocessingGroup" xmlns:wpi="http://schemas.microsoft.com/office/word/2010/wordprocessingInk" xmlns:wne="http://schemas.microsoft.com/office/word/2006/wordml" xmlns:wps="http://schemas.microsoft.com/office/word/2010/wordprocessingShape" mc:Ignorable="w14 w15 w16se w16cid w16 w16cex wp14">
+  <w15:commentEx w15:paraId="6E87551B" w15:done="0"/>
+  <w15:commentEx w15:paraId="530B17FD" w15:done="0"/>
+  <w15:commentEx w15:paraId="4338587C" w15:done="0"/>
+  <w15:commentEx w15:paraId="09817C3B" w15:done="0"/>
+  <w15:commentEx w15:paraId="69655774" w15:done="0"/>
+  <w15:commentEx w15:paraId="0EFCE52E" w15:done="0"/>
+</w15:commentsEx>
+</file>
+
+<file path=word/commentsExtensible.xml><?xml version="1.0" encoding="utf-8"?>
+<w16cex:commentsExtensible xmlns:wpc="http://schemas.microsoft.com/office/word/2010/wordprocessingCanvas" xmlns:cx="http://schemas.microsoft.com/office/drawing/2014/chartex" xmlns:cx1="http://schemas.microsoft.com/office/drawing/2015/9/8/chartex" xmlns:cx2="http://schemas.microsoft.com/office/drawing/2015/10/21/chartex" xmlns:cx3="http://schemas.microsoft.com/office/drawing/2016/5/9/chartex" xmlns:cx4="http://schemas.microsoft.com/office/drawing/2016/5/10/chartex" xmlns:cx5="http://schemas.microsoft.com/office/drawing/2016/5/11/chartex" xmlns:cx6="http://schemas.microsoft.com/office/drawing/2016/5/12/chartex" xmlns:cx7="http://schemas.microsoft.com/office/drawing/2016/5/13/chartex" xmlns:cx8="http://schemas.microsoft.com/office/drawing/2016/5/14/chartex" xmlns:mc="http://schemas.openxmlformats.org/markup-compatibility/2006" xmlns:aink="http://schemas.microsoft.com/office/drawing/2016/ink" xmlns:am3d="http://schemas.microsoft.com/office/drawing/2017/model3d" xmlns:o="urn:schemas-microsoft-com:office:office" xmlns:r="http://schemas.openxmlformats.org/officeDocument/2006/relationships" xmlns:m="http://schemas.openxmlformats.org/officeDocument/2006/math" xmlns:v="urn:schemas-microsoft-com:vml" xmlns:wp14="http://schemas.microsoft.com/office/word/2010/wordprocessingDrawing" xmlns:wp="http://schemas.openxmlformats.org/drawingml/2006/wordprocessingDrawing" xmlns:w10="urn:schemas-microsoft-com:office:word" xmlns:w="http://schemas.openxmlformats.org/wordprocessingml/2006/main" xmlns:w14="http://schemas.microsoft.com/office/word/2010/wordml" xmlns:w15="http://schemas.microsoft.com/office/word/2012/wordml" xmlns:w16cex="http://schemas.microsoft.com/office/word/2018/wordml/cex" xmlns:w16cid="http://schemas.microsoft.com/office/word/2016/wordml/cid" xmlns:w16="http://schemas.microsoft.com/office/word/2018/wordml" xmlns:w16se="http://schemas.microsoft.com/office/word/2015/wordml/symex" xmlns:wpg="http://schemas.microsoft.com/office/word/2010/wordprocessingGroup" xmlns:wpi="http://schemas.microsoft.com/office/word/2010/wordprocessingInk" xmlns:wne="http://schemas.microsoft.com/office/word/2006/wordml" xmlns:wps="http://schemas.microsoft.com/office/word/2010/wordprocessingShape" mc:Ignorable="w14 w15 w16se w16cid w16 w16cex wp14">
+  <w16cex:commentExtensible w16cex:durableId="237E8E9C" w16cex:dateUtc="2020-12-12T03:34:00Z"/>
+  <w16cex:commentExtensible w16cex:durableId="237E8F68" w16cex:dateUtc="2020-12-12T03:38:00Z"/>
+  <w16cex:commentExtensible w16cex:durableId="237E8FDE" w16cex:dateUtc="2020-12-12T03:39:00Z"/>
+  <w16cex:commentExtensible w16cex:durableId="237E90AB" w16cex:dateUtc="2020-12-12T03:43:00Z"/>
+  <w16cex:commentExtensible w16cex:durableId="237E911B" w16cex:dateUtc="2020-12-12T03:45:00Z"/>
+  <w16cex:commentExtensible w16cex:durableId="237E91AE" w16cex:dateUtc="2020-12-12T03:47:00Z"/>
+</w16cex:commentsExtensible>
+</file>
+
+<file path=word/commentsIds.xml><?xml version="1.0" encoding="utf-8"?>
+<w16cid:commentsIds xmlns:wpc="http://schemas.microsoft.com/office/word/2010/wordprocessingCanvas" xmlns:cx="http://schemas.microsoft.com/office/drawing/2014/chartex" xmlns:cx1="http://schemas.microsoft.com/office/drawing/2015/9/8/chartex" xmlns:cx2="http://schemas.microsoft.com/office/drawing/2015/10/21/chartex" xmlns:cx3="http://schemas.microsoft.com/office/drawing/2016/5/9/chartex" xmlns:cx4="http://schemas.microsoft.com/office/drawing/2016/5/10/chartex" xmlns:cx5="http://schemas.microsoft.com/office/drawing/2016/5/11/chartex" xmlns:cx6="http://schemas.microsoft.com/office/drawing/2016/5/12/chartex" xmlns:cx7="http://schemas.microsoft.com/office/drawing/2016/5/13/chartex" xmlns:cx8="http://schemas.microsoft.com/office/drawing/2016/5/14/chartex" xmlns:mc="http://schemas.openxmlformats.org/markup-compatibility/2006" xmlns:aink="http://schemas.microsoft.com/office/drawing/2016/ink" xmlns:am3d="http://schemas.microsoft.com/office/drawing/2017/model3d" xmlns:o="urn:schemas-microsoft-com:office:office" xmlns:r="http://schemas.openxmlformats.org/officeDocument/2006/relationships" xmlns:m="http://schemas.openxmlformats.org/officeDocument/2006/math" xmlns:v="urn:schemas-microsoft-com:vml" xmlns:wp14="http://schemas.microsoft.com/office/word/2010/wordprocessingDrawing" xmlns:wp="http://schemas.openxmlformats.org/drawingml/2006/wordprocessingDrawing" xmlns:w10="urn:schemas-microsoft-com:office:word" xmlns:w="http://schemas.openxmlformats.org/wordprocessingml/2006/main" xmlns:w14="http://schemas.microsoft.com/office/word/2010/wordml" xmlns:w15="http://schemas.microsoft.com/office/word/2012/wordml" xmlns:w16cex="http://schemas.microsoft.com/office/word/2018/wordml/cex" xmlns:w16cid="http://schemas.microsoft.com/office/word/2016/wordml/cid" xmlns:w16="http://schemas.microsoft.com/office/word/2018/wordml" xmlns:w16se="http://schemas.microsoft.com/office/word/2015/wordml/symex" xmlns:wpg="http://schemas.microsoft.com/office/word/2010/wordprocessingGroup" xmlns:wpi="http://schemas.microsoft.com/office/word/2010/wordprocessingInk" xmlns:wne="http://schemas.microsoft.com/office/word/2006/wordml" xmlns:wps="http://schemas.microsoft.com/office/word/2010/wordprocessingShape" mc:Ignorable="w14 w15 w16se w16cid w16 w16cex wp14">
+  <w16cid:commentId w16cid:paraId="6E87551B" w16cid:durableId="237E8E9C"/>
+  <w16cid:commentId w16cid:paraId="530B17FD" w16cid:durableId="237E8F68"/>
+  <w16cid:commentId w16cid:paraId="4338587C" w16cid:durableId="237E8FDE"/>
+  <w16cid:commentId w16cid:paraId="09817C3B" w16cid:durableId="237E90AB"/>
+  <w16cid:commentId w16cid:paraId="69655774" w16cid:durableId="237E911B"/>
+  <w16cid:commentId w16cid:paraId="0EFCE52E" w16cid:durableId="237E91AE"/>
+</w16cid:commentsIds>
 </file>
 
 <file path=word/endnotes.xml><?xml version="1.0" encoding="utf-8"?>
@@ -7498,17 +8646,17 @@
         <v:path o:extrusionok="f" gradientshapeok="t" o:connecttype="rect"/>
         <o:lock v:ext="edit" aspectratio="t"/>
       </v:shapetype>
-      <v:shape id="_x0000_i1125" type="#_x0000_t75" style="width:3in;height:3in" o:bullet="t"/>
+      <v:shape id="_x0000_i1278" type="#_x0000_t75" style="width:3in;height:3in" o:bullet="t"/>
     </w:pict>
   </w:numPicBullet>
   <w:numPicBullet w:numPicBulletId="1">
     <w:pict>
-      <v:shape id="_x0000_i1126" type="#_x0000_t75" style="width:3in;height:3in" o:bullet="t"/>
+      <v:shape id="_x0000_i1279" type="#_x0000_t75" style="width:3in;height:3in" o:bullet="t"/>
     </w:pict>
   </w:numPicBullet>
   <w:numPicBullet w:numPicBulletId="2">
     <w:pict>
-      <v:shape id="_x0000_i1127" type="#_x0000_t75" style="width:3in;height:3in" o:bullet="t"/>
+      <v:shape id="_x0000_i1280" type="#_x0000_t75" style="width:3in;height:3in" o:bullet="t"/>
     </w:pict>
   </w:numPicBullet>
   <w:abstractNum w:abstractNumId="0" w15:restartNumberingAfterBreak="0">
@@ -10269,6 +11417,14 @@
   </w:num>
   <w:numIdMacAtCleanup w:val="7"/>
 </w:numbering>
+</file>
+
+<file path=word/people.xml><?xml version="1.0" encoding="utf-8"?>
+<w15:people xmlns:wpc="http://schemas.microsoft.com/office/word/2010/wordprocessingCanvas" xmlns:cx="http://schemas.microsoft.com/office/drawing/2014/chartex" xmlns:cx1="http://schemas.microsoft.com/office/drawing/2015/9/8/chartex" xmlns:cx2="http://schemas.microsoft.com/office/drawing/2015/10/21/chartex" xmlns:cx3="http://schemas.microsoft.com/office/drawing/2016/5/9/chartex" xmlns:cx4="http://schemas.microsoft.com/office/drawing/2016/5/10/chartex" xmlns:cx5="http://schemas.microsoft.com/office/drawing/2016/5/11/chartex" xmlns:cx6="http://schemas.microsoft.com/office/drawing/2016/5/12/chartex" xmlns:cx7="http://schemas.microsoft.com/office/drawing/2016/5/13/chartex" xmlns:cx8="http://schemas.microsoft.com/office/drawing/2016/5/14/chartex" xmlns:mc="http://schemas.openxmlformats.org/markup-compatibility/2006" xmlns:aink="http://schemas.microsoft.com/office/drawing/2016/ink" xmlns:am3d="http://schemas.microsoft.com/office/drawing/2017/model3d" xmlns:o="urn:schemas-microsoft-com:office:office" xmlns:r="http://schemas.openxmlformats.org/officeDocument/2006/relationships" xmlns:m="http://schemas.openxmlformats.org/officeDocument/2006/math" xmlns:v="urn:schemas-microsoft-com:vml" xmlns:wp14="http://schemas.microsoft.com/office/word/2010/wordprocessingDrawing" xmlns:wp="http://schemas.openxmlformats.org/drawingml/2006/wordprocessingDrawing" xmlns:w10="urn:schemas-microsoft-com:office:word" xmlns:w="http://schemas.openxmlformats.org/wordprocessingml/2006/main" xmlns:w14="http://schemas.microsoft.com/office/word/2010/wordml" xmlns:w15="http://schemas.microsoft.com/office/word/2012/wordml" xmlns:w16cex="http://schemas.microsoft.com/office/word/2018/wordml/cex" xmlns:w16cid="http://schemas.microsoft.com/office/word/2016/wordml/cid" xmlns:w16="http://schemas.microsoft.com/office/word/2018/wordml" xmlns:w16se="http://schemas.microsoft.com/office/word/2015/wordml/symex" xmlns:wpg="http://schemas.microsoft.com/office/word/2010/wordprocessingGroup" xmlns:wpi="http://schemas.microsoft.com/office/word/2010/wordprocessingInk" xmlns:wne="http://schemas.microsoft.com/office/word/2006/wordml" xmlns:wps="http://schemas.microsoft.com/office/word/2010/wordprocessingShape" mc:Ignorable="w14 w15 w16se w16cid w16 w16cex wp14">
+  <w15:person w15:author="FABRICIO GALENDE MARQUES DE CARVALHO">
+    <w15:presenceInfo w15:providerId="None" w15:userId="FABRICIO GALENDE MARQUES DE CARVALHO"/>
+  </w15:person>
+</w15:people>
 </file>
 
 <file path=word/styles.xml><?xml version="1.0" encoding="utf-8"?>
@@ -11045,6 +12201,7 @@
   <w:style w:type="paragraph" w:styleId="Textodecomentrio">
     <w:name w:val="annotation text"/>
     <w:basedOn w:val="Normal"/>
+    <w:link w:val="TextodecomentrioChar"/>
     <w:semiHidden/>
     <w:rsid w:val="00803056"/>
     <w:rPr>
@@ -11925,6 +13082,42 @@
     <w:basedOn w:val="Fontepargpadro"/>
     <w:rsid w:val="00604029"/>
   </w:style>
+  <w:style w:type="paragraph" w:styleId="Assuntodocomentrio">
+    <w:name w:val="annotation subject"/>
+    <w:basedOn w:val="Textodecomentrio"/>
+    <w:next w:val="Textodecomentrio"/>
+    <w:link w:val="AssuntodocomentrioChar"/>
+    <w:uiPriority w:val="99"/>
+    <w:semiHidden/>
+    <w:unhideWhenUsed/>
+    <w:rsid w:val="00413E02"/>
+    <w:pPr>
+      <w:spacing w:line="240" w:lineRule="auto"/>
+    </w:pPr>
+    <w:rPr>
+      <w:b/>
+      <w:bCs/>
+    </w:rPr>
+  </w:style>
+  <w:style w:type="character" w:customStyle="1" w:styleId="TextodecomentrioChar">
+    <w:name w:val="Texto de comentário Char"/>
+    <w:basedOn w:val="Fontepargpadro"/>
+    <w:link w:val="Textodecomentrio"/>
+    <w:semiHidden/>
+    <w:rsid w:val="00413E02"/>
+  </w:style>
+  <w:style w:type="character" w:customStyle="1" w:styleId="AssuntodocomentrioChar">
+    <w:name w:val="Assunto do comentário Char"/>
+    <w:basedOn w:val="TextodecomentrioChar"/>
+    <w:link w:val="Assuntodocomentrio"/>
+    <w:uiPriority w:val="99"/>
+    <w:semiHidden/>
+    <w:rsid w:val="00413E02"/>
+    <w:rPr>
+      <w:b/>
+      <w:bCs/>
+    </w:rPr>
+  </w:style>
 </w:styles>
 </file>
 

</xml_diff>